<commit_message>
docs(pruebas): cada prueba dice qué tablas toca
Para poder comprobar en la base lo que hizo cada paso: la línea «Tablas» nombra la base
(Central o Caja) y sus tablas, marcando con «(lee)» las que solo se consultan. Las 87 líneas
se verificaron contra los scripts de estructura, así que no hay tablas inventadas.

Co-Authored-By: Claude Opus 5 (1M context) <noreply@anthropic.com>
</commit_message>
<xml_diff>
--- a/scripts/manual/Guia de pruebas CG-POS.docx
+++ b/scripts/manual/Guia de pruebas CG-POS.docx
@@ -59,6 +59,14 @@
       </w:pPr>
       <w:r>
         <w:t>«Debe pasar» es el resultado correcto. Si en pantalla ve otra cosa, la prueba falló aunque no salga ningún error.</w:t>
+      </w:r>
+    </w:p>
+    <w:p>
+      <w:pPr>
+        <w:pStyle w:val="ListBullet"/>
+      </w:pPr>
+      <w:r>
+        <w:t>«Tablas» dice qué se guarda y dónde, para que pueda comprobarlo en la base si algo no cuadra. Las que llevan «(lee)» solo se consultan: esa prueba no las cambia. Antes del nombre va la base: Central o Caja.</w:t>
       </w:r>
     </w:p>
     <w:p>
@@ -330,9 +338,26 @@
     <w:p>
       <w:r>
         <w:rPr>
+          <w:b/>
+          <w:color w:val="2E7D32"/>
+          <w:sz w:val="19"/>
+        </w:rPr>
+        <w:t xml:space="preserve">Tablas: </w:t>
+      </w:r>
+      <w:r>
+        <w:rPr>
           <w:color w:val="555555"/>
           <w:sz w:val="19"/>
         </w:rPr>
+        <w:t>Central: UsuariosCentral · SesionesCentral · Auditoria</w:t>
+      </w:r>
+    </w:p>
+    <w:p>
+      <w:r>
+        <w:rPr>
+          <w:color w:val="555555"/>
+          <w:sz w:val="19"/>
+        </w:rPr>
         <w:t>☐ Pasó          ☐ Falló          Observación: ______________________________________________</w:t>
       </w:r>
     </w:p>
@@ -370,9 +395,26 @@
     <w:p>
       <w:r>
         <w:rPr>
+          <w:b/>
+          <w:color w:val="2E7D32"/>
+          <w:sz w:val="19"/>
+        </w:rPr>
+        <w:t xml:space="preserve">Tablas: </w:t>
+      </w:r>
+      <w:r>
+        <w:rPr>
           <w:color w:val="555555"/>
           <w:sz w:val="19"/>
         </w:rPr>
+        <w:t>Central: Empresas</w:t>
+      </w:r>
+    </w:p>
+    <w:p>
+      <w:r>
+        <w:rPr>
+          <w:color w:val="555555"/>
+          <w:sz w:val="19"/>
+        </w:rPr>
         <w:t>☐ Pasó          ☐ Falló          Observación: ______________________________________________</w:t>
       </w:r>
     </w:p>
@@ -426,9 +468,26 @@
     <w:p>
       <w:r>
         <w:rPr>
+          <w:b/>
+          <w:color w:val="2E7D32"/>
+          <w:sz w:val="19"/>
+        </w:rPr>
+        <w:t xml:space="preserve">Tablas: </w:t>
+      </w:r>
+      <w:r>
+        <w:rPr>
           <w:color w:val="555555"/>
           <w:sz w:val="19"/>
         </w:rPr>
+        <w:t>Central: Sucursales · Cajas · CredencialesDispositivo</w:t>
+      </w:r>
+    </w:p>
+    <w:p>
+      <w:r>
+        <w:rPr>
+          <w:color w:val="555555"/>
+          <w:sz w:val="19"/>
+        </w:rPr>
         <w:t>☐ Pasó          ☐ Falló          Observación: ______________________________________________</w:t>
       </w:r>
     </w:p>
@@ -466,9 +525,26 @@
     <w:p>
       <w:r>
         <w:rPr>
+          <w:b/>
+          <w:color w:val="2E7D32"/>
+          <w:sz w:val="19"/>
+        </w:rPr>
+        <w:t xml:space="preserve">Tablas: </w:t>
+      </w:r>
+      <w:r>
+        <w:rPr>
           <w:color w:val="555555"/>
           <w:sz w:val="19"/>
         </w:rPr>
+        <w:t>Central: SecuenciasCentral</w:t>
+      </w:r>
+    </w:p>
+    <w:p>
+      <w:r>
+        <w:rPr>
+          <w:color w:val="555555"/>
+          <w:sz w:val="19"/>
+        </w:rPr>
         <w:t>☐ Pasó          ☐ Falló          Observación: ______________________________________________</w:t>
       </w:r>
     </w:p>
@@ -501,6 +577,23 @@
           <w:color w:val="555555"/>
         </w:rPr>
         <w:t>Todo aparece listado y activo. Las denominaciones son las que después usará el supervisor para contar el efectivo.</w:t>
+      </w:r>
+    </w:p>
+    <w:p>
+      <w:r>
+        <w:rPr>
+          <w:b/>
+          <w:color w:val="2E7D32"/>
+          <w:sz w:val="19"/>
+        </w:rPr>
+        <w:t xml:space="preserve">Tablas: </w:t>
+      </w:r>
+      <w:r>
+        <w:rPr>
+          <w:color w:val="555555"/>
+          <w:sz w:val="19"/>
+        </w:rPr>
+        <w:t>Central: Monedas · Impuestos · UnidadesMedida · Departamentos · Categorias · Marcas · FormasPago · Bancos · TiposTarjeta · Denominaciones · MotivosDescuento · MotivosDevolucion</w:t>
       </w:r>
     </w:p>
     <w:p>
@@ -709,9 +802,26 @@
     <w:p>
       <w:r>
         <w:rPr>
+          <w:b/>
+          <w:color w:val="2E7D32"/>
+          <w:sz w:val="19"/>
+        </w:rPr>
+        <w:t xml:space="preserve">Tablas: </w:t>
+      </w:r>
+      <w:r>
+        <w:rPr>
           <w:color w:val="555555"/>
           <w:sz w:val="19"/>
         </w:rPr>
+        <w:t>Central: Articulos · CodigosArticulo</w:t>
+      </w:r>
+    </w:p>
+    <w:p>
+      <w:r>
+        <w:rPr>
+          <w:color w:val="555555"/>
+          <w:sz w:val="19"/>
+        </w:rPr>
         <w:t>☐ Pasó          ☐ Falló          Observación: ______________________________________________</w:t>
       </w:r>
     </w:p>
@@ -749,9 +859,26 @@
     <w:p>
       <w:r>
         <w:rPr>
+          <w:b/>
+          <w:color w:val="2E7D32"/>
+          <w:sz w:val="19"/>
+        </w:rPr>
+        <w:t xml:space="preserve">Tablas: </w:t>
+      </w:r>
+      <w:r>
+        <w:rPr>
           <w:color w:val="555555"/>
           <w:sz w:val="19"/>
         </w:rPr>
+        <w:t>Central: Articulos (el precio vive en el artículo) · Auditoria</w:t>
+      </w:r>
+    </w:p>
+    <w:p>
+      <w:r>
+        <w:rPr>
+          <w:color w:val="555555"/>
+          <w:sz w:val="19"/>
+        </w:rPr>
         <w:t>☐ Pasó          ☐ Falló          Observación: ______________________________________________</w:t>
       </w:r>
     </w:p>
@@ -797,9 +924,26 @@
     <w:p>
       <w:r>
         <w:rPr>
+          <w:b/>
+          <w:color w:val="2E7D32"/>
+          <w:sz w:val="19"/>
+        </w:rPr>
+        <w:t xml:space="preserve">Tablas: </w:t>
+      </w:r>
+      <w:r>
+        <w:rPr>
           <w:color w:val="555555"/>
           <w:sz w:val="19"/>
         </w:rPr>
+        <w:t>Central: RolesCaja · RolesCajaPermisos · UsuariosCaja · UsuariosCajaCajas</w:t>
+      </w:r>
+    </w:p>
+    <w:p>
+      <w:r>
+        <w:rPr>
+          <w:color w:val="555555"/>
+          <w:sz w:val="19"/>
+        </w:rPr>
         <w:t>☐ Pasó          ☐ Falló          Observación: ______________________________________________</w:t>
       </w:r>
     </w:p>
@@ -837,9 +981,26 @@
     <w:p>
       <w:r>
         <w:rPr>
+          <w:b/>
+          <w:color w:val="2E7D32"/>
+          <w:sz w:val="19"/>
+        </w:rPr>
+        <w:t xml:space="preserve">Tablas: </w:t>
+      </w:r>
+      <w:r>
+        <w:rPr>
           <w:color w:val="555555"/>
           <w:sz w:val="19"/>
         </w:rPr>
+        <w:t>Central: Parametros</w:t>
+      </w:r>
+    </w:p>
+    <w:p>
+      <w:r>
+        <w:rPr>
+          <w:color w:val="555555"/>
+          <w:sz w:val="19"/>
+        </w:rPr>
         <w:t>☐ Pasó          ☐ Falló          Observación: ______________________________________________</w:t>
       </w:r>
     </w:p>
@@ -877,9 +1038,26 @@
     <w:p>
       <w:r>
         <w:rPr>
+          <w:b/>
+          <w:color w:val="2E7D32"/>
+          <w:sz w:val="19"/>
+        </w:rPr>
+        <w:t xml:space="preserve">Tablas: </w:t>
+      </w:r>
+      <w:r>
+        <w:rPr>
           <w:color w:val="555555"/>
           <w:sz w:val="19"/>
         </w:rPr>
+        <w:t>Central: SecuenciasEcf</w:t>
+      </w:r>
+    </w:p>
+    <w:p>
+      <w:r>
+        <w:rPr>
+          <w:color w:val="555555"/>
+          <w:sz w:val="19"/>
+        </w:rPr>
         <w:t>☐ Pasó          ☐ Falló          Observación: ______________________________________________</w:t>
       </w:r>
     </w:p>
@@ -930,9 +1108,26 @@
     <w:p>
       <w:r>
         <w:rPr>
+          <w:b/>
+          <w:color w:val="2E7D32"/>
+          <w:sz w:val="19"/>
+        </w:rPr>
+        <w:t xml:space="preserve">Tablas: </w:t>
+      </w:r>
+      <w:r>
+        <w:rPr>
           <w:color w:val="555555"/>
           <w:sz w:val="19"/>
         </w:rPr>
+        <w:t>Caja: ConfiguracionCaja · Central: CredencialesDispositivo · EstadosSincronizacionCaja</w:t>
+      </w:r>
+    </w:p>
+    <w:p>
+      <w:r>
+        <w:rPr>
+          <w:color w:val="555555"/>
+          <w:sz w:val="19"/>
+        </w:rPr>
         <w:t>☐ Pasó          ☐ Falló          Observación: ______________________________________________</w:t>
       </w:r>
     </w:p>
@@ -970,9 +1165,26 @@
     <w:p>
       <w:r>
         <w:rPr>
+          <w:b/>
+          <w:color w:val="2E7D32"/>
+          <w:sz w:val="19"/>
+        </w:rPr>
+        <w:t xml:space="preserve">Tablas: </w:t>
+      </w:r>
+      <w:r>
+        <w:rPr>
           <w:color w:val="555555"/>
           <w:sz w:val="19"/>
         </w:rPr>
+        <w:t>Caja: Articulos · CodigosArticulo · FormasPago · Impuestos · Denominaciones · Parametros · Usuarios · Roles · MarcasSincronizacion (y los demás maestros)</w:t>
+      </w:r>
+    </w:p>
+    <w:p>
+      <w:r>
+        <w:rPr>
+          <w:color w:val="555555"/>
+          <w:sz w:val="19"/>
+        </w:rPr>
         <w:t>☐ Pasó          ☐ Falló          Observación: ______________________________________________</w:t>
       </w:r>
     </w:p>
@@ -1018,9 +1230,26 @@
     <w:p>
       <w:r>
         <w:rPr>
+          <w:b/>
+          <w:color w:val="2E7D32"/>
+          <w:sz w:val="19"/>
+        </w:rPr>
+        <w:t xml:space="preserve">Tablas: </w:t>
+      </w:r>
+      <w:r>
+        <w:rPr>
           <w:color w:val="555555"/>
           <w:sz w:val="19"/>
         </w:rPr>
+        <w:t>Caja: Usuarios · Auditoria · BandejaSalida · Central: AccesosUsuarioCaja</w:t>
+      </w:r>
+    </w:p>
+    <w:p>
+      <w:r>
+        <w:rPr>
+          <w:color w:val="555555"/>
+          <w:sz w:val="19"/>
+        </w:rPr>
         <w:t>☐ Pasó          ☐ Falló          Observación: ______________________________________________</w:t>
       </w:r>
     </w:p>
@@ -1066,9 +1295,26 @@
     <w:p>
       <w:r>
         <w:rPr>
+          <w:b/>
+          <w:color w:val="2E7D32"/>
+          <w:sz w:val="19"/>
+        </w:rPr>
+        <w:t xml:space="preserve">Tablas: </w:t>
+      </w:r>
+      <w:r>
+        <w:rPr>
           <w:color w:val="555555"/>
           <w:sz w:val="19"/>
         </w:rPr>
+        <w:t>Caja: Turnos · BandejaSalida</w:t>
+      </w:r>
+    </w:p>
+    <w:p>
+      <w:r>
+        <w:rPr>
+          <w:color w:val="555555"/>
+          <w:sz w:val="19"/>
+        </w:rPr>
         <w:t>☐ Pasó          ☐ Falló          Observación: ______________________________________________</w:t>
       </w:r>
     </w:p>
@@ -1127,9 +1373,26 @@
     <w:p>
       <w:r>
         <w:rPr>
+          <w:b/>
+          <w:color w:val="2E7D32"/>
+          <w:sz w:val="19"/>
+        </w:rPr>
+        <w:t xml:space="preserve">Tablas: </w:t>
+      </w:r>
+      <w:r>
+        <w:rPr>
           <w:color w:val="555555"/>
           <w:sz w:val="19"/>
         </w:rPr>
+        <w:t>Caja: VentasEnProceso · LineasVentaEnProceso</w:t>
+      </w:r>
+    </w:p>
+    <w:p>
+      <w:r>
+        <w:rPr>
+          <w:color w:val="555555"/>
+          <w:sz w:val="19"/>
+        </w:rPr>
         <w:t>☐ Pasó          ☐ Falló          Observación: ______________________________________________</w:t>
       </w:r>
     </w:p>
@@ -1175,9 +1438,26 @@
     <w:p>
       <w:r>
         <w:rPr>
+          <w:b/>
+          <w:color w:val="2E7D32"/>
+          <w:sz w:val="19"/>
+        </w:rPr>
+        <w:t xml:space="preserve">Tablas: </w:t>
+      </w:r>
+      <w:r>
+        <w:rPr>
           <w:color w:val="555555"/>
           <w:sz w:val="19"/>
         </w:rPr>
+        <w:t>Caja: LineasVentaEnProceso</w:t>
+      </w:r>
+    </w:p>
+    <w:p>
+      <w:r>
+        <w:rPr>
+          <w:color w:val="555555"/>
+          <w:sz w:val="19"/>
+        </w:rPr>
         <w:t>☐ Pasó          ☐ Falló          Observación: ______________________________________________</w:t>
       </w:r>
     </w:p>
@@ -1223,9 +1503,26 @@
     <w:p>
       <w:r>
         <w:rPr>
+          <w:b/>
+          <w:color w:val="2E7D32"/>
+          <w:sz w:val="19"/>
+        </w:rPr>
+        <w:t xml:space="preserve">Tablas: </w:t>
+      </w:r>
+      <w:r>
+        <w:rPr>
           <w:color w:val="555555"/>
           <w:sz w:val="19"/>
         </w:rPr>
+        <w:t>Caja: LineasVentaEnProceso · AutorizacionesOtorgadas · Auditoria</w:t>
+      </w:r>
+    </w:p>
+    <w:p>
+      <w:r>
+        <w:rPr>
+          <w:color w:val="555555"/>
+          <w:sz w:val="19"/>
+        </w:rPr>
         <w:t>☐ Pasó          ☐ Falló          Observación: ______________________________________________</w:t>
       </w:r>
     </w:p>
@@ -1263,9 +1560,26 @@
     <w:p>
       <w:r>
         <w:rPr>
+          <w:b/>
+          <w:color w:val="2E7D32"/>
+          <w:sz w:val="19"/>
+        </w:rPr>
+        <w:t xml:space="preserve">Tablas: </w:t>
+      </w:r>
+      <w:r>
+        <w:rPr>
           <w:color w:val="555555"/>
           <w:sz w:val="19"/>
         </w:rPr>
+        <w:t>Caja: VentasEnProceso · LineasVentaEnProceso (las dos filas se borran) · Auditoria</w:t>
+      </w:r>
+    </w:p>
+    <w:p>
+      <w:r>
+        <w:rPr>
+          <w:color w:val="555555"/>
+          <w:sz w:val="19"/>
+        </w:rPr>
         <w:t>☐ Pasó          ☐ Falló          Observación: ______________________________________________</w:t>
       </w:r>
     </w:p>
@@ -1311,9 +1625,26 @@
     <w:p>
       <w:r>
         <w:rPr>
+          <w:b/>
+          <w:color w:val="2E7D32"/>
+          <w:sz w:val="19"/>
+        </w:rPr>
+        <w:t xml:space="preserve">Tablas: </w:t>
+      </w:r>
+      <w:r>
+        <w:rPr>
           <w:color w:val="555555"/>
           <w:sz w:val="19"/>
         </w:rPr>
+        <w:t>Caja: VentasEnProceso · LineasVentaEnProceso (lee: es la misma fila de antes del corte)</w:t>
+      </w:r>
+    </w:p>
+    <w:p>
+      <w:r>
+        <w:rPr>
+          <w:color w:val="555555"/>
+          <w:sz w:val="19"/>
+        </w:rPr>
         <w:t>☐ Pasó          ☐ Falló          Observación: ______________________________________________</w:t>
       </w:r>
     </w:p>
@@ -1364,9 +1695,26 @@
     <w:p>
       <w:r>
         <w:rPr>
+          <w:b/>
+          <w:color w:val="2E7D32"/>
+          <w:sz w:val="19"/>
+        </w:rPr>
+        <w:t xml:space="preserve">Tablas: </w:t>
+      </w:r>
+      <w:r>
+        <w:rPr>
           <w:color w:val="555555"/>
           <w:sz w:val="19"/>
         </w:rPr>
+        <w:t>Caja: VentasEnProceso</w:t>
+      </w:r>
+    </w:p>
+    <w:p>
+      <w:r>
+        <w:rPr>
+          <w:color w:val="555555"/>
+          <w:sz w:val="19"/>
+        </w:rPr>
         <w:t>☐ Pasó          ☐ Falló          Observación: ______________________________________________</w:t>
       </w:r>
     </w:p>
@@ -1404,9 +1752,26 @@
     <w:p>
       <w:r>
         <w:rPr>
+          <w:b/>
+          <w:color w:val="2E7D32"/>
+          <w:sz w:val="19"/>
+        </w:rPr>
+        <w:t xml:space="preserve">Tablas: </w:t>
+      </w:r>
+      <w:r>
+        <w:rPr>
           <w:color w:val="555555"/>
           <w:sz w:val="19"/>
         </w:rPr>
+        <w:t>Caja: VentasEnProceso · Clientes (lee)</w:t>
+      </w:r>
+    </w:p>
+    <w:p>
+      <w:r>
+        <w:rPr>
+          <w:color w:val="555555"/>
+          <w:sz w:val="19"/>
+        </w:rPr>
         <w:t>☐ Pasó          ☐ Falló          Observación: ______________________________________________</w:t>
       </w:r>
     </w:p>
@@ -1444,9 +1809,26 @@
     <w:p>
       <w:r>
         <w:rPr>
+          <w:b/>
+          <w:color w:val="2E7D32"/>
+          <w:sz w:val="19"/>
+        </w:rPr>
+        <w:t xml:space="preserve">Tablas: </w:t>
+      </w:r>
+      <w:r>
+        <w:rPr>
           <w:color w:val="555555"/>
           <w:sz w:val="19"/>
         </w:rPr>
+        <w:t>Caja: VentasEnProceso · Parametros (lee)</w:t>
+      </w:r>
+    </w:p>
+    <w:p>
+      <w:r>
+        <w:rPr>
+          <w:color w:val="555555"/>
+          <w:sz w:val="19"/>
+        </w:rPr>
         <w:t>☐ Pasó          ☐ Falló          Observación: ______________________________________________</w:t>
       </w:r>
     </w:p>
@@ -1497,9 +1879,26 @@
     <w:p>
       <w:r>
         <w:rPr>
+          <w:b/>
+          <w:color w:val="2E7D32"/>
+          <w:sz w:val="19"/>
+        </w:rPr>
+        <w:t xml:space="preserve">Tablas: </w:t>
+      </w:r>
+      <w:r>
+        <w:rPr>
           <w:color w:val="555555"/>
           <w:sz w:val="19"/>
         </w:rPr>
+        <w:t>Caja: LineasVentaEnProceso · Articulos (lee: peso y tara)</w:t>
+      </w:r>
+    </w:p>
+    <w:p>
+      <w:r>
+        <w:rPr>
+          <w:color w:val="555555"/>
+          <w:sz w:val="19"/>
+        </w:rPr>
         <w:t>☐ Pasó          ☐ Falló          Observación: ______________________________________________</w:t>
       </w:r>
     </w:p>
@@ -1545,9 +1944,26 @@
     <w:p>
       <w:r>
         <w:rPr>
+          <w:b/>
+          <w:color w:val="2E7D32"/>
+          <w:sz w:val="19"/>
+        </w:rPr>
+        <w:t xml:space="preserve">Tablas: </w:t>
+      </w:r>
+      <w:r>
+        <w:rPr>
           <w:color w:val="555555"/>
           <w:sz w:val="19"/>
         </w:rPr>
+        <w:t>Caja: LineasVentaEnProceso (el serial va en la línea)</w:t>
+      </w:r>
+    </w:p>
+    <w:p>
+      <w:r>
+        <w:rPr>
+          <w:color w:val="555555"/>
+          <w:sz w:val="19"/>
+        </w:rPr>
         <w:t>☐ Pasó          ☐ Falló          Observación: ______________________________________________</w:t>
       </w:r>
     </w:p>
@@ -1585,9 +2001,26 @@
     <w:p>
       <w:r>
         <w:rPr>
+          <w:b/>
+          <w:color w:val="2E7D32"/>
+          <w:sz w:val="19"/>
+        </w:rPr>
+        <w:t xml:space="preserve">Tablas: </w:t>
+      </w:r>
+      <w:r>
+        <w:rPr>
           <w:color w:val="555555"/>
           <w:sz w:val="19"/>
         </w:rPr>
+        <w:t>Caja: LineasVentaEnProceso</w:t>
+      </w:r>
+    </w:p>
+    <w:p>
+      <w:r>
+        <w:rPr>
+          <w:color w:val="555555"/>
+          <w:sz w:val="19"/>
+        </w:rPr>
         <w:t>☐ Pasó          ☐ Falló          Observación: ______________________________________________</w:t>
       </w:r>
     </w:p>
@@ -1633,9 +2066,26 @@
     <w:p>
       <w:r>
         <w:rPr>
+          <w:b/>
+          <w:color w:val="2E7D32"/>
+          <w:sz w:val="19"/>
+        </w:rPr>
+        <w:t xml:space="preserve">Tablas: </w:t>
+      </w:r>
+      <w:r>
+        <w:rPr>
           <w:color w:val="555555"/>
           <w:sz w:val="19"/>
         </w:rPr>
+        <w:t>Caja: Articulos · CodigosArticulo (lee)</w:t>
+      </w:r>
+    </w:p>
+    <w:p>
+      <w:r>
+        <w:rPr>
+          <w:color w:val="555555"/>
+          <w:sz w:val="19"/>
+        </w:rPr>
         <w:t>☐ Pasó          ☐ Falló          Observación: ______________________________________________</w:t>
       </w:r>
     </w:p>
@@ -1686,9 +2136,26 @@
     <w:p>
       <w:r>
         <w:rPr>
+          <w:b/>
+          <w:color w:val="2E7D32"/>
+          <w:sz w:val="19"/>
+        </w:rPr>
+        <w:t xml:space="preserve">Tablas: </w:t>
+      </w:r>
+      <w:r>
+        <w:rPr>
           <w:color w:val="555555"/>
           <w:sz w:val="19"/>
         </w:rPr>
+        <w:t>Caja: LineasVentaEnProceso · Articulos (lee: precio de mayor)</w:t>
+      </w:r>
+    </w:p>
+    <w:p>
+      <w:r>
+        <w:rPr>
+          <w:color w:val="555555"/>
+          <w:sz w:val="19"/>
+        </w:rPr>
         <w:t>☐ Pasó          ☐ Falló          Observación: ______________________________________________</w:t>
       </w:r>
     </w:p>
@@ -1734,9 +2201,26 @@
     <w:p>
       <w:r>
         <w:rPr>
+          <w:b/>
+          <w:color w:val="2E7D32"/>
+          <w:sz w:val="19"/>
+        </w:rPr>
+        <w:t xml:space="preserve">Tablas: </w:t>
+      </w:r>
+      <w:r>
+        <w:rPr>
           <w:color w:val="555555"/>
           <w:sz w:val="19"/>
         </w:rPr>
+        <w:t>Central: Promociones · Caja: Promociones · LineasVentaEnProceso</w:t>
+      </w:r>
+    </w:p>
+    <w:p>
+      <w:r>
+        <w:rPr>
+          <w:color w:val="555555"/>
+          <w:sz w:val="19"/>
+        </w:rPr>
         <w:t>☐ Pasó          ☐ Falló          Observación: ______________________________________________</w:t>
       </w:r>
     </w:p>
@@ -1782,9 +2266,26 @@
     <w:p>
       <w:r>
         <w:rPr>
+          <w:b/>
+          <w:color w:val="2E7D32"/>
+          <w:sz w:val="19"/>
+        </w:rPr>
+        <w:t xml:space="preserve">Tablas: </w:t>
+      </w:r>
+      <w:r>
+        <w:rPr>
           <w:color w:val="555555"/>
           <w:sz w:val="19"/>
         </w:rPr>
+        <w:t>Central: Promociones · Caja: Promociones · LineasVentaEnProceso</w:t>
+      </w:r>
+    </w:p>
+    <w:p>
+      <w:r>
+        <w:rPr>
+          <w:color w:val="555555"/>
+          <w:sz w:val="19"/>
+        </w:rPr>
         <w:t>☐ Pasó          ☐ Falló          Observación: ______________________________________________</w:t>
       </w:r>
     </w:p>
@@ -1822,9 +2323,26 @@
     <w:p>
       <w:r>
         <w:rPr>
+          <w:b/>
+          <w:color w:val="2E7D32"/>
+          <w:sz w:val="19"/>
+        </w:rPr>
+        <w:t xml:space="preserve">Tablas: </w:t>
+      </w:r>
+      <w:r>
+        <w:rPr>
           <w:color w:val="555555"/>
           <w:sz w:val="19"/>
         </w:rPr>
+        <w:t>Central: Articulos · Promociones (lee)</w:t>
+      </w:r>
+    </w:p>
+    <w:p>
+      <w:r>
+        <w:rPr>
+          <w:color w:val="555555"/>
+          <w:sz w:val="19"/>
+        </w:rPr>
         <w:t>☐ Pasó          ☐ Falló          Observación: ______________________________________________</w:t>
       </w:r>
     </w:p>
@@ -1862,9 +2380,26 @@
     <w:p>
       <w:r>
         <w:rPr>
+          <w:b/>
+          <w:color w:val="2E7D32"/>
+          <w:sz w:val="19"/>
+        </w:rPr>
+        <w:t xml:space="preserve">Tablas: </w:t>
+      </w:r>
+      <w:r>
+        <w:rPr>
           <w:color w:val="555555"/>
           <w:sz w:val="19"/>
         </w:rPr>
+        <w:t>Caja: LineasVentaEnProceso · Auditoria</w:t>
+      </w:r>
+    </w:p>
+    <w:p>
+      <w:r>
+        <w:rPr>
+          <w:color w:val="555555"/>
+          <w:sz w:val="19"/>
+        </w:rPr>
         <w:t>☐ Pasó          ☐ Falló          Observación: ______________________________________________</w:t>
       </w:r>
     </w:p>
@@ -1915,9 +2450,26 @@
     <w:p>
       <w:r>
         <w:rPr>
+          <w:b/>
+          <w:color w:val="2E7D32"/>
+          <w:sz w:val="19"/>
+        </w:rPr>
+        <w:t xml:space="preserve">Tablas: </w:t>
+      </w:r>
+      <w:r>
+        <w:rPr>
           <w:color w:val="555555"/>
           <w:sz w:val="19"/>
         </w:rPr>
+        <w:t>Caja: LineasVentaEnProceso · MotivosDescuento (lee) · Auditoria</w:t>
+      </w:r>
+    </w:p>
+    <w:p>
+      <w:r>
+        <w:rPr>
+          <w:color w:val="555555"/>
+          <w:sz w:val="19"/>
+        </w:rPr>
         <w:t>☐ Pasó          ☐ Falló          Observación: ______________________________________________</w:t>
       </w:r>
     </w:p>
@@ -1955,9 +2507,26 @@
     <w:p>
       <w:r>
         <w:rPr>
+          <w:b/>
+          <w:color w:val="2E7D32"/>
+          <w:sz w:val="19"/>
+        </w:rPr>
+        <w:t xml:space="preserve">Tablas: </w:t>
+      </w:r>
+      <w:r>
+        <w:rPr>
           <w:color w:val="555555"/>
           <w:sz w:val="19"/>
         </w:rPr>
+        <w:t>Caja: VentasEnProceso · LineasVentaEnProceso</w:t>
+      </w:r>
+    </w:p>
+    <w:p>
+      <w:r>
+        <w:rPr>
+          <w:color w:val="555555"/>
+          <w:sz w:val="19"/>
+        </w:rPr>
         <w:t>☐ Pasó          ☐ Falló          Observación: ______________________________________________</w:t>
       </w:r>
     </w:p>
@@ -1995,9 +2564,26 @@
     <w:p>
       <w:r>
         <w:rPr>
+          <w:b/>
+          <w:color w:val="2E7D32"/>
+          <w:sz w:val="19"/>
+        </w:rPr>
+        <w:t xml:space="preserve">Tablas: </w:t>
+      </w:r>
+      <w:r>
+        <w:rPr>
           <w:color w:val="555555"/>
           <w:sz w:val="19"/>
         </w:rPr>
+        <w:t>Caja: TopesDescuento (lee) · AutorizacionesOtorgadas · Auditoria</w:t>
+      </w:r>
+    </w:p>
+    <w:p>
+      <w:r>
+        <w:rPr>
+          <w:color w:val="555555"/>
+          <w:sz w:val="19"/>
+        </w:rPr>
         <w:t>☐ Pasó          ☐ Falló          Observación: ______________________________________________</w:t>
       </w:r>
     </w:p>
@@ -2064,9 +2650,26 @@
     <w:p>
       <w:r>
         <w:rPr>
+          <w:b/>
+          <w:color w:val="2E7D32"/>
+          <w:sz w:val="19"/>
+        </w:rPr>
+        <w:t xml:space="preserve">Tablas: </w:t>
+      </w:r>
+      <w:r>
+        <w:rPr>
           <w:color w:val="555555"/>
           <w:sz w:val="19"/>
         </w:rPr>
+        <w:t>Caja: VentasGuardadas · LineasVentaGuardadas (y la venta sale de VentasEnProceso)</w:t>
+      </w:r>
+    </w:p>
+    <w:p>
+      <w:r>
+        <w:rPr>
+          <w:color w:val="555555"/>
+          <w:sz w:val="19"/>
+        </w:rPr>
         <w:t>☐ Pasó          ☐ Falló          Observación: ______________________________________________</w:t>
       </w:r>
     </w:p>
@@ -2112,9 +2715,26 @@
     <w:p>
       <w:r>
         <w:rPr>
+          <w:b/>
+          <w:color w:val="2E7D32"/>
+          <w:sz w:val="19"/>
+        </w:rPr>
+        <w:t xml:space="preserve">Tablas: </w:t>
+      </w:r>
+      <w:r>
+        <w:rPr>
           <w:color w:val="555555"/>
           <w:sz w:val="19"/>
         </w:rPr>
+        <w:t>Central: Cotizaciones · LineasCotizacion · SecuenciasCentral</w:t>
+      </w:r>
+    </w:p>
+    <w:p>
+      <w:r>
+        <w:rPr>
+          <w:color w:val="555555"/>
+          <w:sz w:val="19"/>
+        </w:rPr>
         <w:t>☐ Pasó          ☐ Falló          Observación: ______________________________________________</w:t>
       </w:r>
     </w:p>
@@ -2152,9 +2772,26 @@
     <w:p>
       <w:r>
         <w:rPr>
+          <w:b/>
+          <w:color w:val="2E7D32"/>
+          <w:sz w:val="19"/>
+        </w:rPr>
+        <w:t xml:space="preserve">Tablas: </w:t>
+      </w:r>
+      <w:r>
+        <w:rPr>
           <w:color w:val="555555"/>
           <w:sz w:val="19"/>
         </w:rPr>
+        <w:t>Caja: VentasEnProceso · LineasVentaEnProceso · Central: Cotizaciones (queda facturada)</w:t>
+      </w:r>
+    </w:p>
+    <w:p>
+      <w:r>
+        <w:rPr>
+          <w:color w:val="555555"/>
+          <w:sz w:val="19"/>
+        </w:rPr>
         <w:t>☐ Pasó          ☐ Falló          Observación: ______________________________________________</w:t>
       </w:r>
     </w:p>
@@ -2192,9 +2829,26 @@
     <w:p>
       <w:r>
         <w:rPr>
+          <w:b/>
+          <w:color w:val="2E7D32"/>
+          <w:sz w:val="19"/>
+        </w:rPr>
+        <w:t xml:space="preserve">Tablas: </w:t>
+      </w:r>
+      <w:r>
+        <w:rPr>
           <w:color w:val="555555"/>
           <w:sz w:val="19"/>
         </w:rPr>
+        <w:t>Caja: AutorizacionesOtorgadas · Auditoria</w:t>
+      </w:r>
+    </w:p>
+    <w:p>
+      <w:r>
+        <w:rPr>
+          <w:color w:val="555555"/>
+          <w:sz w:val="19"/>
+        </w:rPr>
         <w:t>☐ Pasó          ☐ Falló          Observación: ______________________________________________</w:t>
       </w:r>
     </w:p>
@@ -2245,9 +2899,26 @@
     <w:p>
       <w:r>
         <w:rPr>
+          <w:b/>
+          <w:color w:val="2E7D32"/>
+          <w:sz w:val="19"/>
+        </w:rPr>
+        <w:t xml:space="preserve">Tablas: </w:t>
+      </w:r>
+      <w:r>
+        <w:rPr>
           <w:color w:val="555555"/>
           <w:sz w:val="19"/>
         </w:rPr>
+        <w:t>Caja: Ventas · LineasVenta · PagosVenta · SecuenciasCaja · DocumentosElectronicos · BandejaSalida</w:t>
+      </w:r>
+    </w:p>
+    <w:p>
+      <w:r>
+        <w:rPr>
+          <w:color w:val="555555"/>
+          <w:sz w:val="19"/>
+        </w:rPr>
         <w:t>☐ Pasó          ☐ Falló          Observación: ______________________________________________</w:t>
       </w:r>
     </w:p>
@@ -2285,9 +2956,26 @@
     <w:p>
       <w:r>
         <w:rPr>
+          <w:b/>
+          <w:color w:val="2E7D32"/>
+          <w:sz w:val="19"/>
+        </w:rPr>
+        <w:t xml:space="preserve">Tablas: </w:t>
+      </w:r>
+      <w:r>
+        <w:rPr>
           <w:color w:val="555555"/>
           <w:sz w:val="19"/>
         </w:rPr>
+        <w:t>Caja: PagosVenta</w:t>
+      </w:r>
+    </w:p>
+    <w:p>
+      <w:r>
+        <w:rPr>
+          <w:color w:val="555555"/>
+          <w:sz w:val="19"/>
+        </w:rPr>
         <w:t>☐ Pasó          ☐ Falló          Observación: ______________________________________________</w:t>
       </w:r>
     </w:p>
@@ -2333,9 +3021,26 @@
     <w:p>
       <w:r>
         <w:rPr>
+          <w:b/>
+          <w:color w:val="2E7D32"/>
+          <w:sz w:val="19"/>
+        </w:rPr>
+        <w:t xml:space="preserve">Tablas: </w:t>
+      </w:r>
+      <w:r>
+        <w:rPr>
           <w:color w:val="555555"/>
           <w:sz w:val="19"/>
         </w:rPr>
+        <w:t>Caja: OperacionesTerminal · PagosVenta · Auditoria</w:t>
+      </w:r>
+    </w:p>
+    <w:p>
+      <w:r>
+        <w:rPr>
+          <w:color w:val="555555"/>
+          <w:sz w:val="19"/>
+        </w:rPr>
         <w:t>☐ Pasó          ☐ Falló          Observación: ______________________________________________</w:t>
       </w:r>
     </w:p>
@@ -2373,9 +3078,26 @@
     <w:p>
       <w:r>
         <w:rPr>
+          <w:b/>
+          <w:color w:val="2E7D32"/>
+          <w:sz w:val="19"/>
+        </w:rPr>
+        <w:t xml:space="preserve">Tablas: </w:t>
+      </w:r>
+      <w:r>
+        <w:rPr>
           <w:color w:val="555555"/>
           <w:sz w:val="19"/>
         </w:rPr>
+        <w:t>Ninguna: el ticket se imprime con lo que ya se guardó al cobrar</w:t>
+      </w:r>
+    </w:p>
+    <w:p>
+      <w:r>
+        <w:rPr>
+          <w:color w:val="555555"/>
+          <w:sz w:val="19"/>
+        </w:rPr>
         <w:t>☐ Pasó          ☐ Falló          Observación: ______________________________________________</w:t>
       </w:r>
     </w:p>
@@ -2413,9 +3135,26 @@
     <w:p>
       <w:r>
         <w:rPr>
+          <w:b/>
+          <w:color w:val="2E7D32"/>
+          <w:sz w:val="19"/>
+        </w:rPr>
+        <w:t xml:space="preserve">Tablas: </w:t>
+      </w:r>
+      <w:r>
+        <w:rPr>
           <w:color w:val="555555"/>
           <w:sz w:val="19"/>
         </w:rPr>
+        <w:t>Caja: Auditoria</w:t>
+      </w:r>
+    </w:p>
+    <w:p>
+      <w:r>
+        <w:rPr>
+          <w:color w:val="555555"/>
+          <w:sz w:val="19"/>
+        </w:rPr>
         <w:t>☐ Pasó          ☐ Falló          Observación: ______________________________________________</w:t>
       </w:r>
     </w:p>
@@ -2466,9 +3205,26 @@
     <w:p>
       <w:r>
         <w:rPr>
+          <w:b/>
+          <w:color w:val="2E7D32"/>
+          <w:sz w:val="19"/>
+        </w:rPr>
+        <w:t xml:space="preserve">Tablas: </w:t>
+      </w:r>
+      <w:r>
+        <w:rPr>
           <w:color w:val="555555"/>
           <w:sz w:val="19"/>
         </w:rPr>
+        <w:t>Ninguna: el PIN del certificado vive solo en memoria</w:t>
+      </w:r>
+    </w:p>
+    <w:p>
+      <w:r>
+        <w:rPr>
+          <w:color w:val="555555"/>
+          <w:sz w:val="19"/>
+        </w:rPr>
         <w:t>☐ Pasó          ☐ Falló          Observación: ______________________________________________</w:t>
       </w:r>
     </w:p>
@@ -2514,9 +3270,26 @@
     <w:p>
       <w:r>
         <w:rPr>
+          <w:b/>
+          <w:color w:val="2E7D32"/>
+          <w:sz w:val="19"/>
+        </w:rPr>
+        <w:t xml:space="preserve">Tablas: </w:t>
+      </w:r>
+      <w:r>
+        <w:rPr>
           <w:color w:val="555555"/>
           <w:sz w:val="19"/>
         </w:rPr>
+        <w:t>Caja: DocumentosElectronicos · SecuenciasEcf · Central: ComprobantesRecibidos · VentasCentral</w:t>
+      </w:r>
+    </w:p>
+    <w:p>
+      <w:r>
+        <w:rPr>
+          <w:color w:val="555555"/>
+          <w:sz w:val="19"/>
+        </w:rPr>
         <w:t>☐ Pasó          ☐ Falló          Observación: ______________________________________________</w:t>
       </w:r>
     </w:p>
@@ -2554,9 +3327,26 @@
     <w:p>
       <w:r>
         <w:rPr>
+          <w:b/>
+          <w:color w:val="2E7D32"/>
+          <w:sz w:val="19"/>
+        </w:rPr>
+        <w:t xml:space="preserve">Tablas: </w:t>
+      </w:r>
+      <w:r>
+        <w:rPr>
           <w:color w:val="555555"/>
           <w:sz w:val="19"/>
         </w:rPr>
+        <w:t>Caja: SecuenciasEcf (lee)</w:t>
+      </w:r>
+    </w:p>
+    <w:p>
+      <w:r>
+        <w:rPr>
+          <w:color w:val="555555"/>
+          <w:sz w:val="19"/>
+        </w:rPr>
         <w:t>☐ Pasó          ☐ Falló          Observación: ______________________________________________</w:t>
       </w:r>
     </w:p>
@@ -2594,9 +3384,26 @@
     <w:p>
       <w:r>
         <w:rPr>
+          <w:b/>
+          <w:color w:val="2E7D32"/>
+          <w:sz w:val="19"/>
+        </w:rPr>
+        <w:t xml:space="preserve">Tablas: </w:t>
+      </w:r>
+      <w:r>
+        <w:rPr>
           <w:color w:val="555555"/>
           <w:sz w:val="19"/>
         </w:rPr>
+        <w:t>Central: ComprobantesRecibidos · Caja: HistorialEstadosEcf</w:t>
+      </w:r>
+    </w:p>
+    <w:p>
+      <w:r>
+        <w:rPr>
+          <w:color w:val="555555"/>
+          <w:sz w:val="19"/>
+        </w:rPr>
         <w:t>☐ Pasó          ☐ Falló          Observación: ______________________________________________</w:t>
       </w:r>
     </w:p>
@@ -2672,9 +3479,26 @@
     <w:p>
       <w:r>
         <w:rPr>
+          <w:b/>
+          <w:color w:val="2E7D32"/>
+          <w:sz w:val="19"/>
+        </w:rPr>
+        <w:t xml:space="preserve">Tablas: </w:t>
+      </w:r>
+      <w:r>
+        <w:rPr>
           <w:color w:val="555555"/>
           <w:sz w:val="19"/>
         </w:rPr>
+        <w:t>Caja: Devoluciones · LineasDevolucion · DocumentosElectronicos · SecuenciasEcf · BandejaSalida · Central: NotasCredito</w:t>
+      </w:r>
+    </w:p>
+    <w:p>
+      <w:r>
+        <w:rPr>
+          <w:color w:val="555555"/>
+          <w:sz w:val="19"/>
+        </w:rPr>
         <w:t>☐ Pasó          ☐ Falló          Observación: ______________________________________________</w:t>
       </w:r>
     </w:p>
@@ -2712,9 +3536,26 @@
     <w:p>
       <w:r>
         <w:rPr>
+          <w:b/>
+          <w:color w:val="2E7D32"/>
+          <w:sz w:val="19"/>
+        </w:rPr>
+        <w:t xml:space="preserve">Tablas: </w:t>
+      </w:r>
+      <w:r>
+        <w:rPr>
           <w:color w:val="555555"/>
           <w:sz w:val="19"/>
         </w:rPr>
+        <w:t>Caja: Devoluciones · LineasDevolucion (lee)</w:t>
+      </w:r>
+    </w:p>
+    <w:p>
+      <w:r>
+        <w:rPr>
+          <w:color w:val="555555"/>
+          <w:sz w:val="19"/>
+        </w:rPr>
         <w:t>☐ Pasó          ☐ Falló          Observación: ______________________________________________</w:t>
       </w:r>
     </w:p>
@@ -2752,9 +3593,26 @@
     <w:p>
       <w:r>
         <w:rPr>
+          <w:b/>
+          <w:color w:val="2E7D32"/>
+          <w:sz w:val="19"/>
+        </w:rPr>
+        <w:t xml:space="preserve">Tablas: </w:t>
+      </w:r>
+      <w:r>
+        <w:rPr>
           <w:color w:val="555555"/>
           <w:sz w:val="19"/>
         </w:rPr>
+        <w:t>Caja: Devoluciones · Parametros (lee)</w:t>
+      </w:r>
+    </w:p>
+    <w:p>
+      <w:r>
+        <w:rPr>
+          <w:color w:val="555555"/>
+          <w:sz w:val="19"/>
+        </w:rPr>
         <w:t>☐ Pasó          ☐ Falló          Observación: ______________________________________________</w:t>
       </w:r>
     </w:p>
@@ -2792,9 +3650,26 @@
     <w:p>
       <w:r>
         <w:rPr>
+          <w:b/>
+          <w:color w:val="2E7D32"/>
+          <w:sz w:val="19"/>
+        </w:rPr>
+        <w:t xml:space="preserve">Tablas: </w:t>
+      </w:r>
+      <w:r>
+        <w:rPr>
           <w:color w:val="555555"/>
           <w:sz w:val="19"/>
         </w:rPr>
+        <w:t>Caja: ConsumosNotaCredito · PagosVenta · Central: NotasCredito · ConsumosNotaCredito</w:t>
+      </w:r>
+    </w:p>
+    <w:p>
+      <w:r>
+        <w:rPr>
+          <w:color w:val="555555"/>
+          <w:sz w:val="19"/>
+        </w:rPr>
         <w:t>☐ Pasó          ☐ Falló          Observación: ______________________________________________</w:t>
       </w:r>
     </w:p>
@@ -2832,9 +3707,26 @@
     <w:p>
       <w:r>
         <w:rPr>
+          <w:b/>
+          <w:color w:val="2E7D32"/>
+          <w:sz w:val="19"/>
+        </w:rPr>
+        <w:t xml:space="preserve">Tablas: </w:t>
+      </w:r>
+      <w:r>
+        <w:rPr>
           <w:color w:val="555555"/>
           <w:sz w:val="19"/>
         </w:rPr>
+        <w:t>Caja: Devoluciones · Auditoria</w:t>
+      </w:r>
+    </w:p>
+    <w:p>
+      <w:r>
+        <w:rPr>
+          <w:color w:val="555555"/>
+          <w:sz w:val="19"/>
+        </w:rPr>
         <w:t>☐ Pasó          ☐ Falló          Observación: ______________________________________________</w:t>
       </w:r>
     </w:p>
@@ -2872,9 +3764,26 @@
     <w:p>
       <w:r>
         <w:rPr>
+          <w:b/>
+          <w:color w:val="2E7D32"/>
+          <w:sz w:val="19"/>
+        </w:rPr>
+        <w:t xml:space="preserve">Tablas: </w:t>
+      </w:r>
+      <w:r>
+        <w:rPr>
           <w:color w:val="555555"/>
           <w:sz w:val="19"/>
         </w:rPr>
+        <w:t>Caja: FacturasConsultadas · LineasFacturaConsultada · Central: VentasCentral (lee) · ReservasFactura · LineasReservaFactura</w:t>
+      </w:r>
+    </w:p>
+    <w:p>
+      <w:r>
+        <w:rPr>
+          <w:color w:val="555555"/>
+          <w:sz w:val="19"/>
+        </w:rPr>
         <w:t>☐ Pasó          ☐ Falló          Observación: ______________________________________________</w:t>
       </w:r>
     </w:p>
@@ -2912,9 +3821,26 @@
     <w:p>
       <w:r>
         <w:rPr>
+          <w:b/>
+          <w:color w:val="2E7D32"/>
+          <w:sz w:val="19"/>
+        </w:rPr>
+        <w:t xml:space="preserve">Tablas: </w:t>
+      </w:r>
+      <w:r>
+        <w:rPr>
           <w:color w:val="555555"/>
           <w:sz w:val="19"/>
         </w:rPr>
+        <w:t>Ninguna: sin conexión no se consulta nada, solo se avisa</w:t>
+      </w:r>
+    </w:p>
+    <w:p>
+      <w:r>
+        <w:rPr>
+          <w:color w:val="555555"/>
+          <w:sz w:val="19"/>
+        </w:rPr>
         <w:t>☐ Pasó          ☐ Falló          Observación: ______________________________________________</w:t>
       </w:r>
     </w:p>
@@ -2965,9 +3891,26 @@
     <w:p>
       <w:r>
         <w:rPr>
+          <w:b/>
+          <w:color w:val="2E7D32"/>
+          <w:sz w:val="19"/>
+        </w:rPr>
+        <w:t xml:space="preserve">Tablas: </w:t>
+      </w:r>
+      <w:r>
+        <w:rPr>
           <w:color w:val="555555"/>
           <w:sz w:val="19"/>
         </w:rPr>
+        <w:t>Central: ListasBoda · ArticulosListaBoda · SecuenciasCentral</w:t>
+      </w:r>
+    </w:p>
+    <w:p>
+      <w:r>
+        <w:rPr>
+          <w:color w:val="555555"/>
+          <w:sz w:val="19"/>
+        </w:rPr>
         <w:t>☐ Pasó          ☐ Falló          Observación: ______________________________________________</w:t>
       </w:r>
     </w:p>
@@ -3013,9 +3956,26 @@
     <w:p>
       <w:r>
         <w:rPr>
+          <w:b/>
+          <w:color w:val="2E7D32"/>
+          <w:sz w:val="19"/>
+        </w:rPr>
+        <w:t xml:space="preserve">Tablas: </w:t>
+      </w:r>
+      <w:r>
+        <w:rPr>
           <w:color w:val="555555"/>
           <w:sz w:val="19"/>
         </w:rPr>
+        <w:t>Caja: Ventas (lleva el número de la lista) · BandejaSalida</w:t>
+      </w:r>
+    </w:p>
+    <w:p>
+      <w:r>
+        <w:rPr>
+          <w:color w:val="555555"/>
+          <w:sz w:val="19"/>
+        </w:rPr>
         <w:t>☐ Pasó          ☐ Falló          Observación: ______________________________________________</w:t>
       </w:r>
     </w:p>
@@ -3053,9 +4013,26 @@
     <w:p>
       <w:r>
         <w:rPr>
+          <w:b/>
+          <w:color w:val="2E7D32"/>
+          <w:sz w:val="19"/>
+        </w:rPr>
+        <w:t xml:space="preserve">Tablas: </w:t>
+      </w:r>
+      <w:r>
+        <w:rPr>
           <w:color w:val="555555"/>
           <w:sz w:val="19"/>
         </w:rPr>
+        <w:t>Central: ComprasListaBoda · ArticulosListaBoda</w:t>
+      </w:r>
+    </w:p>
+    <w:p>
+      <w:r>
+        <w:rPr>
+          <w:color w:val="555555"/>
+          <w:sz w:val="19"/>
+        </w:rPr>
         <w:t>☐ Pasó          ☐ Falló          Observación: ______________________________________________</w:t>
       </w:r>
     </w:p>
@@ -3106,9 +4083,26 @@
     <w:p>
       <w:r>
         <w:rPr>
+          <w:b/>
+          <w:color w:val="2E7D32"/>
+          <w:sz w:val="19"/>
+        </w:rPr>
+        <w:t xml:space="preserve">Tablas: </w:t>
+      </w:r>
+      <w:r>
+        <w:rPr>
           <w:color w:val="555555"/>
           <w:sz w:val="19"/>
         </w:rPr>
+        <w:t>Caja: MiembrosFidelidad · BandejaSalida · Central: MiembrosFidelidad</w:t>
+      </w:r>
+    </w:p>
+    <w:p>
+      <w:r>
+        <w:rPr>
+          <w:color w:val="555555"/>
+          <w:sz w:val="19"/>
+        </w:rPr>
         <w:t>☐ Pasó          ☐ Falló          Observación: ______________________________________________</w:t>
       </w:r>
     </w:p>
@@ -3146,9 +4140,26 @@
     <w:p>
       <w:r>
         <w:rPr>
+          <w:b/>
+          <w:color w:val="2E7D32"/>
+          <w:sz w:val="19"/>
+        </w:rPr>
+        <w:t xml:space="preserve">Tablas: </w:t>
+      </w:r>
+      <w:r>
+        <w:rPr>
           <w:color w:val="555555"/>
           <w:sz w:val="19"/>
         </w:rPr>
+        <w:t>Caja: MovimientosPuntos · Central: MovimientosPuntos · SaldosPuntos</w:t>
+      </w:r>
+    </w:p>
+    <w:p>
+      <w:r>
+        <w:rPr>
+          <w:color w:val="555555"/>
+          <w:sz w:val="19"/>
+        </w:rPr>
         <w:t>☐ Pasó          ☐ Falló          Observación: ______________________________________________</w:t>
       </w:r>
     </w:p>
@@ -3186,9 +4197,26 @@
     <w:p>
       <w:r>
         <w:rPr>
+          <w:b/>
+          <w:color w:val="2E7D32"/>
+          <w:sz w:val="19"/>
+        </w:rPr>
+        <w:t xml:space="preserve">Tablas: </w:t>
+      </w:r>
+      <w:r>
+        <w:rPr>
           <w:color w:val="555555"/>
           <w:sz w:val="19"/>
         </w:rPr>
+        <w:t>Caja: MovimientosPuntos · PagosVenta · Central: MovimientosPuntos · SaldosPuntos</w:t>
+      </w:r>
+    </w:p>
+    <w:p>
+      <w:r>
+        <w:rPr>
+          <w:color w:val="555555"/>
+          <w:sz w:val="19"/>
+        </w:rPr>
         <w:t>☐ Pasó          ☐ Falló          Observación: ______________________________________________</w:t>
       </w:r>
     </w:p>
@@ -3247,9 +4275,26 @@
     <w:p>
       <w:r>
         <w:rPr>
+          <w:b/>
+          <w:color w:val="2E7D32"/>
+          <w:sz w:val="19"/>
+        </w:rPr>
+        <w:t xml:space="preserve">Tablas: </w:t>
+      </w:r>
+      <w:r>
+        <w:rPr>
           <w:color w:val="555555"/>
           <w:sz w:val="19"/>
         </w:rPr>
+        <w:t>Caja: DestinosEntregaVenta · LineasDestinoEntrega · PendientesEntrega · LineasPendienteEntrega · Central: PendientesEntrega · LineasPendienteEntrega</w:t>
+      </w:r>
+    </w:p>
+    <w:p>
+      <w:r>
+        <w:rPr>
+          <w:color w:val="555555"/>
+          <w:sz w:val="19"/>
+        </w:rPr>
         <w:t>☐ Pasó          ☐ Falló          Observación: ______________________________________________</w:t>
       </w:r>
     </w:p>
@@ -3287,9 +4332,26 @@
     <w:p>
       <w:r>
         <w:rPr>
+          <w:b/>
+          <w:color w:val="2E7D32"/>
+          <w:sz w:val="19"/>
+        </w:rPr>
+        <w:t xml:space="preserve">Tablas: </w:t>
+      </w:r>
+      <w:r>
+        <w:rPr>
           <w:color w:val="555555"/>
           <w:sz w:val="19"/>
         </w:rPr>
+        <w:t>Central: EntregasPendiente · LineasEntregaPendiente · PendientesEntrega</w:t>
+      </w:r>
+    </w:p>
+    <w:p>
+      <w:r>
+        <w:rPr>
+          <w:color w:val="555555"/>
+          <w:sz w:val="19"/>
+        </w:rPr>
         <w:t>☐ Pasó          ☐ Falló          Observación: ______________________________________________</w:t>
       </w:r>
     </w:p>
@@ -3327,9 +4389,26 @@
     <w:p>
       <w:r>
         <w:rPr>
+          <w:b/>
+          <w:color w:val="2E7D32"/>
+          <w:sz w:val="19"/>
+        </w:rPr>
+        <w:t xml:space="preserve">Tablas: </w:t>
+      </w:r>
+      <w:r>
+        <w:rPr>
           <w:color w:val="555555"/>
           <w:sz w:val="19"/>
         </w:rPr>
+        <w:t>Caja: PendientesEntrega (lee)</w:t>
+      </w:r>
+    </w:p>
+    <w:p>
+      <w:r>
+        <w:rPr>
+          <w:color w:val="555555"/>
+          <w:sz w:val="19"/>
+        </w:rPr>
         <w:t>☐ Pasó          ☐ Falló          Observación: ______________________________________________</w:t>
       </w:r>
     </w:p>
@@ -3388,9 +4467,26 @@
     <w:p>
       <w:r>
         <w:rPr>
+          <w:b/>
+          <w:color w:val="2E7D32"/>
+          <w:sz w:val="19"/>
+        </w:rPr>
+        <w:t xml:space="preserve">Tablas: </w:t>
+      </w:r>
+      <w:r>
+        <w:rPr>
           <w:color w:val="555555"/>
           <w:sz w:val="19"/>
         </w:rPr>
+        <w:t>Caja: MovimientosCaja · AutorizacionesOtorgadas · BandejaSalida · Auditoria</w:t>
+      </w:r>
+    </w:p>
+    <w:p>
+      <w:r>
+        <w:rPr>
+          <w:color w:val="555555"/>
+          <w:sz w:val="19"/>
+        </w:rPr>
         <w:t>☐ Pasó          ☐ Falló          Observación: ______________________________________________</w:t>
       </w:r>
     </w:p>
@@ -3428,9 +4524,26 @@
     <w:p>
       <w:r>
         <w:rPr>
+          <w:b/>
+          <w:color w:val="2E7D32"/>
+          <w:sz w:val="19"/>
+        </w:rPr>
+        <w:t xml:space="preserve">Tablas: </w:t>
+      </w:r>
+      <w:r>
+        <w:rPr>
           <w:color w:val="555555"/>
           <w:sz w:val="19"/>
         </w:rPr>
+        <w:t>Caja: Turnos · MovimientosCaja · Auditoria</w:t>
+      </w:r>
+    </w:p>
+    <w:p>
+      <w:r>
+        <w:rPr>
+          <w:color w:val="555555"/>
+          <w:sz w:val="19"/>
+        </w:rPr>
         <w:t>☐ Pasó          ☐ Falló          Observación: ______________________________________________</w:t>
       </w:r>
     </w:p>
@@ -3468,9 +4581,26 @@
     <w:p>
       <w:r>
         <w:rPr>
+          <w:b/>
+          <w:color w:val="2E7D32"/>
+          <w:sz w:val="19"/>
+        </w:rPr>
+        <w:t xml:space="preserve">Tablas: </w:t>
+      </w:r>
+      <w:r>
+        <w:rPr>
           <w:color w:val="555555"/>
           <w:sz w:val="19"/>
         </w:rPr>
+        <w:t>Caja: Auditoria</w:t>
+      </w:r>
+    </w:p>
+    <w:p>
+      <w:r>
+        <w:rPr>
+          <w:color w:val="555555"/>
+          <w:sz w:val="19"/>
+        </w:rPr>
         <w:t>☐ Pasó          ☐ Falló          Observación: ______________________________________________</w:t>
       </w:r>
     </w:p>
@@ -3508,9 +4638,26 @@
     <w:p>
       <w:r>
         <w:rPr>
+          <w:b/>
+          <w:color w:val="2E7D32"/>
+          <w:sz w:val="19"/>
+        </w:rPr>
+        <w:t xml:space="preserve">Tablas: </w:t>
+      </w:r>
+      <w:r>
+        <w:rPr>
           <w:color w:val="555555"/>
           <w:sz w:val="19"/>
         </w:rPr>
+        <w:t>Caja: LotesTarjetas · LotesTarjetasAprobaciones · OperacionesTerminal (lee) · Auditoria</w:t>
+      </w:r>
+    </w:p>
+    <w:p>
+      <w:r>
+        <w:rPr>
+          <w:color w:val="555555"/>
+          <w:sz w:val="19"/>
+        </w:rPr>
         <w:t>☐ Pasó          ☐ Falló          Observación: ______________________________________________</w:t>
       </w:r>
     </w:p>
@@ -3548,9 +4695,26 @@
     <w:p>
       <w:r>
         <w:rPr>
+          <w:b/>
+          <w:color w:val="2E7D32"/>
+          <w:sz w:val="19"/>
+        </w:rPr>
+        <w:t xml:space="preserve">Tablas: </w:t>
+      </w:r>
+      <w:r>
+        <w:rPr>
           <w:color w:val="555555"/>
           <w:sz w:val="19"/>
         </w:rPr>
+        <w:t>Caja: VentasGuardadas · VentasEnProceso · DocumentosElectronicos (lee)</w:t>
+      </w:r>
+    </w:p>
+    <w:p>
+      <w:r>
+        <w:rPr>
+          <w:color w:val="555555"/>
+          <w:sz w:val="19"/>
+        </w:rPr>
         <w:t>☐ Pasó          ☐ Falló          Observación: ______________________________________________</w:t>
       </w:r>
     </w:p>
@@ -3588,9 +4752,26 @@
     <w:p>
       <w:r>
         <w:rPr>
+          <w:b/>
+          <w:color w:val="2E7D32"/>
+          <w:sz w:val="19"/>
+        </w:rPr>
+        <w:t xml:space="preserve">Tablas: </w:t>
+      </w:r>
+      <w:r>
+        <w:rPr>
           <w:color w:val="555555"/>
           <w:sz w:val="19"/>
         </w:rPr>
+        <w:t>Caja: CierresTurno · CierresTurnoFormasPago · Turnos · BandejaSalida · Central: CierresTurno · CierresFormaPago · CierresTurnoMovimientos · CierresTurnoLote · CierresTurnoLoteAprobaciones</w:t>
+      </w:r>
+    </w:p>
+    <w:p>
+      <w:r>
+        <w:rPr>
+          <w:color w:val="555555"/>
+          <w:sz w:val="19"/>
+        </w:rPr>
         <w:t>☐ Pasó          ☐ Falló          Observación: ______________________________________________</w:t>
       </w:r>
     </w:p>
@@ -3637,9 +4818,26 @@
     <w:p>
       <w:r>
         <w:rPr>
+          <w:b/>
+          <w:color w:val="2E7D32"/>
+          <w:sz w:val="19"/>
+        </w:rPr>
+        <w:t xml:space="preserve">Tablas: </w:t>
+      </w:r>
+      <w:r>
+        <w:rPr>
           <w:color w:val="555555"/>
           <w:sz w:val="19"/>
         </w:rPr>
+        <w:t>Caja: Turnos · Parametros (lee)</w:t>
+      </w:r>
+    </w:p>
+    <w:p>
+      <w:r>
+        <w:rPr>
+          <w:color w:val="555555"/>
+          <w:sz w:val="19"/>
+        </w:rPr>
         <w:t>☐ Pasó          ☐ Falló          Observación: ______________________________________________</w:t>
       </w:r>
     </w:p>
@@ -3698,9 +4896,26 @@
     <w:p>
       <w:r>
         <w:rPr>
+          <w:b/>
+          <w:color w:val="2E7D32"/>
+          <w:sz w:val="19"/>
+        </w:rPr>
+        <w:t xml:space="preserve">Tablas: </w:t>
+      </w:r>
+      <w:r>
+        <w:rPr>
           <w:color w:val="555555"/>
           <w:sz w:val="19"/>
         </w:rPr>
+        <w:t>Central: UsuariosCaja · RolesCajaPermisos (lee) · Auditoria</w:t>
+      </w:r>
+    </w:p>
+    <w:p>
+      <w:r>
+        <w:rPr>
+          <w:color w:val="555555"/>
+          <w:sz w:val="19"/>
+        </w:rPr>
         <w:t>☐ Pasó          ☐ Falló          Observación: ______________________________________________</w:t>
       </w:r>
     </w:p>
@@ -3754,9 +4969,26 @@
     <w:p>
       <w:r>
         <w:rPr>
+          <w:b/>
+          <w:color w:val="2E7D32"/>
+          <w:sz w:val="19"/>
+        </w:rPr>
+        <w:t xml:space="preserve">Tablas: </w:t>
+      </w:r>
+      <w:r>
+        <w:rPr>
           <w:color w:val="555555"/>
           <w:sz w:val="19"/>
         </w:rPr>
+        <w:t>Central: CierresTurno · CierresFormaPago · CierresTurnoDenominaciones · Auditoria</w:t>
+      </w:r>
+    </w:p>
+    <w:p>
+      <w:r>
+        <w:rPr>
+          <w:color w:val="555555"/>
+          <w:sz w:val="19"/>
+        </w:rPr>
         <w:t>☐ Pasó          ☐ Falló          Observación: ______________________________________________</w:t>
       </w:r>
     </w:p>
@@ -3794,9 +5026,26 @@
     <w:p>
       <w:r>
         <w:rPr>
+          <w:b/>
+          <w:color w:val="2E7D32"/>
+          <w:sz w:val="19"/>
+        </w:rPr>
+        <w:t xml:space="preserve">Tablas: </w:t>
+      </w:r>
+      <w:r>
+        <w:rPr>
           <w:color w:val="555555"/>
           <w:sz w:val="19"/>
         </w:rPr>
+        <w:t>Central: CierresTurno (lee)</w:t>
+      </w:r>
+    </w:p>
+    <w:p>
+      <w:r>
+        <w:rPr>
+          <w:color w:val="555555"/>
+          <w:sz w:val="19"/>
+        </w:rPr>
         <w:t>☐ Pasó          ☐ Falló          Observación: ______________________________________________</w:t>
       </w:r>
     </w:p>
@@ -3834,9 +5083,26 @@
     <w:p>
       <w:r>
         <w:rPr>
+          <w:b/>
+          <w:color w:val="2E7D32"/>
+          <w:sz w:val="19"/>
+        </w:rPr>
+        <w:t xml:space="preserve">Tablas: </w:t>
+      </w:r>
+      <w:r>
+        <w:rPr>
           <w:color w:val="555555"/>
           <w:sz w:val="19"/>
         </w:rPr>
+        <w:t>Central: AjustesCierreTurno · CierresFormaPago · CierresTurno · Auditoria</w:t>
+      </w:r>
+    </w:p>
+    <w:p>
+      <w:r>
+        <w:rPr>
+          <w:color w:val="555555"/>
+          <w:sz w:val="19"/>
+        </w:rPr>
         <w:t>☐ Pasó          ☐ Falló          Observación: ______________________________________________</w:t>
       </w:r>
     </w:p>
@@ -3874,9 +5140,26 @@
     <w:p>
       <w:r>
         <w:rPr>
+          <w:b/>
+          <w:color w:val="2E7D32"/>
+          <w:sz w:val="19"/>
+        </w:rPr>
+        <w:t xml:space="preserve">Tablas: </w:t>
+      </w:r>
+      <w:r>
+        <w:rPr>
           <w:color w:val="555555"/>
           <w:sz w:val="19"/>
         </w:rPr>
+        <w:t>Central: CierresTurno · CierresFormaPago · CierresTurnoMovimientos (lee)</w:t>
+      </w:r>
+    </w:p>
+    <w:p>
+      <w:r>
+        <w:rPr>
+          <w:color w:val="555555"/>
+          <w:sz w:val="19"/>
+        </w:rPr>
         <w:t>☐ Pasó          ☐ Falló          Observación: ______________________________________________</w:t>
       </w:r>
     </w:p>
@@ -3914,9 +5197,26 @@
     <w:p>
       <w:r>
         <w:rPr>
+          <w:b/>
+          <w:color w:val="2E7D32"/>
+          <w:sz w:val="19"/>
+        </w:rPr>
+        <w:t xml:space="preserve">Tablas: </w:t>
+      </w:r>
+      <w:r>
+        <w:rPr>
           <w:color w:val="555555"/>
           <w:sz w:val="19"/>
         </w:rPr>
+        <w:t>Central: CierresTurnoDenominaciones · CierresTurnoLote · CierresTurnoLoteAprobaciones (lee)</w:t>
+      </w:r>
+    </w:p>
+    <w:p>
+      <w:r>
+        <w:rPr>
+          <w:color w:val="555555"/>
+          <w:sz w:val="19"/>
+        </w:rPr>
         <w:t>☐ Pasó          ☐ Falló          Observación: ______________________________________________</w:t>
       </w:r>
     </w:p>
@@ -3967,9 +5267,26 @@
     <w:p>
       <w:r>
         <w:rPr>
+          <w:b/>
+          <w:color w:val="2E7D32"/>
+          <w:sz w:val="19"/>
+        </w:rPr>
+        <w:t xml:space="preserve">Tablas: </w:t>
+      </w:r>
+      <w:r>
+        <w:rPr>
           <w:color w:val="555555"/>
           <w:sz w:val="19"/>
         </w:rPr>
+        <w:t>Central: CierresTurno · VentasCentral (lee)</w:t>
+      </w:r>
+    </w:p>
+    <w:p>
+      <w:r>
+        <w:rPr>
+          <w:color w:val="555555"/>
+          <w:sz w:val="19"/>
+        </w:rPr>
         <w:t>☐ Pasó          ☐ Falló          Observación: ______________________________________________</w:t>
       </w:r>
     </w:p>
@@ -4007,9 +5324,26 @@
     <w:p>
       <w:r>
         <w:rPr>
+          <w:b/>
+          <w:color w:val="2E7D32"/>
+          <w:sz w:val="19"/>
+        </w:rPr>
+        <w:t xml:space="preserve">Tablas: </w:t>
+      </w:r>
+      <w:r>
+        <w:rPr>
           <w:color w:val="555555"/>
           <w:sz w:val="19"/>
         </w:rPr>
+        <w:t>Central: CierresSucursal · CierresSucursalFormaPago · DepositosCierreSucursal · SecuenciasCentral</w:t>
+      </w:r>
+    </w:p>
+    <w:p>
+      <w:r>
+        <w:rPr>
+          <w:color w:val="555555"/>
+          <w:sz w:val="19"/>
+        </w:rPr>
         <w:t>☐ Pasó          ☐ Falló          Observación: ______________________________________________</w:t>
       </w:r>
     </w:p>
@@ -4047,9 +5381,26 @@
     <w:p>
       <w:r>
         <w:rPr>
+          <w:b/>
+          <w:color w:val="2E7D32"/>
+          <w:sz w:val="19"/>
+        </w:rPr>
+        <w:t xml:space="preserve">Tablas: </w:t>
+      </w:r>
+      <w:r>
+        <w:rPr>
           <w:color w:val="555555"/>
           <w:sz w:val="19"/>
         </w:rPr>
+        <w:t>Central: CierresTurno · CierresSucursal (lee)</w:t>
+      </w:r>
+    </w:p>
+    <w:p>
+      <w:r>
+        <w:rPr>
+          <w:color w:val="555555"/>
+          <w:sz w:val="19"/>
+        </w:rPr>
         <w:t>☐ Pasó          ☐ Falló          Observación: ______________________________________________</w:t>
       </w:r>
     </w:p>
@@ -4087,9 +5438,26 @@
     <w:p>
       <w:r>
         <w:rPr>
+          <w:b/>
+          <w:color w:val="2E7D32"/>
+          <w:sz w:val="19"/>
+        </w:rPr>
+        <w:t xml:space="preserve">Tablas: </w:t>
+      </w:r>
+      <w:r>
+        <w:rPr>
           <w:color w:val="555555"/>
           <w:sz w:val="19"/>
         </w:rPr>
+        <w:t>Central: VentasCentral · LineasVenta · ImpuestosVenta · PagosVenta · CierresTurno · ComprobantesRecibidos (lee)</w:t>
+      </w:r>
+    </w:p>
+    <w:p>
+      <w:r>
+        <w:rPr>
+          <w:color w:val="555555"/>
+          <w:sz w:val="19"/>
+        </w:rPr>
         <w:t>☐ Pasó          ☐ Falló          Observación: ______________________________________________</w:t>
       </w:r>
     </w:p>
@@ -4140,9 +5508,26 @@
     <w:p>
       <w:r>
         <w:rPr>
+          <w:b/>
+          <w:color w:val="2E7D32"/>
+          <w:sz w:val="19"/>
+        </w:rPr>
+        <w:t xml:space="preserve">Tablas: </w:t>
+      </w:r>
+      <w:r>
+        <w:rPr>
           <w:color w:val="555555"/>
           <w:sz w:val="19"/>
         </w:rPr>
+        <w:t>Caja: Ventas · LineasVenta · BandejaSalida (los mensajes se acumulan)</w:t>
+      </w:r>
+    </w:p>
+    <w:p>
+      <w:r>
+        <w:rPr>
+          <w:color w:val="555555"/>
+          <w:sz w:val="19"/>
+        </w:rPr>
         <w:t>☐ Pasó          ☐ Falló          Observación: ______________________________________________</w:t>
       </w:r>
     </w:p>
@@ -4180,9 +5565,26 @@
     <w:p>
       <w:r>
         <w:rPr>
+          <w:b/>
+          <w:color w:val="2E7D32"/>
+          <w:sz w:val="19"/>
+        </w:rPr>
+        <w:t xml:space="preserve">Tablas: </w:t>
+      </w:r>
+      <w:r>
+        <w:rPr>
           <w:color w:val="555555"/>
           <w:sz w:val="19"/>
         </w:rPr>
+        <w:t>Caja: BandejaSalida · MarcasSincronizacion · Central: DocumentosRecibidos · VentasCentral · EstadosSincronizacionCaja</w:t>
+      </w:r>
+    </w:p>
+    <w:p>
+      <w:r>
+        <w:rPr>
+          <w:color w:val="555555"/>
+          <w:sz w:val="19"/>
+        </w:rPr>
         <w:t>☐ Pasó          ☐ Falló          Observación: ______________________________________________</w:t>
       </w:r>
     </w:p>
@@ -4220,9 +5622,26 @@
     <w:p>
       <w:r>
         <w:rPr>
+          <w:b/>
+          <w:color w:val="2E7D32"/>
+          <w:sz w:val="19"/>
+        </w:rPr>
+        <w:t xml:space="preserve">Tablas: </w:t>
+      </w:r>
+      <w:r>
+        <w:rPr>
           <w:color w:val="555555"/>
           <w:sz w:val="19"/>
         </w:rPr>
+        <w:t>Central: EstadosSincronizacionCaja · ConflictosSincronizacion · DocumentosRecibidos (lee)</w:t>
+      </w:r>
+    </w:p>
+    <w:p>
+      <w:r>
+        <w:rPr>
+          <w:color w:val="555555"/>
+          <w:sz w:val="19"/>
+        </w:rPr>
         <w:t>☐ Pasó          ☐ Falló          Observación: ______________________________________________</w:t>
       </w:r>
     </w:p>
@@ -4260,9 +5679,26 @@
     <w:p>
       <w:r>
         <w:rPr>
+          <w:b/>
+          <w:color w:val="2E7D32"/>
+          <w:sz w:val="19"/>
+        </w:rPr>
+        <w:t xml:space="preserve">Tablas: </w:t>
+      </w:r>
+      <w:r>
+        <w:rPr>
           <w:color w:val="555555"/>
           <w:sz w:val="19"/>
         </w:rPr>
+        <w:t>Caja: CierresTurno · BandejaSalida</w:t>
+      </w:r>
+    </w:p>
+    <w:p>
+      <w:r>
+        <w:rPr>
+          <w:color w:val="555555"/>
+          <w:sz w:val="19"/>
+        </w:rPr>
         <w:t>☐ Pasó          ☐ Falló          Observación: ______________________________________________</w:t>
       </w:r>
     </w:p>
@@ -4313,9 +5749,26 @@
     <w:p>
       <w:r>
         <w:rPr>
+          <w:b/>
+          <w:color w:val="2E7D32"/>
+          <w:sz w:val="19"/>
+        </w:rPr>
+        <w:t xml:space="preserve">Tablas: </w:t>
+      </w:r>
+      <w:r>
+        <w:rPr>
           <w:color w:val="555555"/>
           <w:sz w:val="19"/>
         </w:rPr>
+        <w:t>Caja: Usuarios · Roles · RolesPermisos (lee)</w:t>
+      </w:r>
+    </w:p>
+    <w:p>
+      <w:r>
+        <w:rPr>
+          <w:color w:val="555555"/>
+          <w:sz w:val="19"/>
+        </w:rPr>
         <w:t>☐ Pasó          ☐ Falló          Observación: ______________________________________________</w:t>
       </w:r>
     </w:p>
@@ -4361,9 +5814,26 @@
     <w:p>
       <w:r>
         <w:rPr>
+          <w:b/>
+          <w:color w:val="2E7D32"/>
+          <w:sz w:val="19"/>
+        </w:rPr>
+        <w:t xml:space="preserve">Tablas: </w:t>
+      </w:r>
+      <w:r>
+        <w:rPr>
           <w:color w:val="555555"/>
           <w:sz w:val="19"/>
         </w:rPr>
+        <w:t>Caja: Roles · RolesPermisos (lee)</w:t>
+      </w:r>
+    </w:p>
+    <w:p>
+      <w:r>
+        <w:rPr>
+          <w:color w:val="555555"/>
+          <w:sz w:val="19"/>
+        </w:rPr>
         <w:t>☐ Pasó          ☐ Falló          Observación: ______________________________________________</w:t>
       </w:r>
     </w:p>
@@ -4396,6 +5866,23 @@
           <w:color w:val="555555"/>
         </w:rPr>
         <w:t>Están los ingresos, las autorizaciones del supervisor con su motivo, las eliminaciones de línea, los descuentos, los retiros, los cierres y los cuadres, cada uno con quién lo hizo.</w:t>
+      </w:r>
+    </w:p>
+    <w:p>
+      <w:r>
+        <w:rPr>
+          <w:b/>
+          <w:color w:val="2E7D32"/>
+          <w:sz w:val="19"/>
+        </w:rPr>
+        <w:t xml:space="preserve">Tablas: </w:t>
+      </w:r>
+      <w:r>
+        <w:rPr>
+          <w:color w:val="555555"/>
+          <w:sz w:val="19"/>
+        </w:rPr>
+        <w:t>Central: Auditoria · Caja: Auditoria</w:t>
       </w:r>
     </w:p>
     <w:p>
@@ -4586,6 +6073,38 @@
           <w:color w:val="2E7D32"/>
         </w:rPr>
         <w:t>Si una prueba falla, siga con las demás del bloque cuando pueda: un fallo suelto se arregla más rápido que un bloque entero sin probar.</w:t>
+      </w:r>
+    </w:p>
+    <w:p>
+      <w:pPr>
+        <w:pStyle w:val="Heading2"/>
+      </w:pPr>
+      <w:r>
+        <w:t>Mirar la base de datos</w:t>
+      </w:r>
+    </w:p>
+    <w:p>
+      <w:r>
+        <w:t>Cada prueba dice qué tablas toca. Para verlas, la base del Central es CgPosCentral y la de cada caja, CgPosCaja en su propio equipo. Lo más cómodo es ordenar por la fecha y mirar lo último:</w:t>
+      </w:r>
+    </w:p>
+    <w:p>
+      <w:r>
+        <w:t xml:space="preserve">    SELECT TOP 20 * FROM Ventas ORDER BY Id DESC;</w:t>
+      </w:r>
+    </w:p>
+    <w:p>
+      <w:r>
+        <w:t xml:space="preserve">    SELECT TOP 20 * FROM Auditoria ORDER BY Id DESC;</w:t>
+      </w:r>
+    </w:p>
+    <w:p>
+      <w:r>
+        <w:rPr>
+          <w:i/>
+          <w:color w:val="2E7D32"/>
+        </w:rPr>
+        <w:t>Mire, no toque. Corregir a mano en la base deja el sistema diciendo una cosa y la base otra, y a partir de ahí las pruebas que siguen ya no prueban nada.</w:t>
       </w:r>
     </w:p>
     <w:sectPr>

</xml_diff>

<commit_message>
docs(pruebas): la guía cubre el terminal conectado, el modo sin terminal y el modelo mal escrito
Faltaba probar lo que se acaba de construir: I3 pasa a distinguir el cobro con terminal
conectado de la contingencia, I3b cubre la caja que cobra con un equipo aparte (aprobación
digitada, obligatoria, sin autorización) y I3c comprueba que un modelo inexistente se avisa
y que /salud muestra con qué periféricos quedó la caja.

Co-Authored-By: Claude Opus 5 (1M context) <noreply@anthropic.com>
</commit_message>
<xml_diff>
--- a/scripts/manual/Guia de pruebas CG-POS.docx
+++ b/scripts/manual/Guia de pruebas CG-POS.docx
@@ -2984,7 +2984,7 @@
         <w:pStyle w:val="Heading3"/>
       </w:pPr>
       <w:r>
-        <w:t>I3 · Tarjeta rechazada y aprobación manual</w:t>
+        <w:t>I3 · Tarjeta con el terminal conectado, rechazo y contingencia</w:t>
       </w:r>
     </w:p>
     <w:p>
@@ -2992,6 +2992,14 @@
         <w:pStyle w:val="ListNumber"/>
       </w:pPr>
       <w:r>
+        <w:t>Cobre una venta con tarjeta: la caja le manda el monto al terminal y el cliente paga ahí.</w:t>
+      </w:r>
+    </w:p>
+    <w:p>
+      <w:pPr>
+        <w:pStyle w:val="ListNumber"/>
+      </w:pPr>
+      <w:r>
         <w:t>Haga que el terminal rechace un cobro (o simúlelo) y observe qué pasa.</w:t>
       </w:r>
     </w:p>
@@ -3000,7 +3008,7 @@
         <w:pStyle w:val="ListNumber"/>
       </w:pPr>
       <w:r>
-        <w:t>Si la pasarela no responde, use la aprobación manual con el permiso correspondiente.</w:t>
+        <w:t>Desconecte el terminal de la red y pruebe otra vez: use la aprobación manual con el permiso correspondiente.</w:t>
       </w:r>
     </w:p>
     <w:p>
@@ -3015,7 +3023,7 @@
         <w:rPr>
           <w:color w:val="555555"/>
         </w:rPr>
-        <w:t>El rechazo no cobra la venta ni la daña: se puede reintentar. La aprobación manual queda marcada para conciliarla después contra el lote.</w:t>
+        <w:t>Con el terminal conectado, la aprobación llega sola y nadie digita nada. El rechazo no cobra la venta ni la daña: se puede reintentar. Si el terminal no responde, la aprobación manual pide autorización de supervisor y queda marcada para conciliarla después contra el lote.</w:t>
       </w:r>
     </w:p>
     <w:p>
@@ -3033,6 +3041,153 @@
           <w:sz w:val="19"/>
         </w:rPr>
         <w:t>Caja: OperacionesTerminal · PagosVenta · Auditoria</w:t>
+      </w:r>
+    </w:p>
+    <w:p>
+      <w:r>
+        <w:rPr>
+          <w:color w:val="555555"/>
+          <w:sz w:val="19"/>
+        </w:rPr>
+        <w:t>☐ Pasó          ☐ Falló          Observación: ______________________________________________</w:t>
+      </w:r>
+    </w:p>
+    <w:p>
+      <w:pPr>
+        <w:pStyle w:val="Heading3"/>
+      </w:pPr>
+      <w:r>
+        <w:t>I3b · Caja sin terminal conectado (se cobra en un equipo aparte)</w:t>
+      </w:r>
+    </w:p>
+    <w:p>
+      <w:pPr>
+        <w:pStyle w:val="ListNumber"/>
+      </w:pPr>
+      <w:r>
+        <w:t>En la configuración de la caja, ponga el terminal en «Ninguno» y reinicie el servicio.</w:t>
+      </w:r>
+    </w:p>
+    <w:p>
+      <w:pPr>
+        <w:pStyle w:val="ListNumber"/>
+      </w:pPr>
+      <w:r>
+        <w:t>Cobre una venta con tarjeta: cobre en el verifone aparte y digite el número de aprobación de su volante y los últimos cuatro dígitos.</w:t>
+      </w:r>
+    </w:p>
+    <w:p>
+      <w:pPr>
+        <w:pStyle w:val="ListNumber"/>
+      </w:pPr>
+      <w:r>
+        <w:t>Intente también cobrar con tarjeta sin escribir el número de aprobación.</w:t>
+      </w:r>
+    </w:p>
+    <w:p>
+      <w:r>
+        <w:rPr>
+          <w:b/>
+          <w:color w:val="1B4D3E"/>
+        </w:rPr>
+        <w:t xml:space="preserve">Debe pasar: </w:t>
+      </w:r>
+      <w:r>
+        <w:rPr>
+          <w:color w:val="555555"/>
+        </w:rPr>
+        <w:t>La pantalla no ofrece «Pasar tarjeta» sino el número de aprobación, y no pide autorización de supervisor: en esa caja es la forma normal de cobrar. Sin el número no deja cobrar, porque después no habría con qué cuadrar el turno contra los volantes.</w:t>
+      </w:r>
+    </w:p>
+    <w:p>
+      <w:r>
+        <w:rPr>
+          <w:b/>
+          <w:color w:val="2E7D32"/>
+          <w:sz w:val="19"/>
+        </w:rPr>
+        <w:t xml:space="preserve">Tablas: </w:t>
+      </w:r>
+      <w:r>
+        <w:rPr>
+          <w:color w:val="555555"/>
+          <w:sz w:val="19"/>
+        </w:rPr>
+        <w:t>Caja: Ventas · LineasVenta · PagosVenta (con la aprobación digitada) · Auditoria</w:t>
+      </w:r>
+    </w:p>
+    <w:p>
+      <w:r>
+        <w:rPr>
+          <w:color w:val="555555"/>
+          <w:sz w:val="19"/>
+        </w:rPr>
+        <w:t>☐ Pasó          ☐ Falló          Observación: ______________________________________________</w:t>
+      </w:r>
+    </w:p>
+    <w:p>
+      <w:r>
+        <w:rPr>
+          <w:i/>
+          <w:color w:val="2E7D32"/>
+        </w:rPr>
+        <w:t>Deje el terminal como estaba antes de seguir. Este modo es para las tiendas que cobran con un equipo inalámbrico que no habla con la caja; en «Simulado» el sistema aprueba solo, y eso en una tienda registraría cobros que no ocurrieron.</w:t>
+      </w:r>
+    </w:p>
+    <w:p>
+      <w:pPr>
+        <w:pStyle w:val="Heading3"/>
+      </w:pPr>
+      <w:r>
+        <w:t>I3c · Un terminal mal configurado se nota</w:t>
+      </w:r>
+    </w:p>
+    <w:p>
+      <w:pPr>
+        <w:pStyle w:val="ListNumber"/>
+      </w:pPr>
+      <w:r>
+        <w:t>Escriba un modelo de terminal que no exista (por ejemplo «Azul») y reinicie el servicio.</w:t>
+      </w:r>
+    </w:p>
+    <w:p>
+      <w:pPr>
+        <w:pStyle w:val="ListNumber"/>
+      </w:pPr>
+      <w:r>
+        <w:t>Revise el registro del Agente y la dirección /salud.</w:t>
+      </w:r>
+    </w:p>
+    <w:p>
+      <w:r>
+        <w:rPr>
+          <w:b/>
+          <w:color w:val="1B4D3E"/>
+        </w:rPr>
+        <w:t xml:space="preserve">Debe pasar: </w:t>
+      </w:r>
+      <w:r>
+        <w:rPr>
+          <w:color w:val="555555"/>
+        </w:rPr>
+        <w:t>El log avisa que ese modelo no está implementado y dice cuáles hay. En /salud, la sección Periféricos muestra con qué quedó configurada la caja: impresora, balanza y terminal, y cuáles están simulados.</w:t>
+      </w:r>
+    </w:p>
+    <w:p>
+      <w:r>
+        <w:rPr>
+          <w:b/>
+          <w:color w:val="2E7D32"/>
+          <w:sz w:val="19"/>
+        </w:rPr>
+        <w:t xml:space="preserve">Tablas: </w:t>
+      </w:r>
+      <w:r>
+        <w:rPr>
+          <w:color w:val="555555"/>
+          <w:sz w:val="19"/>
+        </w:rPr>
+        <w:t>Ninguna: es configuración del equipo, no datos</w:t>
       </w:r>
     </w:p>
     <w:p>

</xml_diff>

<commit_message>
refactor(ventas): una sola forma de botar la venta en curso, con motivo opcional
«Limpiar la pantalla» y «Anular una venta» llamaban al mismo código y hacían lo mismo: solo
cambiaba que anular exigía un motivo. Con los dos permisos en el mismo rol, el cajero siempre
usaba limpiar, así que el permiso de anular no protegía nada.

Queda solo limpiar la pantalla. Pide el motivo pero deja seguir sin él: escanear lo que no era
pasa varias veces al día y exigir una explicación cada vez solo consigue que se escriba
cualquier cosa. Si el cajero lo da, o si el supervisor lo escribe al autorizar, queda en la
auditoría como Ventas.PantallaLimpiada.

Desaparecen el permiso Ventas.Anular, su ruta y su botón.

Co-Authored-By: Claude Opus 5 (1M context) <noreply@anthropic.com>
</commit_message>
<xml_diff>
--- a/scripts/manual/Guia de pruebas CG-POS.docx
+++ b/scripts/manual/Guia de pruebas CG-POS.docx
@@ -6,7 +6,6 @@
       <w:pPr>
         <w:jc w:val="center"/>
         <w:rPr>
-          <w:rFonts w:hint="eastAsia"/>
           <w:lang w:val="es-DO"/>
         </w:rPr>
       </w:pPr>
@@ -56,15 +55,13 @@
     <w:p>
       <w:pPr>
         <w:rPr>
-          <w:rFonts w:hint="eastAsia"/>
-          <w:lang w:val="es-DO"/>
-        </w:rPr>
-      </w:pPr>
-    </w:p>
-    <w:p>
-      <w:pPr>
-        <w:rPr>
-          <w:rFonts w:hint="eastAsia"/>
+          <w:lang w:val="es-DO"/>
+        </w:rPr>
+      </w:pPr>
+    </w:p>
+    <w:p>
+      <w:pPr>
+        <w:rPr>
           <w:lang w:val="es-DO"/>
         </w:rPr>
       </w:pPr>
@@ -87,7 +84,6 @@
       <w:pPr>
         <w:pStyle w:val="Listaconvietas"/>
         <w:rPr>
-          <w:rFonts w:hint="eastAsia"/>
           <w:lang w:val="es-DO"/>
         </w:rPr>
       </w:pPr>
@@ -102,7 +98,6 @@
       <w:pPr>
         <w:pStyle w:val="Listaconvietas"/>
         <w:rPr>
-          <w:rFonts w:hint="eastAsia"/>
           <w:lang w:val="es-DO"/>
         </w:rPr>
       </w:pPr>
@@ -116,9 +111,6 @@
     <w:p>
       <w:pPr>
         <w:pStyle w:val="Listaconvietas"/>
-        <w:rPr>
-          <w:rFonts w:hint="eastAsia"/>
-        </w:rPr>
       </w:pPr>
       <w:r>
         <w:rPr>
@@ -134,7 +126,6 @@
       <w:pPr>
         <w:pStyle w:val="Listaconvietas"/>
         <w:rPr>
-          <w:rFonts w:hint="eastAsia"/>
           <w:lang w:val="es-DO"/>
         </w:rPr>
       </w:pPr>
@@ -149,7 +140,6 @@
       <w:pPr>
         <w:pStyle w:val="Listaconvietas"/>
         <w:rPr>
-          <w:rFonts w:hint="eastAsia"/>
           <w:lang w:val="es-DO"/>
         </w:rPr>
       </w:pPr>
@@ -163,7 +153,6 @@
     <w:p>
       <w:pPr>
         <w:rPr>
-          <w:rFonts w:hint="eastAsia"/>
           <w:lang w:val="es-DO"/>
         </w:rPr>
       </w:pPr>
@@ -206,11 +195,6 @@
             <w:tcW w:w="3685" w:type="dxa"/>
           </w:tcPr>
           <w:p>
-            <w:pPr>
-              <w:rPr>
-                <w:rFonts w:hint="eastAsia"/>
-              </w:rPr>
-            </w:pPr>
             <w:r>
               <w:rPr>
                 <w:b/>
@@ -225,11 +209,6 @@
             <w:tcW w:w="5953" w:type="dxa"/>
           </w:tcPr>
           <w:p>
-            <w:pPr>
-              <w:rPr>
-                <w:rFonts w:hint="eastAsia"/>
-              </w:rPr>
-            </w:pPr>
             <w:r>
               <w:rPr>
                 <w:b/>
@@ -248,7 +227,6 @@
           <w:p>
             <w:pPr>
               <w:rPr>
-                <w:rFonts w:hint="eastAsia"/>
                 <w:lang w:val="es-DO"/>
               </w:rPr>
             </w:pPr>
@@ -267,7 +245,6 @@
           <w:p>
             <w:pPr>
               <w:rPr>
-                <w:rFonts w:hint="eastAsia"/>
                 <w:lang w:val="es-DO"/>
               </w:rPr>
             </w:pPr>
@@ -288,7 +265,6 @@
           <w:p>
             <w:pPr>
               <w:rPr>
-                <w:rFonts w:hint="eastAsia"/>
                 <w:lang w:val="es-DO"/>
               </w:rPr>
             </w:pPr>
@@ -307,7 +283,6 @@
           <w:p>
             <w:pPr>
               <w:rPr>
-                <w:rFonts w:hint="eastAsia"/>
                 <w:lang w:val="es-DO"/>
               </w:rPr>
             </w:pPr>
@@ -328,7 +303,6 @@
           <w:p>
             <w:pPr>
               <w:rPr>
-                <w:rFonts w:hint="eastAsia"/>
                 <w:lang w:val="es-DO"/>
               </w:rPr>
             </w:pPr>
@@ -347,7 +321,6 @@
           <w:p>
             <w:pPr>
               <w:rPr>
-                <w:rFonts w:hint="eastAsia"/>
                 <w:lang w:val="es-DO"/>
               </w:rPr>
             </w:pPr>
@@ -368,7 +341,6 @@
           <w:p>
             <w:pPr>
               <w:rPr>
-                <w:rFonts w:hint="eastAsia"/>
                 <w:lang w:val="es-DO"/>
               </w:rPr>
             </w:pPr>
@@ -387,7 +359,6 @@
           <w:p>
             <w:pPr>
               <w:rPr>
-                <w:rFonts w:hint="eastAsia"/>
                 <w:lang w:val="es-DO"/>
               </w:rPr>
             </w:pPr>
@@ -406,11 +377,6 @@
             <w:tcW w:w="3685" w:type="dxa"/>
           </w:tcPr>
           <w:p>
-            <w:pPr>
-              <w:rPr>
-                <w:rFonts w:hint="eastAsia"/>
-              </w:rPr>
-            </w:pPr>
             <w:r>
               <w:t>Un segundo monitor (opcional)</w:t>
             </w:r>
@@ -423,7 +389,6 @@
           <w:p>
             <w:pPr>
               <w:rPr>
-                <w:rFonts w:hint="eastAsia"/>
                 <w:lang w:val="es-DO"/>
               </w:rPr>
             </w:pPr>
@@ -444,7 +409,6 @@
           <w:p>
             <w:pPr>
               <w:rPr>
-                <w:rFonts w:hint="eastAsia"/>
                 <w:lang w:val="es-DO"/>
               </w:rPr>
             </w:pPr>
@@ -463,7 +427,6 @@
           <w:p>
             <w:pPr>
               <w:rPr>
-                <w:rFonts w:hint="eastAsia"/>
                 <w:lang w:val="es-DO"/>
               </w:rPr>
             </w:pPr>
@@ -480,15 +443,13 @@
     <w:p>
       <w:pPr>
         <w:rPr>
-          <w:rFonts w:hint="eastAsia"/>
-          <w:lang w:val="es-DO"/>
-        </w:rPr>
-      </w:pPr>
-    </w:p>
-    <w:p>
-      <w:pPr>
-        <w:rPr>
-          <w:rFonts w:hint="eastAsia"/>
+          <w:lang w:val="es-DO"/>
+        </w:rPr>
+      </w:pPr>
+    </w:p>
+    <w:p>
+      <w:pPr>
+        <w:rPr>
           <w:lang w:val="es-DO"/>
         </w:rPr>
       </w:pPr>
@@ -517,7 +478,6 @@
     <w:p>
       <w:pPr>
         <w:rPr>
-          <w:rFonts w:hint="eastAsia"/>
           <w:lang w:val="es-DO"/>
         </w:rPr>
       </w:pPr>
@@ -546,7 +506,6 @@
       <w:pPr>
         <w:pStyle w:val="Listaconnmeros"/>
         <w:rPr>
-          <w:rFonts w:hint="eastAsia"/>
           <w:lang w:val="es-DO"/>
         </w:rPr>
       </w:pPr>
@@ -561,7 +520,6 @@
       <w:pPr>
         <w:pStyle w:val="Listaconnmeros"/>
         <w:rPr>
-          <w:rFonts w:hint="eastAsia"/>
           <w:lang w:val="es-DO"/>
         </w:rPr>
       </w:pPr>
@@ -575,7 +533,6 @@
     <w:p>
       <w:pPr>
         <w:rPr>
-          <w:rFonts w:hint="eastAsia"/>
           <w:lang w:val="es-DO"/>
         </w:rPr>
       </w:pPr>
@@ -598,7 +555,6 @@
     <w:p>
       <w:pPr>
         <w:rPr>
-          <w:rFonts w:hint="eastAsia"/>
           <w:lang w:val="es-DO"/>
         </w:rPr>
       </w:pPr>
@@ -623,7 +579,6 @@
     <w:p>
       <w:pPr>
         <w:rPr>
-          <w:rFonts w:hint="eastAsia"/>
           <w:lang w:val="es-DO"/>
         </w:rPr>
       </w:pPr>
@@ -657,7 +612,6 @@
       <w:pPr>
         <w:pStyle w:val="Listaconnmeros"/>
         <w:rPr>
-          <w:rFonts w:hint="eastAsia"/>
           <w:lang w:val="es-DO"/>
         </w:rPr>
       </w:pPr>
@@ -671,7 +625,6 @@
     <w:p>
       <w:pPr>
         <w:rPr>
-          <w:rFonts w:hint="eastAsia"/>
           <w:lang w:val="es-DO"/>
         </w:rPr>
       </w:pPr>
@@ -694,7 +647,6 @@
     <w:p>
       <w:pPr>
         <w:rPr>
-          <w:rFonts w:hint="eastAsia"/>
           <w:lang w:val="es-DO"/>
         </w:rPr>
       </w:pPr>
@@ -719,7 +671,6 @@
     <w:p>
       <w:pPr>
         <w:rPr>
-          <w:rFonts w:hint="eastAsia"/>
           <w:lang w:val="es-DO"/>
         </w:rPr>
       </w:pPr>
@@ -753,7 +704,6 @@
       <w:pPr>
         <w:pStyle w:val="Listaconnmeros"/>
         <w:rPr>
-          <w:rFonts w:hint="eastAsia"/>
           <w:lang w:val="es-DO"/>
         </w:rPr>
       </w:pPr>
@@ -768,7 +718,6 @@
       <w:pPr>
         <w:pStyle w:val="Listaconnmeros"/>
         <w:rPr>
-          <w:rFonts w:hint="eastAsia"/>
           <w:lang w:val="es-DO"/>
         </w:rPr>
       </w:pPr>
@@ -783,7 +732,6 @@
       <w:pPr>
         <w:pStyle w:val="Listaconnmeros"/>
         <w:rPr>
-          <w:rFonts w:hint="eastAsia"/>
           <w:lang w:val="es-DO"/>
         </w:rPr>
       </w:pPr>
@@ -797,7 +745,6 @@
     <w:p>
       <w:pPr>
         <w:rPr>
-          <w:rFonts w:hint="eastAsia"/>
           <w:lang w:val="es-DO"/>
         </w:rPr>
       </w:pPr>
@@ -820,7 +767,6 @@
     <w:p>
       <w:pPr>
         <w:rPr>
-          <w:rFonts w:hint="eastAsia"/>
           <w:lang w:val="es-DO"/>
         </w:rPr>
       </w:pPr>
@@ -845,7 +791,6 @@
     <w:p>
       <w:pPr>
         <w:rPr>
-          <w:rFonts w:hint="eastAsia"/>
           <w:lang w:val="es-DO"/>
         </w:rPr>
       </w:pPr>
@@ -885,7 +830,6 @@
       <w:pPr>
         <w:pStyle w:val="Listaconnmeros"/>
         <w:rPr>
-          <w:rFonts w:hint="eastAsia"/>
           <w:lang w:val="es-DO"/>
         </w:rPr>
       </w:pPr>
@@ -899,7 +843,6 @@
     <w:p>
       <w:pPr>
         <w:rPr>
-          <w:rFonts w:hint="eastAsia"/>
           <w:lang w:val="es-DO"/>
         </w:rPr>
       </w:pPr>
@@ -922,7 +865,6 @@
     <w:p>
       <w:pPr>
         <w:rPr>
-          <w:rFonts w:hint="eastAsia"/>
           <w:lang w:val="es-DO"/>
         </w:rPr>
       </w:pPr>
@@ -947,7 +889,6 @@
     <w:p>
       <w:pPr>
         <w:rPr>
-          <w:rFonts w:hint="eastAsia"/>
           <w:lang w:val="es-DO"/>
         </w:rPr>
       </w:pPr>
@@ -981,7 +922,6 @@
       <w:pPr>
         <w:pStyle w:val="Listaconnmeros"/>
         <w:rPr>
-          <w:rFonts w:hint="eastAsia"/>
           <w:lang w:val="es-DO"/>
         </w:rPr>
       </w:pPr>
@@ -1002,7 +942,6 @@
     <w:p>
       <w:pPr>
         <w:rPr>
-          <w:rFonts w:hint="eastAsia"/>
           <w:lang w:val="es-DO"/>
         </w:rPr>
       </w:pPr>
@@ -1025,7 +964,6 @@
     <w:p>
       <w:pPr>
         <w:rPr>
-          <w:rFonts w:hint="eastAsia"/>
           <w:lang w:val="es-DO"/>
         </w:rPr>
       </w:pPr>
@@ -1050,7 +988,6 @@
     <w:p>
       <w:pPr>
         <w:rPr>
-          <w:rFonts w:hint="eastAsia"/>
           <w:lang w:val="es-DO"/>
         </w:rPr>
       </w:pPr>
@@ -1075,7 +1012,6 @@
     <w:p>
       <w:pPr>
         <w:rPr>
-          <w:rFonts w:hint="eastAsia"/>
           <w:lang w:val="es-DO"/>
         </w:rPr>
       </w:pPr>
@@ -1100,7 +1036,6 @@
       <w:pPr>
         <w:pStyle w:val="Listaconnmeros"/>
         <w:rPr>
-          <w:rFonts w:hint="eastAsia"/>
           <w:lang w:val="es-DO"/>
         </w:rPr>
       </w:pPr>
@@ -1127,11 +1062,6 @@
             <w:tcW w:w="2835" w:type="dxa"/>
           </w:tcPr>
           <w:p>
-            <w:pPr>
-              <w:rPr>
-                <w:rFonts w:hint="eastAsia"/>
-              </w:rPr>
-            </w:pPr>
             <w:r>
               <w:rPr>
                 <w:b/>
@@ -1146,11 +1076,6 @@
             <w:tcW w:w="6803" w:type="dxa"/>
           </w:tcPr>
           <w:p>
-            <w:pPr>
-              <w:rPr>
-                <w:rFonts w:hint="eastAsia"/>
-              </w:rPr>
-            </w:pPr>
             <w:r>
               <w:rPr>
                 <w:b/>
@@ -1167,11 +1092,6 @@
             <w:tcW w:w="2835" w:type="dxa"/>
           </w:tcPr>
           <w:p>
-            <w:pPr>
-              <w:rPr>
-                <w:rFonts w:hint="eastAsia"/>
-              </w:rPr>
-            </w:pPr>
             <w:r>
               <w:t>Artículo normal</w:t>
             </w:r>
@@ -1184,7 +1104,6 @@
           <w:p>
             <w:pPr>
               <w:rPr>
-                <w:rFonts w:hint="eastAsia"/>
                 <w:lang w:val="es-DO"/>
               </w:rPr>
             </w:pPr>
@@ -1203,11 +1122,6 @@
             <w:tcW w:w="2835" w:type="dxa"/>
           </w:tcPr>
           <w:p>
-            <w:pPr>
-              <w:rPr>
-                <w:rFonts w:hint="eastAsia"/>
-              </w:rPr>
-            </w:pPr>
             <w:r>
               <w:t>Artículo pesado</w:t>
             </w:r>
@@ -1220,7 +1134,6 @@
           <w:p>
             <w:pPr>
               <w:rPr>
-                <w:rFonts w:hint="eastAsia"/>
                 <w:lang w:val="es-DO"/>
               </w:rPr>
             </w:pPr>
@@ -1239,11 +1152,6 @@
             <w:tcW w:w="2835" w:type="dxa"/>
           </w:tcPr>
           <w:p>
-            <w:pPr>
-              <w:rPr>
-                <w:rFonts w:hint="eastAsia"/>
-              </w:rPr>
-            </w:pPr>
             <w:r>
               <w:t>Artículo serializado</w:t>
             </w:r>
@@ -1256,7 +1164,6 @@
           <w:p>
             <w:pPr>
               <w:rPr>
-                <w:rFonts w:hint="eastAsia"/>
                 <w:lang w:val="es-DO"/>
               </w:rPr>
             </w:pPr>
@@ -1275,11 +1182,6 @@
             <w:tcW w:w="2835" w:type="dxa"/>
           </w:tcPr>
           <w:p>
-            <w:pPr>
-              <w:rPr>
-                <w:rFonts w:hint="eastAsia"/>
-              </w:rPr>
-            </w:pPr>
             <w:r>
               <w:t>Combo</w:t>
             </w:r>
@@ -1292,7 +1194,6 @@
           <w:p>
             <w:pPr>
               <w:rPr>
-                <w:rFonts w:hint="eastAsia"/>
                 <w:lang w:val="es-DO"/>
               </w:rPr>
             </w:pPr>
@@ -1313,7 +1214,6 @@
           <w:p>
             <w:pPr>
               <w:rPr>
-                <w:rFonts w:hint="eastAsia"/>
                 <w:lang w:val="es-DO"/>
               </w:rPr>
             </w:pPr>
@@ -1332,7 +1232,6 @@
           <w:p>
             <w:pPr>
               <w:rPr>
-                <w:rFonts w:hint="eastAsia"/>
                 <w:lang w:val="es-DO"/>
               </w:rPr>
             </w:pPr>
@@ -1349,15 +1248,13 @@
     <w:p>
       <w:pPr>
         <w:rPr>
-          <w:rFonts w:hint="eastAsia"/>
-          <w:lang w:val="es-DO"/>
-        </w:rPr>
-      </w:pPr>
-    </w:p>
-    <w:p>
-      <w:pPr>
-        <w:rPr>
-          <w:rFonts w:hint="eastAsia"/>
+          <w:lang w:val="es-DO"/>
+        </w:rPr>
+      </w:pPr>
+    </w:p>
+    <w:p>
+      <w:pPr>
+        <w:rPr>
           <w:lang w:val="es-DO"/>
         </w:rPr>
       </w:pPr>
@@ -1380,7 +1277,6 @@
     <w:p>
       <w:pPr>
         <w:rPr>
-          <w:rFonts w:hint="eastAsia"/>
           <w:lang w:val="es-DO"/>
         </w:rPr>
       </w:pPr>
@@ -1405,17 +1301,25 @@
     <w:p>
       <w:pPr>
         <w:rPr>
-          <w:rFonts w:hint="eastAsia"/>
-          <w:lang w:val="es-DO"/>
-        </w:rPr>
-      </w:pPr>
-      <w:r>
-        <w:rPr>
-          <w:color w:val="555555"/>
-          <w:sz w:val="19"/>
-          <w:lang w:val="es-DO"/>
-        </w:rPr>
-        <w:t>☐ Pasó          ☐ Falló          Observación: ______________________________________________</w:t>
+          <w:lang w:val="es-DO"/>
+        </w:rPr>
+      </w:pPr>
+      <w:r>
+        <w:rPr>
+          <w:color w:val="555555"/>
+          <w:sz w:val="19"/>
+          <w:highlight w:val="yellow"/>
+          <w:lang w:val="es-DO"/>
+        </w:rPr>
+        <w:t>☐</w:t>
+      </w:r>
+      <w:r>
+        <w:rPr>
+          <w:color w:val="555555"/>
+          <w:sz w:val="19"/>
+          <w:lang w:val="es-DO"/>
+        </w:rPr>
+        <w:t xml:space="preserve"> Pasó          ☐ Falló          Observación: ______________________________________________</w:t>
       </w:r>
     </w:p>
     <w:p>
@@ -1430,7 +1334,6 @@
       <w:pPr>
         <w:pStyle w:val="Listaconnmeros"/>
         <w:rPr>
-          <w:rFonts w:hint="eastAsia"/>
           <w:lang w:val="es-DO"/>
         </w:rPr>
       </w:pPr>
@@ -1444,7 +1347,6 @@
     <w:p>
       <w:pPr>
         <w:rPr>
-          <w:rFonts w:hint="eastAsia"/>
           <w:lang w:val="es-DO"/>
         </w:rPr>
       </w:pPr>
@@ -1467,7 +1369,6 @@
     <w:p>
       <w:pPr>
         <w:rPr>
-          <w:rFonts w:hint="eastAsia"/>
           <w:lang w:val="es-DO"/>
         </w:rPr>
       </w:pPr>
@@ -1492,17 +1393,25 @@
     <w:p>
       <w:pPr>
         <w:rPr>
-          <w:rFonts w:hint="eastAsia"/>
-          <w:lang w:val="es-DO"/>
-        </w:rPr>
-      </w:pPr>
-      <w:r>
-        <w:rPr>
-          <w:color w:val="555555"/>
-          <w:sz w:val="19"/>
-          <w:lang w:val="es-DO"/>
-        </w:rPr>
-        <w:t>☐ Pasó          ☐ Falló          Observación: ______________________________________________</w:t>
+          <w:lang w:val="es-DO"/>
+        </w:rPr>
+      </w:pPr>
+      <w:r>
+        <w:rPr>
+          <w:color w:val="555555"/>
+          <w:sz w:val="19"/>
+          <w:highlight w:val="yellow"/>
+          <w:lang w:val="es-DO"/>
+        </w:rPr>
+        <w:t>☐</w:t>
+      </w:r>
+      <w:r>
+        <w:rPr>
+          <w:color w:val="555555"/>
+          <w:sz w:val="19"/>
+          <w:lang w:val="es-DO"/>
+        </w:rPr>
+        <w:t xml:space="preserve"> Pasó          ☐ Falló          Observación: ______________________________________________</w:t>
       </w:r>
     </w:p>
     <w:p>
@@ -1523,7 +1432,6 @@
       <w:pPr>
         <w:pStyle w:val="Listaconnmeros"/>
         <w:rPr>
-          <w:rFonts w:hint="eastAsia"/>
           <w:lang w:val="es-DO"/>
         </w:rPr>
       </w:pPr>
@@ -1538,7 +1446,6 @@
       <w:pPr>
         <w:pStyle w:val="Listaconnmeros"/>
         <w:rPr>
-          <w:rFonts w:hint="eastAsia"/>
           <w:lang w:val="es-DO"/>
         </w:rPr>
       </w:pPr>
@@ -1553,7 +1460,6 @@
     <w:p>
       <w:pPr>
         <w:rPr>
-          <w:rFonts w:hint="eastAsia"/>
           <w:lang w:val="es-DO"/>
         </w:rPr>
       </w:pPr>
@@ -1576,7 +1482,6 @@
     <w:p>
       <w:pPr>
         <w:rPr>
-          <w:rFonts w:hint="eastAsia"/>
           <w:lang w:val="es-DO"/>
         </w:rPr>
       </w:pPr>
@@ -1601,7 +1506,6 @@
     <w:p>
       <w:pPr>
         <w:rPr>
-          <w:rFonts w:hint="eastAsia"/>
           <w:lang w:val="es-DO"/>
         </w:rPr>
       </w:pPr>
@@ -1632,7 +1536,6 @@
       <w:pPr>
         <w:pStyle w:val="Listaconnmeros"/>
         <w:rPr>
-          <w:rFonts w:hint="eastAsia"/>
           <w:lang w:val="es-DO"/>
         </w:rPr>
       </w:pPr>
@@ -1646,7 +1549,6 @@
     <w:p>
       <w:pPr>
         <w:rPr>
-          <w:rFonts w:hint="eastAsia"/>
           <w:lang w:val="es-DO"/>
         </w:rPr>
       </w:pPr>
@@ -1669,7 +1571,6 @@
     <w:p>
       <w:pPr>
         <w:rPr>
-          <w:rFonts w:hint="eastAsia"/>
           <w:lang w:val="es-DO"/>
         </w:rPr>
       </w:pPr>
@@ -1694,7 +1595,6 @@
     <w:p>
       <w:pPr>
         <w:rPr>
-          <w:rFonts w:hint="eastAsia"/>
           <w:lang w:val="es-DO"/>
         </w:rPr>
       </w:pPr>
@@ -1719,7 +1619,6 @@
       <w:pPr>
         <w:pStyle w:val="Listaconnmeros"/>
         <w:rPr>
-          <w:rFonts w:hint="eastAsia"/>
           <w:lang w:val="es-DO"/>
         </w:rPr>
       </w:pPr>
@@ -1733,7 +1632,6 @@
     <w:p>
       <w:pPr>
         <w:rPr>
-          <w:rFonts w:hint="eastAsia"/>
           <w:lang w:val="es-DO"/>
         </w:rPr>
       </w:pPr>
@@ -1756,7 +1654,6 @@
     <w:p>
       <w:pPr>
         <w:rPr>
-          <w:rFonts w:hint="eastAsia"/>
           <w:lang w:val="es-DO"/>
         </w:rPr>
       </w:pPr>
@@ -1781,7 +1678,6 @@
     <w:p>
       <w:pPr>
         <w:rPr>
-          <w:rFonts w:hint="eastAsia"/>
           <w:lang w:val="es-DO"/>
         </w:rPr>
       </w:pPr>
@@ -1797,7 +1693,6 @@
     <w:p>
       <w:pPr>
         <w:rPr>
-          <w:rFonts w:hint="eastAsia"/>
           <w:lang w:val="es-DO"/>
         </w:rPr>
       </w:pPr>
@@ -1835,7 +1730,6 @@
       <w:pPr>
         <w:pStyle w:val="Listaconnmeros"/>
         <w:rPr>
-          <w:rFonts w:hint="eastAsia"/>
           <w:lang w:val="es-DO"/>
         </w:rPr>
       </w:pPr>
@@ -1849,7 +1743,6 @@
     <w:p>
       <w:pPr>
         <w:rPr>
-          <w:rFonts w:hint="eastAsia"/>
           <w:lang w:val="es-DO"/>
         </w:rPr>
       </w:pPr>
@@ -1872,7 +1765,6 @@
     <w:p>
       <w:pPr>
         <w:rPr>
-          <w:rFonts w:hint="eastAsia"/>
           <w:lang w:val="es-DO"/>
         </w:rPr>
       </w:pPr>
@@ -1897,7 +1789,6 @@
     <w:p>
       <w:pPr>
         <w:rPr>
-          <w:rFonts w:hint="eastAsia"/>
           <w:lang w:val="es-DO"/>
         </w:rPr>
       </w:pPr>
@@ -1928,7 +1819,6 @@
       <w:pPr>
         <w:pStyle w:val="Listaconnmeros"/>
         <w:rPr>
-          <w:rFonts w:hint="eastAsia"/>
           <w:lang w:val="es-DO"/>
         </w:rPr>
       </w:pPr>
@@ -1942,7 +1832,6 @@
     <w:p>
       <w:pPr>
         <w:rPr>
-          <w:rFonts w:hint="eastAsia"/>
           <w:lang w:val="es-DO"/>
         </w:rPr>
       </w:pPr>
@@ -1965,7 +1854,6 @@
     <w:p>
       <w:pPr>
         <w:rPr>
-          <w:rFonts w:hint="eastAsia"/>
           <w:lang w:val="es-DO"/>
         </w:rPr>
       </w:pPr>
@@ -1990,7 +1878,6 @@
     <w:p>
       <w:pPr>
         <w:rPr>
-          <w:rFonts w:hint="eastAsia"/>
           <w:lang w:val="es-DO"/>
         </w:rPr>
       </w:pPr>
@@ -2021,7 +1908,6 @@
       <w:pPr>
         <w:pStyle w:val="Listaconnmeros"/>
         <w:rPr>
-          <w:rFonts w:hint="eastAsia"/>
           <w:lang w:val="es-DO"/>
         </w:rPr>
       </w:pPr>
@@ -2036,7 +1922,6 @@
       <w:pPr>
         <w:pStyle w:val="Listaconnmeros"/>
         <w:rPr>
-          <w:rFonts w:hint="eastAsia"/>
           <w:lang w:val="es-DO"/>
         </w:rPr>
       </w:pPr>
@@ -2050,7 +1935,6 @@
     <w:p>
       <w:pPr>
         <w:rPr>
-          <w:rFonts w:hint="eastAsia"/>
           <w:lang w:val="es-DO"/>
         </w:rPr>
       </w:pPr>
@@ -2073,7 +1957,6 @@
     <w:p>
       <w:pPr>
         <w:rPr>
-          <w:rFonts w:hint="eastAsia"/>
           <w:lang w:val="es-DO"/>
         </w:rPr>
       </w:pPr>
@@ -2098,7 +1981,6 @@
     <w:p>
       <w:pPr>
         <w:rPr>
-          <w:rFonts w:hint="eastAsia"/>
           <w:lang w:val="es-DO"/>
         </w:rPr>
       </w:pPr>
@@ -2129,7 +2011,6 @@
       <w:pPr>
         <w:pStyle w:val="Listaconnmeros"/>
         <w:rPr>
-          <w:rFonts w:hint="eastAsia"/>
           <w:lang w:val="es-DO"/>
         </w:rPr>
       </w:pPr>
@@ -2144,7 +2025,6 @@
       <w:pPr>
         <w:pStyle w:val="Listaconnmeros"/>
         <w:rPr>
-          <w:rFonts w:hint="eastAsia"/>
           <w:lang w:val="es-DO"/>
         </w:rPr>
       </w:pPr>
@@ -2158,7 +2038,6 @@
     <w:p>
       <w:pPr>
         <w:rPr>
-          <w:rFonts w:hint="eastAsia"/>
           <w:lang w:val="es-DO"/>
         </w:rPr>
       </w:pPr>
@@ -2181,7 +2060,6 @@
     <w:p>
       <w:pPr>
         <w:rPr>
-          <w:rFonts w:hint="eastAsia"/>
           <w:lang w:val="es-DO"/>
         </w:rPr>
       </w:pPr>
@@ -2206,7 +2084,6 @@
     <w:p>
       <w:pPr>
         <w:rPr>
-          <w:rFonts w:hint="eastAsia"/>
           <w:lang w:val="es-DO"/>
         </w:rPr>
       </w:pPr>
@@ -2222,7 +2099,6 @@
     <w:p>
       <w:pPr>
         <w:rPr>
-          <w:rFonts w:hint="eastAsia"/>
           <w:lang w:val="es-DO"/>
         </w:rPr>
       </w:pPr>
@@ -2260,7 +2136,6 @@
       <w:pPr>
         <w:pStyle w:val="Listaconnmeros"/>
         <w:rPr>
-          <w:rFonts w:hint="eastAsia"/>
           <w:lang w:val="es-DO"/>
         </w:rPr>
       </w:pPr>
@@ -2275,7 +2150,6 @@
       <w:pPr>
         <w:pStyle w:val="Listaconnmeros"/>
         <w:rPr>
-          <w:rFonts w:hint="eastAsia"/>
           <w:lang w:val="es-DO"/>
         </w:rPr>
       </w:pPr>
@@ -2289,7 +2163,6 @@
     <w:p>
       <w:pPr>
         <w:rPr>
-          <w:rFonts w:hint="eastAsia"/>
           <w:lang w:val="es-DO"/>
         </w:rPr>
       </w:pPr>
@@ -2312,7 +2185,6 @@
     <w:p>
       <w:pPr>
         <w:rPr>
-          <w:rFonts w:hint="eastAsia"/>
           <w:lang w:val="es-DO"/>
         </w:rPr>
       </w:pPr>
@@ -2337,7 +2209,6 @@
     <w:p>
       <w:pPr>
         <w:rPr>
-          <w:rFonts w:hint="eastAsia"/>
           <w:lang w:val="es-DO"/>
         </w:rPr>
       </w:pPr>
@@ -2368,7 +2239,6 @@
       <w:pPr>
         <w:pStyle w:val="Listaconnmeros"/>
         <w:rPr>
-          <w:rFonts w:hint="eastAsia"/>
           <w:lang w:val="es-DO"/>
         </w:rPr>
       </w:pPr>
@@ -2383,7 +2253,6 @@
       <w:pPr>
         <w:pStyle w:val="Listaconnmeros"/>
         <w:rPr>
-          <w:rFonts w:hint="eastAsia"/>
           <w:lang w:val="es-DO"/>
         </w:rPr>
       </w:pPr>
@@ -2397,7 +2266,6 @@
     <w:p>
       <w:pPr>
         <w:rPr>
-          <w:rFonts w:hint="eastAsia"/>
           <w:lang w:val="es-DO"/>
         </w:rPr>
       </w:pPr>
@@ -2420,7 +2288,6 @@
     <w:p>
       <w:pPr>
         <w:rPr>
-          <w:rFonts w:hint="eastAsia"/>
           <w:lang w:val="es-DO"/>
         </w:rPr>
       </w:pPr>
@@ -2445,7 +2312,6 @@
     <w:p>
       <w:pPr>
         <w:rPr>
-          <w:rFonts w:hint="eastAsia"/>
           <w:lang w:val="es-DO"/>
         </w:rPr>
       </w:pPr>
@@ -2476,7 +2342,6 @@
       <w:pPr>
         <w:pStyle w:val="Listaconnmeros"/>
         <w:rPr>
-          <w:rFonts w:hint="eastAsia"/>
           <w:lang w:val="es-DO"/>
         </w:rPr>
       </w:pPr>
@@ -2491,7 +2356,6 @@
       <w:pPr>
         <w:pStyle w:val="Listaconnmeros"/>
         <w:rPr>
-          <w:rFonts w:hint="eastAsia"/>
           <w:lang w:val="es-DO"/>
         </w:rPr>
       </w:pPr>
@@ -2505,7 +2369,6 @@
     <w:p>
       <w:pPr>
         <w:rPr>
-          <w:rFonts w:hint="eastAsia"/>
           <w:lang w:val="es-DO"/>
         </w:rPr>
       </w:pPr>
@@ -2528,7 +2391,6 @@
     <w:p>
       <w:pPr>
         <w:rPr>
-          <w:rFonts w:hint="eastAsia"/>
           <w:lang w:val="es-DO"/>
         </w:rPr>
       </w:pPr>
@@ -2553,7 +2415,6 @@
     <w:p>
       <w:pPr>
         <w:rPr>
-          <w:rFonts w:hint="eastAsia"/>
           <w:lang w:val="es-DO"/>
         </w:rPr>
       </w:pPr>
@@ -2584,7 +2445,6 @@
       <w:pPr>
         <w:pStyle w:val="Listaconnmeros"/>
         <w:rPr>
-          <w:rFonts w:hint="eastAsia"/>
           <w:lang w:val="es-DO"/>
         </w:rPr>
       </w:pPr>
@@ -2598,7 +2458,6 @@
     <w:p>
       <w:pPr>
         <w:rPr>
-          <w:rFonts w:hint="eastAsia"/>
           <w:lang w:val="es-DO"/>
         </w:rPr>
       </w:pPr>
@@ -2621,7 +2480,6 @@
     <w:p>
       <w:pPr>
         <w:rPr>
-          <w:rFonts w:hint="eastAsia"/>
           <w:lang w:val="es-DO"/>
         </w:rPr>
       </w:pPr>
@@ -2646,7 +2504,6 @@
     <w:p>
       <w:pPr>
         <w:rPr>
-          <w:rFonts w:hint="eastAsia"/>
           <w:lang w:val="es-DO"/>
         </w:rPr>
       </w:pPr>
@@ -2677,7 +2534,6 @@
       <w:pPr>
         <w:pStyle w:val="Listaconnmeros"/>
         <w:rPr>
-          <w:rFonts w:hint="eastAsia"/>
           <w:lang w:val="es-DO"/>
         </w:rPr>
       </w:pPr>
@@ -2692,7 +2548,6 @@
       <w:pPr>
         <w:pStyle w:val="Listaconnmeros"/>
         <w:rPr>
-          <w:rFonts w:hint="eastAsia"/>
           <w:lang w:val="es-DO"/>
         </w:rPr>
       </w:pPr>
@@ -2706,7 +2561,6 @@
     <w:p>
       <w:pPr>
         <w:rPr>
-          <w:rFonts w:hint="eastAsia"/>
           <w:lang w:val="es-DO"/>
         </w:rPr>
       </w:pPr>
@@ -2729,7 +2583,6 @@
     <w:p>
       <w:pPr>
         <w:rPr>
-          <w:rFonts w:hint="eastAsia"/>
           <w:lang w:val="es-DO"/>
         </w:rPr>
       </w:pPr>
@@ -2754,7 +2607,6 @@
     <w:p>
       <w:pPr>
         <w:rPr>
-          <w:rFonts w:hint="eastAsia"/>
           <w:lang w:val="es-DO"/>
         </w:rPr>
       </w:pPr>
@@ -2771,7 +2623,6 @@
     <w:p>
       <w:pPr>
         <w:rPr>
-          <w:rFonts w:hint="eastAsia"/>
           <w:lang w:val="es-DO"/>
         </w:rPr>
       </w:pPr>
@@ -2809,7 +2660,6 @@
       <w:pPr>
         <w:pStyle w:val="Listaconnmeros"/>
         <w:rPr>
-          <w:rFonts w:hint="eastAsia"/>
           <w:lang w:val="es-DO"/>
         </w:rPr>
       </w:pPr>
@@ -2823,7 +2673,6 @@
     <w:p>
       <w:pPr>
         <w:rPr>
-          <w:rFonts w:hint="eastAsia"/>
           <w:lang w:val="es-DO"/>
         </w:rPr>
       </w:pPr>
@@ -2846,7 +2695,6 @@
     <w:p>
       <w:pPr>
         <w:rPr>
-          <w:rFonts w:hint="eastAsia"/>
           <w:lang w:val="es-DO"/>
         </w:rPr>
       </w:pPr>
@@ -2871,7 +2719,6 @@
     <w:p>
       <w:pPr>
         <w:rPr>
-          <w:rFonts w:hint="eastAsia"/>
           <w:lang w:val="es-DO"/>
         </w:rPr>
       </w:pPr>
@@ -2902,7 +2749,6 @@
       <w:pPr>
         <w:pStyle w:val="Listaconnmeros"/>
         <w:rPr>
-          <w:rFonts w:hint="eastAsia"/>
           <w:lang w:val="es-DO"/>
         </w:rPr>
       </w:pPr>
@@ -2916,7 +2762,6 @@
     <w:p>
       <w:pPr>
         <w:rPr>
-          <w:rFonts w:hint="eastAsia"/>
           <w:lang w:val="es-DO"/>
         </w:rPr>
       </w:pPr>
@@ -2939,7 +2784,6 @@
     <w:p>
       <w:pPr>
         <w:rPr>
-          <w:rFonts w:hint="eastAsia"/>
           <w:lang w:val="es-DO"/>
         </w:rPr>
       </w:pPr>
@@ -2964,7 +2808,6 @@
     <w:p>
       <w:pPr>
         <w:rPr>
-          <w:rFonts w:hint="eastAsia"/>
           <w:lang w:val="es-DO"/>
         </w:rPr>
       </w:pPr>
@@ -2995,7 +2838,6 @@
       <w:pPr>
         <w:pStyle w:val="Listaconnmeros"/>
         <w:rPr>
-          <w:rFonts w:hint="eastAsia"/>
           <w:lang w:val="es-DO"/>
         </w:rPr>
       </w:pPr>
@@ -3009,7 +2851,6 @@
     <w:p>
       <w:pPr>
         <w:rPr>
-          <w:rFonts w:hint="eastAsia"/>
           <w:lang w:val="es-DO"/>
         </w:rPr>
       </w:pPr>
@@ -3032,7 +2873,6 @@
     <w:p>
       <w:pPr>
         <w:rPr>
-          <w:rFonts w:hint="eastAsia"/>
           <w:lang w:val="es-DO"/>
         </w:rPr>
       </w:pPr>
@@ -3057,7 +2897,6 @@
     <w:p>
       <w:pPr>
         <w:rPr>
-          <w:rFonts w:hint="eastAsia"/>
           <w:lang w:val="es-DO"/>
         </w:rPr>
       </w:pPr>
@@ -3073,7 +2912,6 @@
     <w:p>
       <w:pPr>
         <w:rPr>
-          <w:rFonts w:hint="eastAsia"/>
           <w:lang w:val="es-DO"/>
         </w:rPr>
       </w:pPr>
@@ -3111,7 +2949,6 @@
       <w:pPr>
         <w:pStyle w:val="Listaconnmeros"/>
         <w:rPr>
-          <w:rFonts w:hint="eastAsia"/>
           <w:lang w:val="es-DO"/>
         </w:rPr>
       </w:pPr>
@@ -3125,7 +2962,6 @@
     <w:p>
       <w:pPr>
         <w:rPr>
-          <w:rFonts w:hint="eastAsia"/>
           <w:lang w:val="es-DO"/>
         </w:rPr>
       </w:pPr>
@@ -3148,7 +2984,6 @@
     <w:p>
       <w:pPr>
         <w:rPr>
-          <w:rFonts w:hint="eastAsia"/>
           <w:lang w:val="es-DO"/>
         </w:rPr>
       </w:pPr>
@@ -3173,7 +3008,6 @@
     <w:p>
       <w:pPr>
         <w:rPr>
-          <w:rFonts w:hint="eastAsia"/>
           <w:lang w:val="es-DO"/>
         </w:rPr>
       </w:pPr>
@@ -3203,9 +3037,6 @@
     <w:p>
       <w:pPr>
         <w:pStyle w:val="Listaconnmeros"/>
-        <w:rPr>
-          <w:rFonts w:hint="eastAsia"/>
-        </w:rPr>
       </w:pPr>
       <w:r>
         <w:t>Escanee el artículo serializado.</w:t>
@@ -3215,7 +3046,6 @@
       <w:pPr>
         <w:pStyle w:val="Listaconnmeros"/>
         <w:rPr>
-          <w:rFonts w:hint="eastAsia"/>
           <w:lang w:val="es-DO"/>
         </w:rPr>
       </w:pPr>
@@ -3229,7 +3059,6 @@
     <w:p>
       <w:pPr>
         <w:rPr>
-          <w:rFonts w:hint="eastAsia"/>
           <w:lang w:val="es-DO"/>
         </w:rPr>
       </w:pPr>
@@ -3252,7 +3081,6 @@
     <w:p>
       <w:pPr>
         <w:rPr>
-          <w:rFonts w:hint="eastAsia"/>
           <w:lang w:val="es-DO"/>
         </w:rPr>
       </w:pPr>
@@ -3275,11 +3103,6 @@
       </w:r>
     </w:p>
     <w:p>
-      <w:pPr>
-        <w:rPr>
-          <w:rFonts w:hint="eastAsia"/>
-        </w:rPr>
-      </w:pPr>
       <w:r>
         <w:rPr>
           <w:color w:val="555555"/>
@@ -3299,9 +3122,6 @@
     <w:p>
       <w:pPr>
         <w:pStyle w:val="Listaconnmeros"/>
-        <w:rPr>
-          <w:rFonts w:hint="eastAsia"/>
-        </w:rPr>
       </w:pPr>
       <w:r>
         <w:t>Venda el combo.</w:t>
@@ -3310,7 +3130,6 @@
     <w:p>
       <w:pPr>
         <w:rPr>
-          <w:rFonts w:hint="eastAsia"/>
           <w:lang w:val="es-DO"/>
         </w:rPr>
       </w:pPr>
@@ -3333,7 +3152,6 @@
     <w:p>
       <w:pPr>
         <w:rPr>
-          <w:rFonts w:hint="eastAsia"/>
           <w:lang w:val="es-DO"/>
         </w:rPr>
       </w:pPr>
@@ -3358,7 +3176,6 @@
     <w:p>
       <w:pPr>
         <w:rPr>
-          <w:rFonts w:hint="eastAsia"/>
           <w:lang w:val="es-DO"/>
         </w:rPr>
       </w:pPr>
@@ -3389,7 +3206,6 @@
       <w:pPr>
         <w:pStyle w:val="Listaconnmeros"/>
         <w:rPr>
-          <w:rFonts w:hint="eastAsia"/>
           <w:lang w:val="es-DO"/>
         </w:rPr>
       </w:pPr>
@@ -3404,7 +3220,6 @@
       <w:pPr>
         <w:pStyle w:val="Listaconnmeros"/>
         <w:rPr>
-          <w:rFonts w:hint="eastAsia"/>
           <w:lang w:val="es-DO"/>
         </w:rPr>
       </w:pPr>
@@ -3418,7 +3233,6 @@
     <w:p>
       <w:pPr>
         <w:rPr>
-          <w:rFonts w:hint="eastAsia"/>
           <w:lang w:val="es-DO"/>
         </w:rPr>
       </w:pPr>
@@ -3441,7 +3255,6 @@
     <w:p>
       <w:pPr>
         <w:rPr>
-          <w:rFonts w:hint="eastAsia"/>
           <w:lang w:val="es-DO"/>
         </w:rPr>
       </w:pPr>
@@ -3466,7 +3279,6 @@
     <w:p>
       <w:pPr>
         <w:rPr>
-          <w:rFonts w:hint="eastAsia"/>
           <w:lang w:val="es-DO"/>
         </w:rPr>
       </w:pPr>
@@ -3482,7 +3294,6 @@
     <w:p>
       <w:pPr>
         <w:rPr>
-          <w:rFonts w:hint="eastAsia"/>
           <w:lang w:val="es-DO"/>
         </w:rPr>
       </w:pPr>
@@ -3520,7 +3331,6 @@
       <w:pPr>
         <w:pStyle w:val="Listaconnmeros"/>
         <w:rPr>
-          <w:rFonts w:hint="eastAsia"/>
           <w:lang w:val="es-DO"/>
         </w:rPr>
       </w:pPr>
@@ -3534,7 +3344,6 @@
     <w:p>
       <w:pPr>
         <w:rPr>
-          <w:rFonts w:hint="eastAsia"/>
           <w:lang w:val="es-DO"/>
         </w:rPr>
       </w:pPr>
@@ -3557,7 +3366,6 @@
     <w:p>
       <w:pPr>
         <w:rPr>
-          <w:rFonts w:hint="eastAsia"/>
           <w:lang w:val="es-DO"/>
         </w:rPr>
       </w:pPr>
@@ -3582,7 +3390,6 @@
     <w:p>
       <w:pPr>
         <w:rPr>
-          <w:rFonts w:hint="eastAsia"/>
           <w:lang w:val="es-DO"/>
         </w:rPr>
       </w:pPr>
@@ -3613,7 +3420,6 @@
       <w:pPr>
         <w:pStyle w:val="Listaconnmeros"/>
         <w:rPr>
-          <w:rFonts w:hint="eastAsia"/>
           <w:lang w:val="es-DO"/>
         </w:rPr>
       </w:pPr>
@@ -3628,7 +3434,6 @@
       <w:pPr>
         <w:pStyle w:val="Listaconnmeros"/>
         <w:rPr>
-          <w:rFonts w:hint="eastAsia"/>
           <w:lang w:val="es-DO"/>
         </w:rPr>
       </w:pPr>
@@ -3642,7 +3447,6 @@
     <w:p>
       <w:pPr>
         <w:rPr>
-          <w:rFonts w:hint="eastAsia"/>
           <w:lang w:val="es-DO"/>
         </w:rPr>
       </w:pPr>
@@ -3665,7 +3469,6 @@
     <w:p>
       <w:pPr>
         <w:rPr>
-          <w:rFonts w:hint="eastAsia"/>
           <w:lang w:val="es-DO"/>
         </w:rPr>
       </w:pPr>
@@ -3690,7 +3493,6 @@
     <w:p>
       <w:pPr>
         <w:rPr>
-          <w:rFonts w:hint="eastAsia"/>
           <w:lang w:val="es-DO"/>
         </w:rPr>
       </w:pPr>
@@ -3721,7 +3523,6 @@
       <w:pPr>
         <w:pStyle w:val="Listaconnmeros"/>
         <w:rPr>
-          <w:rFonts w:hint="eastAsia"/>
           <w:lang w:val="es-DO"/>
         </w:rPr>
       </w:pPr>
@@ -3736,7 +3537,6 @@
       <w:pPr>
         <w:pStyle w:val="Listaconnmeros"/>
         <w:rPr>
-          <w:rFonts w:hint="eastAsia"/>
           <w:lang w:val="es-DO"/>
         </w:rPr>
       </w:pPr>
@@ -3750,7 +3550,6 @@
     <w:p>
       <w:pPr>
         <w:rPr>
-          <w:rFonts w:hint="eastAsia"/>
           <w:lang w:val="es-DO"/>
         </w:rPr>
       </w:pPr>
@@ -3773,7 +3572,6 @@
     <w:p>
       <w:pPr>
         <w:rPr>
-          <w:rFonts w:hint="eastAsia"/>
           <w:lang w:val="es-DO"/>
         </w:rPr>
       </w:pPr>
@@ -3798,7 +3596,6 @@
     <w:p>
       <w:pPr>
         <w:rPr>
-          <w:rFonts w:hint="eastAsia"/>
           <w:lang w:val="es-DO"/>
         </w:rPr>
       </w:pPr>
@@ -3829,7 +3626,6 @@
       <w:pPr>
         <w:pStyle w:val="Listaconnmeros"/>
         <w:rPr>
-          <w:rFonts w:hint="eastAsia"/>
           <w:lang w:val="es-DO"/>
         </w:rPr>
       </w:pPr>
@@ -3843,7 +3639,6 @@
     <w:p>
       <w:pPr>
         <w:rPr>
-          <w:rFonts w:hint="eastAsia"/>
           <w:lang w:val="es-DO"/>
         </w:rPr>
       </w:pPr>
@@ -3866,7 +3661,6 @@
     <w:p>
       <w:pPr>
         <w:rPr>
-          <w:rFonts w:hint="eastAsia"/>
           <w:lang w:val="es-DO"/>
         </w:rPr>
       </w:pPr>
@@ -3891,7 +3685,6 @@
     <w:p>
       <w:pPr>
         <w:rPr>
-          <w:rFonts w:hint="eastAsia"/>
           <w:lang w:val="es-DO"/>
         </w:rPr>
       </w:pPr>
@@ -3922,7 +3715,6 @@
       <w:pPr>
         <w:pStyle w:val="Listaconnmeros"/>
         <w:rPr>
-          <w:rFonts w:hint="eastAsia"/>
           <w:lang w:val="es-DO"/>
         </w:rPr>
       </w:pPr>
@@ -3936,7 +3728,6 @@
     <w:p>
       <w:pPr>
         <w:rPr>
-          <w:rFonts w:hint="eastAsia"/>
           <w:lang w:val="es-DO"/>
         </w:rPr>
       </w:pPr>
@@ -3959,7 +3750,6 @@
     <w:p>
       <w:pPr>
         <w:rPr>
-          <w:rFonts w:hint="eastAsia"/>
           <w:lang w:val="es-DO"/>
         </w:rPr>
       </w:pPr>
@@ -3984,7 +3774,6 @@
     <w:p>
       <w:pPr>
         <w:rPr>
-          <w:rFonts w:hint="eastAsia"/>
           <w:lang w:val="es-DO"/>
         </w:rPr>
       </w:pPr>
@@ -4000,7 +3789,6 @@
     <w:p>
       <w:pPr>
         <w:rPr>
-          <w:rFonts w:hint="eastAsia"/>
           <w:lang w:val="es-DO"/>
         </w:rPr>
       </w:pPr>
@@ -4045,7 +3833,6 @@
       <w:pPr>
         <w:pStyle w:val="Listaconnmeros"/>
         <w:rPr>
-          <w:rFonts w:hint="eastAsia"/>
           <w:lang w:val="es-DO"/>
         </w:rPr>
       </w:pPr>
@@ -4059,7 +3846,6 @@
     <w:p>
       <w:pPr>
         <w:rPr>
-          <w:rFonts w:hint="eastAsia"/>
           <w:lang w:val="es-DO"/>
         </w:rPr>
       </w:pPr>
@@ -4082,7 +3868,6 @@
     <w:p>
       <w:pPr>
         <w:rPr>
-          <w:rFonts w:hint="eastAsia"/>
           <w:lang w:val="es-DO"/>
         </w:rPr>
       </w:pPr>
@@ -4107,7 +3892,6 @@
     <w:p>
       <w:pPr>
         <w:rPr>
-          <w:rFonts w:hint="eastAsia"/>
           <w:lang w:val="es-DO"/>
         </w:rPr>
       </w:pPr>
@@ -4138,7 +3922,6 @@
       <w:pPr>
         <w:pStyle w:val="Listaconnmeros"/>
         <w:rPr>
-          <w:rFonts w:hint="eastAsia"/>
           <w:lang w:val="es-DO"/>
         </w:rPr>
       </w:pPr>
@@ -4152,7 +3935,6 @@
     <w:p>
       <w:pPr>
         <w:rPr>
-          <w:rFonts w:hint="eastAsia"/>
           <w:lang w:val="es-DO"/>
         </w:rPr>
       </w:pPr>
@@ -4175,7 +3957,6 @@
     <w:p>
       <w:pPr>
         <w:rPr>
-          <w:rFonts w:hint="eastAsia"/>
           <w:lang w:val="es-DO"/>
         </w:rPr>
       </w:pPr>
@@ -4200,7 +3981,6 @@
     <w:p>
       <w:pPr>
         <w:rPr>
-          <w:rFonts w:hint="eastAsia"/>
           <w:lang w:val="es-DO"/>
         </w:rPr>
       </w:pPr>
@@ -4225,7 +4005,6 @@
       <w:pPr>
         <w:pStyle w:val="Listaconnmeros"/>
         <w:rPr>
-          <w:rFonts w:hint="eastAsia"/>
           <w:lang w:val="es-DO"/>
         </w:rPr>
       </w:pPr>
@@ -4239,7 +4018,6 @@
     <w:p>
       <w:pPr>
         <w:rPr>
-          <w:rFonts w:hint="eastAsia"/>
           <w:lang w:val="es-DO"/>
         </w:rPr>
       </w:pPr>
@@ -4262,7 +4040,6 @@
     <w:p>
       <w:pPr>
         <w:rPr>
-          <w:rFonts w:hint="eastAsia"/>
           <w:lang w:val="es-DO"/>
         </w:rPr>
       </w:pPr>
@@ -4287,7 +4064,6 @@
     <w:p>
       <w:pPr>
         <w:rPr>
-          <w:rFonts w:hint="eastAsia"/>
           <w:lang w:val="es-DO"/>
         </w:rPr>
       </w:pPr>
@@ -4303,7 +4079,6 @@
     <w:p>
       <w:pPr>
         <w:rPr>
-          <w:rFonts w:hint="eastAsia"/>
           <w:lang w:val="es-DO"/>
         </w:rPr>
       </w:pPr>
@@ -4347,7 +4122,6 @@
       <w:pPr>
         <w:pStyle w:val="Listaconnmeros"/>
         <w:rPr>
-          <w:rFonts w:hint="eastAsia"/>
           <w:lang w:val="es-DO"/>
         </w:rPr>
       </w:pPr>
@@ -4362,7 +4136,6 @@
       <w:pPr>
         <w:pStyle w:val="Listaconnmeros"/>
         <w:rPr>
-          <w:rFonts w:hint="eastAsia"/>
           <w:lang w:val="es-DO"/>
         </w:rPr>
       </w:pPr>
@@ -4377,7 +4150,6 @@
       <w:pPr>
         <w:pStyle w:val="Listaconnmeros"/>
         <w:rPr>
-          <w:rFonts w:hint="eastAsia"/>
           <w:lang w:val="es-DO"/>
         </w:rPr>
       </w:pPr>
@@ -4391,7 +4163,6 @@
     <w:p>
       <w:pPr>
         <w:rPr>
-          <w:rFonts w:hint="eastAsia"/>
           <w:lang w:val="es-DO"/>
         </w:rPr>
       </w:pPr>
@@ -4414,7 +4185,6 @@
     <w:p>
       <w:pPr>
         <w:rPr>
-          <w:rFonts w:hint="eastAsia"/>
           <w:lang w:val="es-DO"/>
         </w:rPr>
       </w:pPr>
@@ -4439,7 +4209,6 @@
     <w:p>
       <w:pPr>
         <w:rPr>
-          <w:rFonts w:hint="eastAsia"/>
           <w:lang w:val="es-DO"/>
         </w:rPr>
       </w:pPr>
@@ -4470,7 +4239,6 @@
       <w:pPr>
         <w:pStyle w:val="Listaconnmeros"/>
         <w:rPr>
-          <w:rFonts w:hint="eastAsia"/>
           <w:lang w:val="es-DO"/>
         </w:rPr>
       </w:pPr>
@@ -4485,7 +4253,6 @@
       <w:pPr>
         <w:pStyle w:val="Listaconnmeros"/>
         <w:rPr>
-          <w:rFonts w:hint="eastAsia"/>
           <w:lang w:val="es-DO"/>
         </w:rPr>
       </w:pPr>
@@ -4499,7 +4266,6 @@
     <w:p>
       <w:pPr>
         <w:rPr>
-          <w:rFonts w:hint="eastAsia"/>
           <w:lang w:val="es-DO"/>
         </w:rPr>
       </w:pPr>
@@ -4522,7 +4288,6 @@
     <w:p>
       <w:pPr>
         <w:rPr>
-          <w:rFonts w:hint="eastAsia"/>
           <w:lang w:val="es-DO"/>
         </w:rPr>
       </w:pPr>
@@ -4547,7 +4312,6 @@
     <w:p>
       <w:pPr>
         <w:rPr>
-          <w:rFonts w:hint="eastAsia"/>
           <w:lang w:val="es-DO"/>
         </w:rPr>
       </w:pPr>
@@ -4578,7 +4342,6 @@
       <w:pPr>
         <w:pStyle w:val="Listaconnmeros"/>
         <w:rPr>
-          <w:rFonts w:hint="eastAsia"/>
           <w:lang w:val="es-DO"/>
         </w:rPr>
       </w:pPr>
@@ -4592,7 +4355,6 @@
     <w:p>
       <w:pPr>
         <w:rPr>
-          <w:rFonts w:hint="eastAsia"/>
           <w:lang w:val="es-DO"/>
         </w:rPr>
       </w:pPr>
@@ -4615,7 +4377,6 @@
     <w:p>
       <w:pPr>
         <w:rPr>
-          <w:rFonts w:hint="eastAsia"/>
           <w:lang w:val="es-DO"/>
         </w:rPr>
       </w:pPr>
@@ -4640,7 +4401,6 @@
     <w:p>
       <w:pPr>
         <w:rPr>
-          <w:rFonts w:hint="eastAsia"/>
           <w:lang w:val="es-DO"/>
         </w:rPr>
       </w:pPr>
@@ -4671,7 +4431,6 @@
       <w:pPr>
         <w:pStyle w:val="Listaconnmeros"/>
         <w:rPr>
-          <w:rFonts w:hint="eastAsia"/>
           <w:lang w:val="es-DO"/>
         </w:rPr>
       </w:pPr>
@@ -4685,7 +4444,6 @@
     <w:p>
       <w:pPr>
         <w:rPr>
-          <w:rFonts w:hint="eastAsia"/>
           <w:lang w:val="es-DO"/>
         </w:rPr>
       </w:pPr>
@@ -4708,7 +4466,6 @@
     <w:p>
       <w:pPr>
         <w:rPr>
-          <w:rFonts w:hint="eastAsia"/>
           <w:lang w:val="es-DO"/>
         </w:rPr>
       </w:pPr>
@@ -4733,7 +4490,6 @@
     <w:p>
       <w:pPr>
         <w:rPr>
-          <w:rFonts w:hint="eastAsia"/>
           <w:lang w:val="es-DO"/>
         </w:rPr>
       </w:pPr>
@@ -4749,7 +4505,6 @@
     <w:p>
       <w:pPr>
         <w:rPr>
-          <w:rFonts w:hint="eastAsia"/>
           <w:lang w:val="es-DO"/>
         </w:rPr>
       </w:pPr>
@@ -4793,7 +4548,6 @@
       <w:pPr>
         <w:pStyle w:val="Listaconnmeros"/>
         <w:rPr>
-          <w:rFonts w:hint="eastAsia"/>
           <w:lang w:val="es-DO"/>
         </w:rPr>
       </w:pPr>
@@ -4807,7 +4561,6 @@
     <w:p>
       <w:pPr>
         <w:rPr>
-          <w:rFonts w:hint="eastAsia"/>
           <w:lang w:val="es-DO"/>
         </w:rPr>
       </w:pPr>
@@ -4830,7 +4583,6 @@
     <w:p>
       <w:pPr>
         <w:rPr>
-          <w:rFonts w:hint="eastAsia"/>
           <w:lang w:val="es-DO"/>
         </w:rPr>
       </w:pPr>
@@ -4855,7 +4607,6 @@
     <w:p>
       <w:pPr>
         <w:rPr>
-          <w:rFonts w:hint="eastAsia"/>
           <w:lang w:val="es-DO"/>
         </w:rPr>
       </w:pPr>
@@ -4886,7 +4637,6 @@
       <w:pPr>
         <w:pStyle w:val="Listaconnmeros"/>
         <w:rPr>
-          <w:rFonts w:hint="eastAsia"/>
           <w:lang w:val="es-DO"/>
         </w:rPr>
       </w:pPr>
@@ -4900,7 +4650,6 @@
     <w:p>
       <w:pPr>
         <w:rPr>
-          <w:rFonts w:hint="eastAsia"/>
           <w:lang w:val="es-DO"/>
         </w:rPr>
       </w:pPr>
@@ -4923,7 +4672,6 @@
     <w:p>
       <w:pPr>
         <w:rPr>
-          <w:rFonts w:hint="eastAsia"/>
           <w:lang w:val="es-DO"/>
         </w:rPr>
       </w:pPr>
@@ -4948,7 +4696,6 @@
     <w:p>
       <w:pPr>
         <w:rPr>
-          <w:rFonts w:hint="eastAsia"/>
           <w:lang w:val="es-DO"/>
         </w:rPr>
       </w:pPr>
@@ -4979,7 +4726,6 @@
       <w:pPr>
         <w:pStyle w:val="Listaconnmeros"/>
         <w:rPr>
-          <w:rFonts w:hint="eastAsia"/>
           <w:lang w:val="es-DO"/>
         </w:rPr>
       </w:pPr>
@@ -4994,7 +4740,6 @@
       <w:pPr>
         <w:pStyle w:val="Listaconnmeros"/>
         <w:rPr>
-          <w:rFonts w:hint="eastAsia"/>
           <w:lang w:val="es-DO"/>
         </w:rPr>
       </w:pPr>
@@ -5009,7 +4754,6 @@
       <w:pPr>
         <w:pStyle w:val="Listaconnmeros"/>
         <w:rPr>
-          <w:rFonts w:hint="eastAsia"/>
           <w:lang w:val="es-DO"/>
         </w:rPr>
       </w:pPr>
@@ -5023,7 +4767,6 @@
     <w:p>
       <w:pPr>
         <w:rPr>
-          <w:rFonts w:hint="eastAsia"/>
           <w:lang w:val="es-DO"/>
         </w:rPr>
       </w:pPr>
@@ -5046,7 +4789,6 @@
     <w:p>
       <w:pPr>
         <w:rPr>
-          <w:rFonts w:hint="eastAsia"/>
           <w:lang w:val="es-DO"/>
         </w:rPr>
       </w:pPr>
@@ -5071,7 +4813,6 @@
     <w:p>
       <w:pPr>
         <w:rPr>
-          <w:rFonts w:hint="eastAsia"/>
           <w:lang w:val="es-DO"/>
         </w:rPr>
       </w:pPr>
@@ -5102,7 +4843,6 @@
       <w:pPr>
         <w:pStyle w:val="Listaconnmeros"/>
         <w:rPr>
-          <w:rFonts w:hint="eastAsia"/>
           <w:lang w:val="es-DO"/>
         </w:rPr>
       </w:pPr>
@@ -5117,7 +4857,6 @@
       <w:pPr>
         <w:pStyle w:val="Listaconnmeros"/>
         <w:rPr>
-          <w:rFonts w:hint="eastAsia"/>
           <w:lang w:val="es-DO"/>
         </w:rPr>
       </w:pPr>
@@ -5132,7 +4871,6 @@
       <w:pPr>
         <w:pStyle w:val="Listaconnmeros"/>
         <w:rPr>
-          <w:rFonts w:hint="eastAsia"/>
           <w:lang w:val="es-DO"/>
         </w:rPr>
       </w:pPr>
@@ -5146,7 +4884,6 @@
     <w:p>
       <w:pPr>
         <w:rPr>
-          <w:rFonts w:hint="eastAsia"/>
           <w:lang w:val="es-DO"/>
         </w:rPr>
       </w:pPr>
@@ -5169,7 +4906,6 @@
     <w:p>
       <w:pPr>
         <w:rPr>
-          <w:rFonts w:hint="eastAsia"/>
           <w:lang w:val="es-DO"/>
         </w:rPr>
       </w:pPr>
@@ -5194,7 +4930,6 @@
     <w:p>
       <w:pPr>
         <w:rPr>
-          <w:rFonts w:hint="eastAsia"/>
           <w:lang w:val="es-DO"/>
         </w:rPr>
       </w:pPr>
@@ -5210,7 +4945,6 @@
     <w:p>
       <w:pPr>
         <w:rPr>
-          <w:rFonts w:hint="eastAsia"/>
           <w:lang w:val="es-DO"/>
         </w:rPr>
       </w:pPr>
@@ -5242,7 +4976,6 @@
       <w:pPr>
         <w:pStyle w:val="Listaconnmeros"/>
         <w:rPr>
-          <w:rFonts w:hint="eastAsia"/>
           <w:lang w:val="es-DO"/>
         </w:rPr>
       </w:pPr>
@@ -5257,7 +4990,6 @@
       <w:pPr>
         <w:pStyle w:val="Listaconnmeros"/>
         <w:rPr>
-          <w:rFonts w:hint="eastAsia"/>
           <w:lang w:val="es-DO"/>
         </w:rPr>
       </w:pPr>
@@ -5271,7 +5003,6 @@
     <w:p>
       <w:pPr>
         <w:rPr>
-          <w:rFonts w:hint="eastAsia"/>
           <w:lang w:val="es-DO"/>
         </w:rPr>
       </w:pPr>
@@ -5294,7 +5025,6 @@
     <w:p>
       <w:pPr>
         <w:rPr>
-          <w:rFonts w:hint="eastAsia"/>
           <w:lang w:val="es-DO"/>
         </w:rPr>
       </w:pPr>
@@ -5319,7 +5049,6 @@
     <w:p>
       <w:pPr>
         <w:rPr>
-          <w:rFonts w:hint="eastAsia"/>
           <w:lang w:val="es-DO"/>
         </w:rPr>
       </w:pPr>
@@ -5350,7 +5079,6 @@
       <w:pPr>
         <w:pStyle w:val="Listaconnmeros"/>
         <w:rPr>
-          <w:rFonts w:hint="eastAsia"/>
           <w:lang w:val="es-DO"/>
         </w:rPr>
       </w:pPr>
@@ -5364,7 +5092,6 @@
     <w:p>
       <w:pPr>
         <w:rPr>
-          <w:rFonts w:hint="eastAsia"/>
           <w:lang w:val="es-DO"/>
         </w:rPr>
       </w:pPr>
@@ -5387,7 +5114,6 @@
     <w:p>
       <w:pPr>
         <w:rPr>
-          <w:rFonts w:hint="eastAsia"/>
           <w:lang w:val="es-DO"/>
         </w:rPr>
       </w:pPr>
@@ -5412,7 +5138,6 @@
     <w:p>
       <w:pPr>
         <w:rPr>
-          <w:rFonts w:hint="eastAsia"/>
           <w:lang w:val="es-DO"/>
         </w:rPr>
       </w:pPr>
@@ -5443,7 +5168,6 @@
       <w:pPr>
         <w:pStyle w:val="Listaconnmeros"/>
         <w:rPr>
-          <w:rFonts w:hint="eastAsia"/>
           <w:lang w:val="es-DO"/>
         </w:rPr>
       </w:pPr>
@@ -5457,7 +5181,6 @@
     <w:p>
       <w:pPr>
         <w:rPr>
-          <w:rFonts w:hint="eastAsia"/>
           <w:lang w:val="es-DO"/>
         </w:rPr>
       </w:pPr>
@@ -5480,7 +5203,6 @@
     <w:p>
       <w:pPr>
         <w:rPr>
-          <w:rFonts w:hint="eastAsia"/>
           <w:lang w:val="es-DO"/>
         </w:rPr>
       </w:pPr>
@@ -5505,7 +5227,6 @@
     <w:p>
       <w:pPr>
         <w:rPr>
-          <w:rFonts w:hint="eastAsia"/>
           <w:lang w:val="es-DO"/>
         </w:rPr>
       </w:pPr>
@@ -5521,7 +5242,6 @@
     <w:p>
       <w:pPr>
         <w:rPr>
-          <w:rFonts w:hint="eastAsia"/>
           <w:lang w:val="es-DO"/>
         </w:rPr>
       </w:pPr>
@@ -5565,7 +5285,6 @@
       <w:pPr>
         <w:pStyle w:val="Listaconnmeros"/>
         <w:rPr>
-          <w:rFonts w:hint="eastAsia"/>
           <w:lang w:val="es-DO"/>
         </w:rPr>
       </w:pPr>
@@ -5579,7 +5298,6 @@
     <w:p>
       <w:pPr>
         <w:rPr>
-          <w:rFonts w:hint="eastAsia"/>
           <w:lang w:val="es-DO"/>
         </w:rPr>
       </w:pPr>
@@ -5602,7 +5320,6 @@
     <w:p>
       <w:pPr>
         <w:rPr>
-          <w:rFonts w:hint="eastAsia"/>
           <w:lang w:val="es-DO"/>
         </w:rPr>
       </w:pPr>
@@ -5627,7 +5344,6 @@
     <w:p>
       <w:pPr>
         <w:rPr>
-          <w:rFonts w:hint="eastAsia"/>
           <w:lang w:val="es-DO"/>
         </w:rPr>
       </w:pPr>
@@ -5658,7 +5374,6 @@
       <w:pPr>
         <w:pStyle w:val="Listaconnmeros"/>
         <w:rPr>
-          <w:rFonts w:hint="eastAsia"/>
           <w:lang w:val="es-DO"/>
         </w:rPr>
       </w:pPr>
@@ -5673,7 +5388,6 @@
       <w:pPr>
         <w:pStyle w:val="Listaconnmeros"/>
         <w:rPr>
-          <w:rFonts w:hint="eastAsia"/>
           <w:lang w:val="es-DO"/>
         </w:rPr>
       </w:pPr>
@@ -5687,7 +5401,6 @@
     <w:p>
       <w:pPr>
         <w:rPr>
-          <w:rFonts w:hint="eastAsia"/>
           <w:lang w:val="es-DO"/>
         </w:rPr>
       </w:pPr>
@@ -5710,7 +5423,6 @@
     <w:p>
       <w:pPr>
         <w:rPr>
-          <w:rFonts w:hint="eastAsia"/>
           <w:lang w:val="es-DO"/>
         </w:rPr>
       </w:pPr>
@@ -5735,7 +5447,6 @@
     <w:p>
       <w:pPr>
         <w:rPr>
-          <w:rFonts w:hint="eastAsia"/>
           <w:lang w:val="es-DO"/>
         </w:rPr>
       </w:pPr>
@@ -5766,7 +5477,6 @@
       <w:pPr>
         <w:pStyle w:val="Listaconnmeros"/>
         <w:rPr>
-          <w:rFonts w:hint="eastAsia"/>
           <w:lang w:val="es-DO"/>
         </w:rPr>
       </w:pPr>
@@ -5780,7 +5490,6 @@
     <w:p>
       <w:pPr>
         <w:rPr>
-          <w:rFonts w:hint="eastAsia"/>
           <w:lang w:val="es-DO"/>
         </w:rPr>
       </w:pPr>
@@ -5803,7 +5512,6 @@
     <w:p>
       <w:pPr>
         <w:rPr>
-          <w:rFonts w:hint="eastAsia"/>
           <w:lang w:val="es-DO"/>
         </w:rPr>
       </w:pPr>
@@ -5828,7 +5536,6 @@
     <w:p>
       <w:pPr>
         <w:rPr>
-          <w:rFonts w:hint="eastAsia"/>
           <w:lang w:val="es-DO"/>
         </w:rPr>
       </w:pPr>
@@ -5853,7 +5560,6 @@
       <w:pPr>
         <w:pStyle w:val="Listaconnmeros"/>
         <w:rPr>
-          <w:rFonts w:hint="eastAsia"/>
           <w:lang w:val="es-DO"/>
         </w:rPr>
       </w:pPr>
@@ -5867,7 +5573,6 @@
     <w:p>
       <w:pPr>
         <w:rPr>
-          <w:rFonts w:hint="eastAsia"/>
           <w:lang w:val="es-DO"/>
         </w:rPr>
       </w:pPr>
@@ -5890,7 +5595,6 @@
     <w:p>
       <w:pPr>
         <w:rPr>
-          <w:rFonts w:hint="eastAsia"/>
           <w:lang w:val="es-DO"/>
         </w:rPr>
       </w:pPr>
@@ -5915,7 +5619,6 @@
     <w:p>
       <w:pPr>
         <w:rPr>
-          <w:rFonts w:hint="eastAsia"/>
           <w:lang w:val="es-DO"/>
         </w:rPr>
       </w:pPr>
@@ -5931,7 +5634,6 @@
     <w:p>
       <w:pPr>
         <w:rPr>
-          <w:rFonts w:hint="eastAsia"/>
           <w:lang w:val="es-DO"/>
         </w:rPr>
       </w:pPr>
@@ -5947,7 +5649,6 @@
     <w:p>
       <w:pPr>
         <w:rPr>
-          <w:rFonts w:hint="eastAsia"/>
           <w:lang w:val="es-DO"/>
         </w:rPr>
       </w:pPr>
@@ -5991,7 +5692,6 @@
       <w:pPr>
         <w:pStyle w:val="Listaconnmeros"/>
         <w:rPr>
-          <w:rFonts w:hint="eastAsia"/>
           <w:lang w:val="es-DO"/>
         </w:rPr>
       </w:pPr>
@@ -6006,7 +5706,6 @@
       <w:pPr>
         <w:pStyle w:val="Listaconnmeros"/>
         <w:rPr>
-          <w:rFonts w:hint="eastAsia"/>
           <w:lang w:val="es-DO"/>
         </w:rPr>
       </w:pPr>
@@ -6020,9 +5719,6 @@
     <w:p>
       <w:pPr>
         <w:pStyle w:val="Listaconnmeros"/>
-        <w:rPr>
-          <w:rFonts w:hint="eastAsia"/>
-        </w:rPr>
       </w:pPr>
       <w:r>
         <w:t>Autorice con el supervisor.</w:t>
@@ -6031,7 +5727,6 @@
     <w:p>
       <w:pPr>
         <w:rPr>
-          <w:rFonts w:hint="eastAsia"/>
           <w:lang w:val="es-DO"/>
         </w:rPr>
       </w:pPr>
@@ -6054,7 +5749,6 @@
     <w:p>
       <w:pPr>
         <w:rPr>
-          <w:rFonts w:hint="eastAsia"/>
           <w:lang w:val="es-DO"/>
         </w:rPr>
       </w:pPr>
@@ -6079,7 +5773,6 @@
     <w:p>
       <w:pPr>
         <w:rPr>
-          <w:rFonts w:hint="eastAsia"/>
           <w:lang w:val="es-DO"/>
         </w:rPr>
       </w:pPr>
@@ -6110,7 +5803,6 @@
       <w:pPr>
         <w:pStyle w:val="Listaconnmeros"/>
         <w:rPr>
-          <w:rFonts w:hint="eastAsia"/>
           <w:lang w:val="es-DO"/>
         </w:rPr>
       </w:pPr>
@@ -6124,7 +5816,6 @@
     <w:p>
       <w:pPr>
         <w:rPr>
-          <w:rFonts w:hint="eastAsia"/>
           <w:lang w:val="es-DO"/>
         </w:rPr>
       </w:pPr>
@@ -6147,7 +5838,6 @@
     <w:p>
       <w:pPr>
         <w:rPr>
-          <w:rFonts w:hint="eastAsia"/>
           <w:lang w:val="es-DO"/>
         </w:rPr>
       </w:pPr>
@@ -6172,7 +5862,6 @@
     <w:p>
       <w:pPr>
         <w:rPr>
-          <w:rFonts w:hint="eastAsia"/>
           <w:lang w:val="es-DO"/>
         </w:rPr>
       </w:pPr>
@@ -6203,7 +5892,6 @@
       <w:pPr>
         <w:pStyle w:val="Listaconnmeros"/>
         <w:rPr>
-          <w:rFonts w:hint="eastAsia"/>
           <w:lang w:val="es-DO"/>
         </w:rPr>
       </w:pPr>
@@ -6217,7 +5905,6 @@
     <w:p>
       <w:pPr>
         <w:rPr>
-          <w:rFonts w:hint="eastAsia"/>
           <w:lang w:val="es-DO"/>
         </w:rPr>
       </w:pPr>
@@ -6240,7 +5927,6 @@
     <w:p>
       <w:pPr>
         <w:rPr>
-          <w:rFonts w:hint="eastAsia"/>
           <w:lang w:val="es-DO"/>
         </w:rPr>
       </w:pPr>
@@ -6265,7 +5951,6 @@
     <w:p>
       <w:pPr>
         <w:rPr>
-          <w:rFonts w:hint="eastAsia"/>
           <w:lang w:val="es-DO"/>
         </w:rPr>
       </w:pPr>
@@ -6296,7 +5981,6 @@
       <w:pPr>
         <w:pStyle w:val="Listaconnmeros"/>
         <w:rPr>
-          <w:rFonts w:hint="eastAsia"/>
           <w:lang w:val="es-DO"/>
         </w:rPr>
       </w:pPr>
@@ -6310,7 +5994,6 @@
     <w:p>
       <w:pPr>
         <w:rPr>
-          <w:rFonts w:hint="eastAsia"/>
           <w:lang w:val="es-DO"/>
         </w:rPr>
       </w:pPr>
@@ -6333,7 +6016,6 @@
     <w:p>
       <w:pPr>
         <w:rPr>
-          <w:rFonts w:hint="eastAsia"/>
           <w:lang w:val="es-DO"/>
         </w:rPr>
       </w:pPr>
@@ -6358,7 +6040,6 @@
     <w:p>
       <w:pPr>
         <w:rPr>
-          <w:rFonts w:hint="eastAsia"/>
           <w:lang w:val="es-DO"/>
         </w:rPr>
       </w:pPr>
@@ -6389,7 +6070,6 @@
       <w:pPr>
         <w:pStyle w:val="Listaconnmeros"/>
         <w:rPr>
-          <w:rFonts w:hint="eastAsia"/>
           <w:lang w:val="es-DO"/>
         </w:rPr>
       </w:pPr>
@@ -6403,7 +6083,6 @@
     <w:p>
       <w:pPr>
         <w:rPr>
-          <w:rFonts w:hint="eastAsia"/>
           <w:lang w:val="es-DO"/>
         </w:rPr>
       </w:pPr>
@@ -6426,7 +6105,6 @@
     <w:p>
       <w:pPr>
         <w:rPr>
-          <w:rFonts w:hint="eastAsia"/>
           <w:lang w:val="es-DO"/>
         </w:rPr>
       </w:pPr>
@@ -6451,7 +6129,6 @@
     <w:p>
       <w:pPr>
         <w:rPr>
-          <w:rFonts w:hint="eastAsia"/>
           <w:lang w:val="es-DO"/>
         </w:rPr>
       </w:pPr>
@@ -6477,7 +6154,6 @@
       <w:pPr>
         <w:pStyle w:val="Listaconnmeros"/>
         <w:rPr>
-          <w:rFonts w:hint="eastAsia"/>
           <w:lang w:val="es-DO"/>
         </w:rPr>
       </w:pPr>
@@ -6491,7 +6167,6 @@
     <w:p>
       <w:pPr>
         <w:rPr>
-          <w:rFonts w:hint="eastAsia"/>
           <w:lang w:val="es-DO"/>
         </w:rPr>
       </w:pPr>
@@ -6514,7 +6189,6 @@
     <w:p>
       <w:pPr>
         <w:rPr>
-          <w:rFonts w:hint="eastAsia"/>
           <w:lang w:val="es-DO"/>
         </w:rPr>
       </w:pPr>
@@ -6539,7 +6213,6 @@
     <w:p>
       <w:pPr>
         <w:rPr>
-          <w:rFonts w:hint="eastAsia"/>
           <w:lang w:val="es-DO"/>
         </w:rPr>
       </w:pPr>
@@ -6570,7 +6243,6 @@
       <w:pPr>
         <w:pStyle w:val="Listaconnmeros"/>
         <w:rPr>
-          <w:rFonts w:hint="eastAsia"/>
           <w:lang w:val="es-DO"/>
         </w:rPr>
       </w:pPr>
@@ -6584,7 +6256,6 @@
     <w:p>
       <w:pPr>
         <w:rPr>
-          <w:rFonts w:hint="eastAsia"/>
           <w:lang w:val="es-DO"/>
         </w:rPr>
       </w:pPr>
@@ -6607,7 +6278,6 @@
     <w:p>
       <w:pPr>
         <w:rPr>
-          <w:rFonts w:hint="eastAsia"/>
           <w:lang w:val="es-DO"/>
         </w:rPr>
       </w:pPr>
@@ -6632,7 +6302,6 @@
     <w:p>
       <w:pPr>
         <w:rPr>
-          <w:rFonts w:hint="eastAsia"/>
           <w:lang w:val="es-DO"/>
         </w:rPr>
       </w:pPr>
@@ -6648,7 +6317,6 @@
     <w:p>
       <w:pPr>
         <w:rPr>
-          <w:rFonts w:hint="eastAsia"/>
           <w:lang w:val="es-DO"/>
         </w:rPr>
       </w:pPr>
@@ -6692,7 +6360,6 @@
       <w:pPr>
         <w:pStyle w:val="Listaconnmeros"/>
         <w:rPr>
-          <w:rFonts w:hint="eastAsia"/>
           <w:lang w:val="es-DO"/>
         </w:rPr>
       </w:pPr>
@@ -6706,7 +6373,6 @@
     <w:p>
       <w:pPr>
         <w:rPr>
-          <w:rFonts w:hint="eastAsia"/>
           <w:lang w:val="es-DO"/>
         </w:rPr>
       </w:pPr>
@@ -6729,7 +6395,6 @@
     <w:p>
       <w:pPr>
         <w:rPr>
-          <w:rFonts w:hint="eastAsia"/>
           <w:lang w:val="es-DO"/>
         </w:rPr>
       </w:pPr>
@@ -6754,7 +6419,6 @@
     <w:p>
       <w:pPr>
         <w:rPr>
-          <w:rFonts w:hint="eastAsia"/>
           <w:lang w:val="es-DO"/>
         </w:rPr>
       </w:pPr>
@@ -6785,7 +6449,6 @@
       <w:pPr>
         <w:pStyle w:val="Listaconnmeros"/>
         <w:rPr>
-          <w:rFonts w:hint="eastAsia"/>
           <w:lang w:val="es-DO"/>
         </w:rPr>
       </w:pPr>
@@ -6800,7 +6463,6 @@
       <w:pPr>
         <w:pStyle w:val="Listaconnmeros"/>
         <w:rPr>
-          <w:rFonts w:hint="eastAsia"/>
           <w:lang w:val="es-DO"/>
         </w:rPr>
       </w:pPr>
@@ -6814,7 +6476,6 @@
     <w:p>
       <w:pPr>
         <w:rPr>
-          <w:rFonts w:hint="eastAsia"/>
           <w:lang w:val="es-DO"/>
         </w:rPr>
       </w:pPr>
@@ -6837,7 +6498,6 @@
     <w:p>
       <w:pPr>
         <w:rPr>
-          <w:rFonts w:hint="eastAsia"/>
           <w:lang w:val="es-DO"/>
         </w:rPr>
       </w:pPr>
@@ -6862,7 +6522,6 @@
     <w:p>
       <w:pPr>
         <w:rPr>
-          <w:rFonts w:hint="eastAsia"/>
           <w:lang w:val="es-DO"/>
         </w:rPr>
       </w:pPr>
@@ -6893,7 +6552,6 @@
       <w:pPr>
         <w:pStyle w:val="Listaconnmeros"/>
         <w:rPr>
-          <w:rFonts w:hint="eastAsia"/>
           <w:lang w:val="es-DO"/>
         </w:rPr>
       </w:pPr>
@@ -6907,7 +6565,6 @@
     <w:p>
       <w:pPr>
         <w:rPr>
-          <w:rFonts w:hint="eastAsia"/>
           <w:lang w:val="es-DO"/>
         </w:rPr>
       </w:pPr>
@@ -6930,7 +6587,6 @@
     <w:p>
       <w:pPr>
         <w:rPr>
-          <w:rFonts w:hint="eastAsia"/>
           <w:lang w:val="es-DO"/>
         </w:rPr>
       </w:pPr>
@@ -6955,7 +6611,6 @@
     <w:p>
       <w:pPr>
         <w:rPr>
-          <w:rFonts w:hint="eastAsia"/>
           <w:lang w:val="es-DO"/>
         </w:rPr>
       </w:pPr>
@@ -6971,7 +6626,6 @@
     <w:p>
       <w:pPr>
         <w:rPr>
-          <w:rFonts w:hint="eastAsia"/>
           <w:lang w:val="es-DO"/>
         </w:rPr>
       </w:pPr>
@@ -7015,7 +6669,6 @@
       <w:pPr>
         <w:pStyle w:val="Listaconnmeros"/>
         <w:rPr>
-          <w:rFonts w:hint="eastAsia"/>
           <w:lang w:val="es-DO"/>
         </w:rPr>
       </w:pPr>
@@ -7029,7 +6682,6 @@
     <w:p>
       <w:pPr>
         <w:rPr>
-          <w:rFonts w:hint="eastAsia"/>
           <w:lang w:val="es-DO"/>
         </w:rPr>
       </w:pPr>
@@ -7052,7 +6704,6 @@
     <w:p>
       <w:pPr>
         <w:rPr>
-          <w:rFonts w:hint="eastAsia"/>
           <w:lang w:val="es-DO"/>
         </w:rPr>
       </w:pPr>
@@ -7077,7 +6728,6 @@
     <w:p>
       <w:pPr>
         <w:rPr>
-          <w:rFonts w:hint="eastAsia"/>
           <w:lang w:val="es-DO"/>
         </w:rPr>
       </w:pPr>
@@ -7108,7 +6758,6 @@
       <w:pPr>
         <w:pStyle w:val="Listaconnmeros"/>
         <w:rPr>
-          <w:rFonts w:hint="eastAsia"/>
           <w:lang w:val="es-DO"/>
         </w:rPr>
       </w:pPr>
@@ -7122,7 +6771,6 @@
     <w:p>
       <w:pPr>
         <w:rPr>
-          <w:rFonts w:hint="eastAsia"/>
           <w:lang w:val="es-DO"/>
         </w:rPr>
       </w:pPr>
@@ -7145,7 +6793,6 @@
     <w:p>
       <w:pPr>
         <w:rPr>
-          <w:rFonts w:hint="eastAsia"/>
           <w:lang w:val="es-DO"/>
         </w:rPr>
       </w:pPr>
@@ -7170,7 +6817,6 @@
     <w:p>
       <w:pPr>
         <w:rPr>
-          <w:rFonts w:hint="eastAsia"/>
           <w:lang w:val="es-DO"/>
         </w:rPr>
       </w:pPr>
@@ -7201,7 +6847,6 @@
       <w:pPr>
         <w:pStyle w:val="Listaconnmeros"/>
         <w:rPr>
-          <w:rFonts w:hint="eastAsia"/>
           <w:lang w:val="es-DO"/>
         </w:rPr>
       </w:pPr>
@@ -7215,7 +6860,6 @@
     <w:p>
       <w:pPr>
         <w:rPr>
-          <w:rFonts w:hint="eastAsia"/>
           <w:lang w:val="es-DO"/>
         </w:rPr>
       </w:pPr>
@@ -7238,7 +6882,6 @@
     <w:p>
       <w:pPr>
         <w:rPr>
-          <w:rFonts w:hint="eastAsia"/>
           <w:lang w:val="es-DO"/>
         </w:rPr>
       </w:pPr>
@@ -7263,7 +6906,6 @@
     <w:p>
       <w:pPr>
         <w:rPr>
-          <w:rFonts w:hint="eastAsia"/>
           <w:lang w:val="es-DO"/>
         </w:rPr>
       </w:pPr>
@@ -7279,7 +6921,6 @@
     <w:p>
       <w:pPr>
         <w:rPr>
-          <w:rFonts w:hint="eastAsia"/>
           <w:lang w:val="es-DO"/>
         </w:rPr>
       </w:pPr>
@@ -7323,7 +6964,6 @@
       <w:pPr>
         <w:pStyle w:val="Listaconnmeros"/>
         <w:rPr>
-          <w:rFonts w:hint="eastAsia"/>
           <w:lang w:val="es-DO"/>
         </w:rPr>
       </w:pPr>
@@ -7337,9 +6977,6 @@
     <w:p>
       <w:pPr>
         <w:pStyle w:val="Listaconnmeros"/>
-        <w:rPr>
-          <w:rFonts w:hint="eastAsia"/>
-        </w:rPr>
       </w:pPr>
       <w:r>
         <w:t>Cobre la venta.</w:t>
@@ -7348,7 +6985,6 @@
     <w:p>
       <w:pPr>
         <w:rPr>
-          <w:rFonts w:hint="eastAsia"/>
           <w:lang w:val="es-DO"/>
         </w:rPr>
       </w:pPr>
@@ -7371,7 +7007,6 @@
     <w:p>
       <w:pPr>
         <w:rPr>
-          <w:rFonts w:hint="eastAsia"/>
           <w:lang w:val="es-DO"/>
         </w:rPr>
       </w:pPr>
@@ -7396,7 +7031,6 @@
     <w:p>
       <w:pPr>
         <w:rPr>
-          <w:rFonts w:hint="eastAsia"/>
           <w:lang w:val="es-DO"/>
         </w:rPr>
       </w:pPr>
@@ -7427,7 +7061,6 @@
       <w:pPr>
         <w:pStyle w:val="Listaconnmeros"/>
         <w:rPr>
-          <w:rFonts w:hint="eastAsia"/>
           <w:lang w:val="es-DO"/>
         </w:rPr>
       </w:pPr>
@@ -7441,7 +7074,6 @@
     <w:p>
       <w:pPr>
         <w:rPr>
-          <w:rFonts w:hint="eastAsia"/>
           <w:lang w:val="es-DO"/>
         </w:rPr>
       </w:pPr>
@@ -7464,7 +7096,6 @@
     <w:p>
       <w:pPr>
         <w:rPr>
-          <w:rFonts w:hint="eastAsia"/>
           <w:lang w:val="es-DO"/>
         </w:rPr>
       </w:pPr>
@@ -7489,7 +7120,6 @@
     <w:p>
       <w:pPr>
         <w:rPr>
-          <w:rFonts w:hint="eastAsia"/>
           <w:lang w:val="es-DO"/>
         </w:rPr>
       </w:pPr>
@@ -7520,7 +7150,6 @@
       <w:pPr>
         <w:pStyle w:val="Listaconnmeros"/>
         <w:rPr>
-          <w:rFonts w:hint="eastAsia"/>
           <w:lang w:val="es-DO"/>
         </w:rPr>
       </w:pPr>
@@ -7534,7 +7163,6 @@
     <w:p>
       <w:pPr>
         <w:rPr>
-          <w:rFonts w:hint="eastAsia"/>
           <w:lang w:val="es-DO"/>
         </w:rPr>
       </w:pPr>
@@ -7557,7 +7185,6 @@
     <w:p>
       <w:pPr>
         <w:rPr>
-          <w:rFonts w:hint="eastAsia"/>
           <w:lang w:val="es-DO"/>
         </w:rPr>
       </w:pPr>
@@ -7582,7 +7209,6 @@
     <w:p>
       <w:pPr>
         <w:rPr>
-          <w:rFonts w:hint="eastAsia"/>
           <w:lang w:val="es-DO"/>
         </w:rPr>
       </w:pPr>
@@ -7598,7 +7224,6 @@
     <w:p>
       <w:pPr>
         <w:rPr>
-          <w:rFonts w:hint="eastAsia"/>
           <w:lang w:val="es-DO"/>
         </w:rPr>
       </w:pPr>
@@ -7636,7 +7261,6 @@
       <w:pPr>
         <w:pStyle w:val="Listaconnmeros"/>
         <w:rPr>
-          <w:rFonts w:hint="eastAsia"/>
           <w:lang w:val="es-DO"/>
         </w:rPr>
       </w:pPr>
@@ -7651,7 +7275,6 @@
       <w:pPr>
         <w:pStyle w:val="Listaconnmeros"/>
         <w:rPr>
-          <w:rFonts w:hint="eastAsia"/>
           <w:lang w:val="es-DO"/>
         </w:rPr>
       </w:pPr>
@@ -7665,7 +7288,6 @@
     <w:p>
       <w:pPr>
         <w:rPr>
-          <w:rFonts w:hint="eastAsia"/>
           <w:lang w:val="es-DO"/>
         </w:rPr>
       </w:pPr>
@@ -7688,7 +7310,6 @@
     <w:p>
       <w:pPr>
         <w:rPr>
-          <w:rFonts w:hint="eastAsia"/>
           <w:lang w:val="es-DO"/>
         </w:rPr>
       </w:pPr>
@@ -7713,7 +7334,6 @@
     <w:p>
       <w:pPr>
         <w:rPr>
-          <w:rFonts w:hint="eastAsia"/>
           <w:lang w:val="es-DO"/>
         </w:rPr>
       </w:pPr>
@@ -7744,7 +7364,6 @@
       <w:pPr>
         <w:pStyle w:val="Listaconnmeros"/>
         <w:rPr>
-          <w:rFonts w:hint="eastAsia"/>
           <w:lang w:val="es-DO"/>
         </w:rPr>
       </w:pPr>
@@ -7758,7 +7377,6 @@
     <w:p>
       <w:pPr>
         <w:rPr>
-          <w:rFonts w:hint="eastAsia"/>
           <w:lang w:val="es-DO"/>
         </w:rPr>
       </w:pPr>
@@ -7781,7 +7399,6 @@
     <w:p>
       <w:pPr>
         <w:rPr>
-          <w:rFonts w:hint="eastAsia"/>
           <w:lang w:val="es-DO"/>
         </w:rPr>
       </w:pPr>
@@ -7806,7 +7423,6 @@
     <w:p>
       <w:pPr>
         <w:rPr>
-          <w:rFonts w:hint="eastAsia"/>
           <w:lang w:val="es-DO"/>
         </w:rPr>
       </w:pPr>
@@ -7831,7 +7447,6 @@
       <w:pPr>
         <w:pStyle w:val="Listaconnmeros"/>
         <w:rPr>
-          <w:rFonts w:hint="eastAsia"/>
           <w:lang w:val="es-DO"/>
         </w:rPr>
       </w:pPr>
@@ -7845,7 +7460,6 @@
     <w:p>
       <w:pPr>
         <w:rPr>
-          <w:rFonts w:hint="eastAsia"/>
           <w:lang w:val="es-DO"/>
         </w:rPr>
       </w:pPr>
@@ -7868,7 +7482,6 @@
     <w:p>
       <w:pPr>
         <w:rPr>
-          <w:rFonts w:hint="eastAsia"/>
           <w:lang w:val="es-DO"/>
         </w:rPr>
       </w:pPr>
@@ -7893,7 +7506,6 @@
     <w:p>
       <w:pPr>
         <w:rPr>
-          <w:rFonts w:hint="eastAsia"/>
           <w:lang w:val="es-DO"/>
         </w:rPr>
       </w:pPr>
@@ -7923,9 +7535,6 @@
     <w:p>
       <w:pPr>
         <w:pStyle w:val="Listaconnmeros"/>
-        <w:rPr>
-          <w:rFonts w:hint="eastAsia"/>
-        </w:rPr>
       </w:pPr>
       <w:r>
         <w:t>Presione «Cerrar lote».</w:t>
@@ -7934,7 +7543,6 @@
     <w:p>
       <w:pPr>
         <w:rPr>
-          <w:rFonts w:hint="eastAsia"/>
           <w:lang w:val="es-DO"/>
         </w:rPr>
       </w:pPr>
@@ -7957,7 +7565,6 @@
     <w:p>
       <w:pPr>
         <w:rPr>
-          <w:rFonts w:hint="eastAsia"/>
           <w:lang w:val="es-DO"/>
         </w:rPr>
       </w:pPr>
@@ -7982,7 +7589,6 @@
     <w:p>
       <w:pPr>
         <w:rPr>
-          <w:rFonts w:hint="eastAsia"/>
           <w:lang w:val="es-DO"/>
         </w:rPr>
       </w:pPr>
@@ -8013,7 +7619,6 @@
       <w:pPr>
         <w:pStyle w:val="Listaconnmeros"/>
         <w:rPr>
-          <w:rFonts w:hint="eastAsia"/>
           <w:lang w:val="es-DO"/>
         </w:rPr>
       </w:pPr>
@@ -8027,7 +7632,6 @@
     <w:p>
       <w:pPr>
         <w:rPr>
-          <w:rFonts w:hint="eastAsia"/>
           <w:lang w:val="es-DO"/>
         </w:rPr>
       </w:pPr>
@@ -8050,7 +7654,6 @@
     <w:p>
       <w:pPr>
         <w:rPr>
-          <w:rFonts w:hint="eastAsia"/>
           <w:lang w:val="es-DO"/>
         </w:rPr>
       </w:pPr>
@@ -8075,7 +7678,6 @@
     <w:p>
       <w:pPr>
         <w:rPr>
-          <w:rFonts w:hint="eastAsia"/>
           <w:lang w:val="es-DO"/>
         </w:rPr>
       </w:pPr>
@@ -8107,7 +7709,6 @@
       <w:pPr>
         <w:pStyle w:val="Listaconnmeros"/>
         <w:rPr>
-          <w:rFonts w:hint="eastAsia"/>
           <w:lang w:val="es-DO"/>
         </w:rPr>
       </w:pPr>
@@ -8121,7 +7722,6 @@
     <w:p>
       <w:pPr>
         <w:rPr>
-          <w:rFonts w:hint="eastAsia"/>
           <w:lang w:val="es-DO"/>
         </w:rPr>
       </w:pPr>
@@ -8144,7 +7744,6 @@
     <w:p>
       <w:pPr>
         <w:rPr>
-          <w:rFonts w:hint="eastAsia"/>
           <w:lang w:val="es-DO"/>
         </w:rPr>
       </w:pPr>
@@ -8169,7 +7768,6 @@
     <w:p>
       <w:pPr>
         <w:rPr>
-          <w:rFonts w:hint="eastAsia"/>
           <w:lang w:val="es-DO"/>
         </w:rPr>
       </w:pPr>
@@ -8185,7 +7783,6 @@
     <w:p>
       <w:pPr>
         <w:rPr>
-          <w:rFonts w:hint="eastAsia"/>
           <w:lang w:val="es-DO"/>
         </w:rPr>
       </w:pPr>
@@ -8216,7 +7813,6 @@
       <w:pPr>
         <w:pStyle w:val="Listaconnmeros"/>
         <w:rPr>
-          <w:rFonts w:hint="eastAsia"/>
           <w:lang w:val="es-DO"/>
         </w:rPr>
       </w:pPr>
@@ -8230,7 +7826,6 @@
     <w:p>
       <w:pPr>
         <w:rPr>
-          <w:rFonts w:hint="eastAsia"/>
           <w:lang w:val="es-DO"/>
         </w:rPr>
       </w:pPr>
@@ -8253,7 +7848,6 @@
     <w:p>
       <w:pPr>
         <w:rPr>
-          <w:rFonts w:hint="eastAsia"/>
           <w:lang w:val="es-DO"/>
         </w:rPr>
       </w:pPr>
@@ -8278,7 +7872,6 @@
     <w:p>
       <w:pPr>
         <w:rPr>
-          <w:rFonts w:hint="eastAsia"/>
           <w:lang w:val="es-DO"/>
         </w:rPr>
       </w:pPr>
@@ -8294,7 +7887,6 @@
     <w:p>
       <w:pPr>
         <w:rPr>
-          <w:rFonts w:hint="eastAsia"/>
           <w:lang w:val="es-DO"/>
         </w:rPr>
       </w:pPr>
@@ -8338,7 +7930,6 @@
       <w:pPr>
         <w:pStyle w:val="Listaconnmeros"/>
         <w:rPr>
-          <w:rFonts w:hint="eastAsia"/>
           <w:lang w:val="es-DO"/>
         </w:rPr>
       </w:pPr>
@@ -8353,7 +7944,6 @@
       <w:pPr>
         <w:pStyle w:val="Listaconnmeros"/>
         <w:rPr>
-          <w:rFonts w:hint="eastAsia"/>
           <w:lang w:val="es-DO"/>
         </w:rPr>
       </w:pPr>
@@ -8367,7 +7957,6 @@
     <w:p>
       <w:pPr>
         <w:rPr>
-          <w:rFonts w:hint="eastAsia"/>
           <w:lang w:val="es-DO"/>
         </w:rPr>
       </w:pPr>
@@ -8390,7 +7979,6 @@
     <w:p>
       <w:pPr>
         <w:rPr>
-          <w:rFonts w:hint="eastAsia"/>
           <w:lang w:val="es-DO"/>
         </w:rPr>
       </w:pPr>
@@ -8415,7 +8003,6 @@
     <w:p>
       <w:pPr>
         <w:rPr>
-          <w:rFonts w:hint="eastAsia"/>
           <w:lang w:val="es-DO"/>
         </w:rPr>
       </w:pPr>
@@ -8446,7 +8033,6 @@
       <w:pPr>
         <w:pStyle w:val="Listaconnmeros"/>
         <w:rPr>
-          <w:rFonts w:hint="eastAsia"/>
           <w:lang w:val="es-DO"/>
         </w:rPr>
       </w:pPr>
@@ -8461,7 +8047,6 @@
       <w:pPr>
         <w:pStyle w:val="Listaconnmeros"/>
         <w:rPr>
-          <w:rFonts w:hint="eastAsia"/>
           <w:lang w:val="es-DO"/>
         </w:rPr>
       </w:pPr>
@@ -8476,7 +8061,6 @@
       <w:pPr>
         <w:pStyle w:val="Listaconnmeros"/>
         <w:rPr>
-          <w:rFonts w:hint="eastAsia"/>
           <w:lang w:val="es-DO"/>
         </w:rPr>
       </w:pPr>
@@ -8490,7 +8074,6 @@
     <w:p>
       <w:pPr>
         <w:rPr>
-          <w:rFonts w:hint="eastAsia"/>
           <w:lang w:val="es-DO"/>
         </w:rPr>
       </w:pPr>
@@ -8513,7 +8096,6 @@
     <w:p>
       <w:pPr>
         <w:rPr>
-          <w:rFonts w:hint="eastAsia"/>
           <w:lang w:val="es-DO"/>
         </w:rPr>
       </w:pPr>
@@ -8538,7 +8120,6 @@
     <w:p>
       <w:pPr>
         <w:rPr>
-          <w:rFonts w:hint="eastAsia"/>
           <w:lang w:val="es-DO"/>
         </w:rPr>
       </w:pPr>
@@ -8569,7 +8150,6 @@
       <w:pPr>
         <w:pStyle w:val="Listaconnmeros"/>
         <w:rPr>
-          <w:rFonts w:hint="eastAsia"/>
           <w:lang w:val="es-DO"/>
         </w:rPr>
       </w:pPr>
@@ -8583,7 +8163,6 @@
     <w:p>
       <w:pPr>
         <w:rPr>
-          <w:rFonts w:hint="eastAsia"/>
           <w:lang w:val="es-DO"/>
         </w:rPr>
       </w:pPr>
@@ -8606,7 +8185,6 @@
     <w:p>
       <w:pPr>
         <w:rPr>
-          <w:rFonts w:hint="eastAsia"/>
           <w:lang w:val="es-DO"/>
         </w:rPr>
       </w:pPr>
@@ -8631,7 +8209,6 @@
     <w:p>
       <w:pPr>
         <w:rPr>
-          <w:rFonts w:hint="eastAsia"/>
           <w:lang w:val="es-DO"/>
         </w:rPr>
       </w:pPr>
@@ -8656,7 +8233,6 @@
       <w:pPr>
         <w:pStyle w:val="Listaconnmeros"/>
         <w:rPr>
-          <w:rFonts w:hint="eastAsia"/>
           <w:lang w:val="es-DO"/>
         </w:rPr>
       </w:pPr>
@@ -8670,7 +8246,6 @@
     <w:p>
       <w:pPr>
         <w:rPr>
-          <w:rFonts w:hint="eastAsia"/>
           <w:lang w:val="es-DO"/>
         </w:rPr>
       </w:pPr>
@@ -8693,7 +8268,6 @@
     <w:p>
       <w:pPr>
         <w:rPr>
-          <w:rFonts w:hint="eastAsia"/>
           <w:lang w:val="es-DO"/>
         </w:rPr>
       </w:pPr>
@@ -8718,7 +8292,6 @@
     <w:p>
       <w:pPr>
         <w:rPr>
-          <w:rFonts w:hint="eastAsia"/>
           <w:lang w:val="es-DO"/>
         </w:rPr>
       </w:pPr>
@@ -8749,7 +8322,6 @@
       <w:pPr>
         <w:pStyle w:val="Listaconnmeros"/>
         <w:rPr>
-          <w:rFonts w:hint="eastAsia"/>
           <w:lang w:val="es-DO"/>
         </w:rPr>
       </w:pPr>
@@ -8763,7 +8335,6 @@
     <w:p>
       <w:pPr>
         <w:rPr>
-          <w:rFonts w:hint="eastAsia"/>
           <w:lang w:val="es-DO"/>
         </w:rPr>
       </w:pPr>
@@ -8787,7 +8358,6 @@
     <w:p>
       <w:pPr>
         <w:rPr>
-          <w:rFonts w:hint="eastAsia"/>
           <w:lang w:val="es-DO"/>
         </w:rPr>
       </w:pPr>
@@ -8812,7 +8382,6 @@
     <w:p>
       <w:pPr>
         <w:rPr>
-          <w:rFonts w:hint="eastAsia"/>
           <w:lang w:val="es-DO"/>
         </w:rPr>
       </w:pPr>
@@ -8843,7 +8412,6 @@
       <w:pPr>
         <w:pStyle w:val="Listaconnmeros"/>
         <w:rPr>
-          <w:rFonts w:hint="eastAsia"/>
           <w:lang w:val="es-DO"/>
         </w:rPr>
       </w:pPr>
@@ -8857,7 +8425,6 @@
     <w:p>
       <w:pPr>
         <w:rPr>
-          <w:rFonts w:hint="eastAsia"/>
           <w:lang w:val="es-DO"/>
         </w:rPr>
       </w:pPr>
@@ -8880,7 +8447,6 @@
     <w:p>
       <w:pPr>
         <w:rPr>
-          <w:rFonts w:hint="eastAsia"/>
           <w:lang w:val="es-DO"/>
         </w:rPr>
       </w:pPr>
@@ -8905,7 +8471,6 @@
     <w:p>
       <w:pPr>
         <w:rPr>
-          <w:rFonts w:hint="eastAsia"/>
           <w:lang w:val="es-DO"/>
         </w:rPr>
       </w:pPr>
@@ -8921,7 +8486,6 @@
     <w:p>
       <w:pPr>
         <w:rPr>
-          <w:rFonts w:hint="eastAsia"/>
           <w:lang w:val="es-DO"/>
         </w:rPr>
       </w:pPr>
@@ -8965,7 +8529,6 @@
       <w:pPr>
         <w:pStyle w:val="Listaconnmeros"/>
         <w:rPr>
-          <w:rFonts w:hint="eastAsia"/>
           <w:lang w:val="es-DO"/>
         </w:rPr>
       </w:pPr>
@@ -8979,7 +8542,6 @@
     <w:p>
       <w:pPr>
         <w:rPr>
-          <w:rFonts w:hint="eastAsia"/>
           <w:lang w:val="es-DO"/>
         </w:rPr>
       </w:pPr>
@@ -9002,7 +8564,6 @@
     <w:p>
       <w:pPr>
         <w:rPr>
-          <w:rFonts w:hint="eastAsia"/>
           <w:lang w:val="es-DO"/>
         </w:rPr>
       </w:pPr>
@@ -9027,7 +8588,6 @@
     <w:p>
       <w:pPr>
         <w:rPr>
-          <w:rFonts w:hint="eastAsia"/>
           <w:lang w:val="es-DO"/>
         </w:rPr>
       </w:pPr>
@@ -9058,7 +8618,6 @@
       <w:pPr>
         <w:pStyle w:val="Listaconnmeros"/>
         <w:rPr>
-          <w:rFonts w:hint="eastAsia"/>
           <w:lang w:val="es-DO"/>
         </w:rPr>
       </w:pPr>
@@ -9072,7 +8631,6 @@
     <w:p>
       <w:pPr>
         <w:rPr>
-          <w:rFonts w:hint="eastAsia"/>
           <w:lang w:val="es-DO"/>
         </w:rPr>
       </w:pPr>
@@ -9095,7 +8653,6 @@
     <w:p>
       <w:pPr>
         <w:rPr>
-          <w:rFonts w:hint="eastAsia"/>
           <w:lang w:val="es-DO"/>
         </w:rPr>
       </w:pPr>
@@ -9120,7 +8677,6 @@
     <w:p>
       <w:pPr>
         <w:rPr>
-          <w:rFonts w:hint="eastAsia"/>
           <w:lang w:val="es-DO"/>
         </w:rPr>
       </w:pPr>
@@ -9151,7 +8707,6 @@
       <w:pPr>
         <w:pStyle w:val="Listaconnmeros"/>
         <w:rPr>
-          <w:rFonts w:hint="eastAsia"/>
           <w:lang w:val="es-DO"/>
         </w:rPr>
       </w:pPr>
@@ -9165,7 +8720,6 @@
     <w:p>
       <w:pPr>
         <w:rPr>
-          <w:rFonts w:hint="eastAsia"/>
           <w:lang w:val="es-DO"/>
         </w:rPr>
       </w:pPr>
@@ -9188,7 +8742,6 @@
     <w:p>
       <w:pPr>
         <w:rPr>
-          <w:rFonts w:hint="eastAsia"/>
           <w:lang w:val="es-DO"/>
         </w:rPr>
       </w:pPr>
@@ -9211,11 +8764,6 @@
       </w:r>
     </w:p>
     <w:p>
-      <w:pPr>
-        <w:rPr>
-          <w:rFonts w:hint="eastAsia"/>
-        </w:rPr>
-      </w:pPr>
       <w:r>
         <w:rPr>
           <w:color w:val="555555"/>
@@ -9236,7 +8784,6 @@
       <w:pPr>
         <w:pStyle w:val="Listaconnmeros"/>
         <w:rPr>
-          <w:rFonts w:hint="eastAsia"/>
           <w:lang w:val="es-DO"/>
         </w:rPr>
       </w:pPr>
@@ -9250,7 +8797,6 @@
     <w:p>
       <w:pPr>
         <w:rPr>
-          <w:rFonts w:hint="eastAsia"/>
           <w:lang w:val="es-DO"/>
         </w:rPr>
       </w:pPr>
@@ -9273,7 +8819,6 @@
     <w:p>
       <w:pPr>
         <w:rPr>
-          <w:rFonts w:hint="eastAsia"/>
           <w:lang w:val="es-DO"/>
         </w:rPr>
       </w:pPr>
@@ -9298,7 +8843,6 @@
     <w:p>
       <w:pPr>
         <w:rPr>
-          <w:rFonts w:hint="eastAsia"/>
           <w:lang w:val="es-DO"/>
         </w:rPr>
       </w:pPr>
@@ -9314,7 +8858,6 @@
     <w:p>
       <w:pPr>
         <w:rPr>
-          <w:rFonts w:hint="eastAsia"/>
           <w:lang w:val="es-DO"/>
         </w:rPr>
       </w:pPr>
@@ -9352,7 +8895,6 @@
       <w:pPr>
         <w:pStyle w:val="Listaconnmeros"/>
         <w:rPr>
-          <w:rFonts w:hint="eastAsia"/>
           <w:lang w:val="es-DO"/>
         </w:rPr>
       </w:pPr>
@@ -9366,7 +8908,6 @@
     <w:p>
       <w:pPr>
         <w:rPr>
-          <w:rFonts w:hint="eastAsia"/>
           <w:lang w:val="es-DO"/>
         </w:rPr>
       </w:pPr>
@@ -9389,7 +8930,6 @@
     <w:p>
       <w:pPr>
         <w:rPr>
-          <w:rFonts w:hint="eastAsia"/>
           <w:lang w:val="es-DO"/>
         </w:rPr>
       </w:pPr>
@@ -9412,11 +8952,6 @@
       </w:r>
     </w:p>
     <w:p>
-      <w:pPr>
-        <w:rPr>
-          <w:rFonts w:hint="eastAsia"/>
-        </w:rPr>
-      </w:pPr>
       <w:r>
         <w:rPr>
           <w:color w:val="555555"/>
@@ -9437,7 +8972,6 @@
       <w:pPr>
         <w:pStyle w:val="Listaconnmeros"/>
         <w:rPr>
-          <w:rFonts w:hint="eastAsia"/>
           <w:lang w:val="es-DO"/>
         </w:rPr>
       </w:pPr>
@@ -9451,7 +8985,6 @@
     <w:p>
       <w:pPr>
         <w:rPr>
-          <w:rFonts w:hint="eastAsia"/>
           <w:lang w:val="es-DO"/>
         </w:rPr>
       </w:pPr>
@@ -9474,7 +9007,6 @@
     <w:p>
       <w:pPr>
         <w:rPr>
-          <w:rFonts w:hint="eastAsia"/>
           <w:lang w:val="es-DO"/>
         </w:rPr>
       </w:pPr>
@@ -9499,7 +9031,6 @@
     <w:p>
       <w:pPr>
         <w:rPr>
-          <w:rFonts w:hint="eastAsia"/>
           <w:lang w:val="es-DO"/>
         </w:rPr>
       </w:pPr>
@@ -9530,7 +9061,6 @@
       <w:pPr>
         <w:pStyle w:val="Listaconnmeros"/>
         <w:rPr>
-          <w:rFonts w:hint="eastAsia"/>
           <w:lang w:val="es-DO"/>
         </w:rPr>
       </w:pPr>
@@ -9544,7 +9074,6 @@
     <w:p>
       <w:pPr>
         <w:rPr>
-          <w:rFonts w:hint="eastAsia"/>
           <w:lang w:val="es-DO"/>
         </w:rPr>
       </w:pPr>
@@ -9567,7 +9096,6 @@
     <w:p>
       <w:pPr>
         <w:rPr>
-          <w:rFonts w:hint="eastAsia"/>
           <w:lang w:val="es-DO"/>
         </w:rPr>
       </w:pPr>
@@ -9592,7 +9120,6 @@
     <w:p>
       <w:pPr>
         <w:rPr>
-          <w:rFonts w:hint="eastAsia"/>
           <w:lang w:val="es-DO"/>
         </w:rPr>
       </w:pPr>
@@ -9623,7 +9150,6 @@
       <w:pPr>
         <w:pStyle w:val="Listaconnmeros"/>
         <w:rPr>
-          <w:rFonts w:hint="eastAsia"/>
           <w:lang w:val="es-DO"/>
         </w:rPr>
       </w:pPr>
@@ -9637,7 +9163,6 @@
     <w:p>
       <w:pPr>
         <w:rPr>
-          <w:rFonts w:hint="eastAsia"/>
           <w:lang w:val="es-DO"/>
         </w:rPr>
       </w:pPr>
@@ -9660,7 +9185,6 @@
     <w:p>
       <w:pPr>
         <w:rPr>
-          <w:rFonts w:hint="eastAsia"/>
           <w:lang w:val="es-DO"/>
         </w:rPr>
       </w:pPr>
@@ -9685,7 +9209,6 @@
     <w:p>
       <w:pPr>
         <w:rPr>
-          <w:rFonts w:hint="eastAsia"/>
           <w:lang w:val="es-DO"/>
         </w:rPr>
       </w:pPr>
@@ -9701,7 +9224,6 @@
     <w:p>
       <w:pPr>
         <w:rPr>
-          <w:rFonts w:hint="eastAsia"/>
           <w:lang w:val="es-DO"/>
         </w:rPr>
       </w:pPr>
@@ -9745,7 +9267,6 @@
       <w:pPr>
         <w:pStyle w:val="Listaconnmeros"/>
         <w:rPr>
-          <w:rFonts w:hint="eastAsia"/>
           <w:lang w:val="es-DO"/>
         </w:rPr>
       </w:pPr>
@@ -9759,7 +9280,6 @@
     <w:p>
       <w:pPr>
         <w:rPr>
-          <w:rFonts w:hint="eastAsia"/>
           <w:lang w:val="es-DO"/>
         </w:rPr>
       </w:pPr>
@@ -9782,7 +9302,6 @@
     <w:p>
       <w:pPr>
         <w:rPr>
-          <w:rFonts w:hint="eastAsia"/>
           <w:lang w:val="es-DO"/>
         </w:rPr>
       </w:pPr>
@@ -9807,7 +9326,6 @@
     <w:p>
       <w:pPr>
         <w:rPr>
-          <w:rFonts w:hint="eastAsia"/>
           <w:lang w:val="es-DO"/>
         </w:rPr>
       </w:pPr>
@@ -9838,7 +9356,6 @@
       <w:pPr>
         <w:pStyle w:val="Listaconnmeros"/>
         <w:rPr>
-          <w:rFonts w:hint="eastAsia"/>
           <w:lang w:val="es-DO"/>
         </w:rPr>
       </w:pPr>
@@ -9853,7 +9370,6 @@
       <w:pPr>
         <w:pStyle w:val="Listaconnmeros"/>
         <w:rPr>
-          <w:rFonts w:hint="eastAsia"/>
           <w:lang w:val="es-DO"/>
         </w:rPr>
       </w:pPr>
@@ -9867,7 +9383,6 @@
     <w:p>
       <w:pPr>
         <w:rPr>
-          <w:rFonts w:hint="eastAsia"/>
           <w:lang w:val="es-DO"/>
         </w:rPr>
       </w:pPr>
@@ -9890,7 +9405,6 @@
     <w:p>
       <w:pPr>
         <w:rPr>
-          <w:rFonts w:hint="eastAsia"/>
           <w:lang w:val="es-DO"/>
         </w:rPr>
       </w:pPr>
@@ -9913,11 +9427,6 @@
       </w:r>
     </w:p>
     <w:p>
-      <w:pPr>
-        <w:rPr>
-          <w:rFonts w:hint="eastAsia"/>
-        </w:rPr>
-      </w:pPr>
       <w:r>
         <w:rPr>
           <w:color w:val="555555"/>
@@ -9938,7 +9447,6 @@
       <w:pPr>
         <w:pStyle w:val="Listaconnmeros"/>
         <w:rPr>
-          <w:rFonts w:hint="eastAsia"/>
           <w:lang w:val="es-DO"/>
         </w:rPr>
       </w:pPr>
@@ -9952,7 +9460,6 @@
     <w:p>
       <w:pPr>
         <w:rPr>
-          <w:rFonts w:hint="eastAsia"/>
           <w:lang w:val="es-DO"/>
         </w:rPr>
       </w:pPr>
@@ -9975,7 +9482,6 @@
     <w:p>
       <w:pPr>
         <w:rPr>
-          <w:rFonts w:hint="eastAsia"/>
           <w:lang w:val="es-DO"/>
         </w:rPr>
       </w:pPr>
@@ -10000,7 +9506,6 @@
     <w:p>
       <w:pPr>
         <w:rPr>
-          <w:rFonts w:hint="eastAsia"/>
           <w:lang w:val="es-DO"/>
         </w:rPr>
       </w:pPr>
@@ -10016,7 +9521,6 @@
     <w:p>
       <w:pPr>
         <w:rPr>
-          <w:rFonts w:hint="eastAsia"/>
           <w:lang w:val="es-DO"/>
         </w:rPr>
       </w:pPr>
@@ -10045,7 +9549,6 @@
     <w:p>
       <w:pPr>
         <w:rPr>
-          <w:rFonts w:hint="eastAsia"/>
           <w:lang w:val="es-DO"/>
         </w:rPr>
       </w:pPr>
@@ -10072,11 +9575,6 @@
             <w:tcW w:w="3118" w:type="dxa"/>
           </w:tcPr>
           <w:p>
-            <w:pPr>
-              <w:rPr>
-                <w:rFonts w:hint="eastAsia"/>
-              </w:rPr>
-            </w:pPr>
             <w:r>
               <w:rPr>
                 <w:b/>
@@ -10091,11 +9589,6 @@
             <w:tcW w:w="6520" w:type="dxa"/>
           </w:tcPr>
           <w:p>
-            <w:pPr>
-              <w:rPr>
-                <w:rFonts w:hint="eastAsia"/>
-              </w:rPr>
-            </w:pPr>
             <w:r>
               <w:rPr>
                 <w:b/>
@@ -10114,7 +9607,6 @@
           <w:p>
             <w:pPr>
               <w:rPr>
-                <w:rFonts w:hint="eastAsia"/>
                 <w:lang w:val="es-DO"/>
               </w:rPr>
             </w:pPr>
@@ -10133,7 +9625,6 @@
           <w:p>
             <w:pPr>
               <w:rPr>
-                <w:rFonts w:hint="eastAsia"/>
                 <w:lang w:val="es-DO"/>
               </w:rPr>
             </w:pPr>
@@ -10152,11 +9643,6 @@
             <w:tcW w:w="3118" w:type="dxa"/>
           </w:tcPr>
           <w:p>
-            <w:pPr>
-              <w:rPr>
-                <w:rFonts w:hint="eastAsia"/>
-              </w:rPr>
-            </w:pPr>
             <w:r>
               <w:t>Monitor del Central</w:t>
             </w:r>
@@ -10169,7 +9655,6 @@
           <w:p>
             <w:pPr>
               <w:rPr>
-                <w:rFonts w:hint="eastAsia"/>
                 <w:lang w:val="es-DO"/>
               </w:rPr>
             </w:pPr>
@@ -10188,11 +9673,6 @@
             <w:tcW w:w="3118" w:type="dxa"/>
           </w:tcPr>
           <w:p>
-            <w:pPr>
-              <w:rPr>
-                <w:rFonts w:hint="eastAsia"/>
-              </w:rPr>
-            </w:pPr>
             <w:r>
               <w:t>Seguridad → Auditoría</w:t>
             </w:r>
@@ -10205,7 +9685,6 @@
           <w:p>
             <w:pPr>
               <w:rPr>
-                <w:rFonts w:hint="eastAsia"/>
                 <w:lang w:val="es-DO"/>
               </w:rPr>
             </w:pPr>
@@ -10224,11 +9703,6 @@
             <w:tcW w:w="3118" w:type="dxa"/>
           </w:tcPr>
           <w:p>
-            <w:pPr>
-              <w:rPr>
-                <w:rFonts w:hint="eastAsia"/>
-              </w:rPr>
-            </w:pPr>
             <w:r>
               <w:t>Monitor → Comprobantes</w:t>
             </w:r>
@@ -10241,7 +9715,6 @@
           <w:p>
             <w:pPr>
               <w:rPr>
-                <w:rFonts w:hint="eastAsia"/>
                 <w:lang w:val="es-DO"/>
               </w:rPr>
             </w:pPr>
@@ -10260,11 +9733,6 @@
             <w:tcW w:w="3118" w:type="dxa"/>
           </w:tcPr>
           <w:p>
-            <w:pPr>
-              <w:rPr>
-                <w:rFonts w:hint="eastAsia"/>
-              </w:rPr>
-            </w:pPr>
             <w:r>
               <w:t>C:\CGPOS\Logs</w:t>
             </w:r>
@@ -10277,7 +9745,6 @@
           <w:p>
             <w:pPr>
               <w:rPr>
-                <w:rFonts w:hint="eastAsia"/>
                 <w:lang w:val="es-DO"/>
               </w:rPr>
             </w:pPr>
@@ -10294,15 +9761,13 @@
     <w:p>
       <w:pPr>
         <w:rPr>
-          <w:rFonts w:hint="eastAsia"/>
-          <w:lang w:val="es-DO"/>
-        </w:rPr>
-      </w:pPr>
-    </w:p>
-    <w:p>
-      <w:pPr>
-        <w:rPr>
-          <w:rFonts w:hint="eastAsia"/>
+          <w:lang w:val="es-DO"/>
+        </w:rPr>
+      </w:pPr>
+    </w:p>
+    <w:p>
+      <w:pPr>
+        <w:rPr>
           <w:lang w:val="es-DO"/>
         </w:rPr>
       </w:pPr>
@@ -10332,7 +9797,6 @@
     <w:p>
       <w:pPr>
         <w:rPr>
-          <w:rFonts w:hint="eastAsia"/>
           <w:lang w:val="es-DO"/>
         </w:rPr>
       </w:pPr>
@@ -10344,11 +9808,6 @@
       </w:r>
     </w:p>
     <w:p>
-      <w:pPr>
-        <w:rPr>
-          <w:rFonts w:hint="eastAsia"/>
-        </w:rPr>
-      </w:pPr>
       <w:r>
         <w:rPr>
           <w:lang w:val="es-DO"/>
@@ -10360,11 +9819,6 @@
       </w:r>
     </w:p>
     <w:p>
-      <w:pPr>
-        <w:rPr>
-          <w:rFonts w:hint="eastAsia"/>
-        </w:rPr>
-      </w:pPr>
       <w:r>
         <w:t xml:space="preserve">    SELECT TOP 20 * FROM Auditoria ORDER BY Id DESC;</w:t>
       </w:r>
@@ -10372,7 +9826,6 @@
     <w:p>
       <w:pPr>
         <w:rPr>
-          <w:rFonts w:hint="eastAsia"/>
           <w:lang w:val="es-DO"/>
         </w:rPr>
       </w:pPr>

</xml_diff>

<commit_message>
feat(central): /salud dice si el chequeador de precios está encendido
Es la primera pregunta del técnico que instala la pantalla del pasillo y la ve en blanco: el
chequeador viene apagado de fábrica y, apagado, no responde nada. Ahora /salud lo dice y
recuerda con qué parámetro se enciende.

Apagado no cuenta como falla: hay tiendas que no lo usan.

Co-Authored-By: Claude Opus 5 (1M context) <noreply@anthropic.com>
</commit_message>
<xml_diff>
--- a/scripts/manual/Guia de pruebas CG-POS.docx
+++ b/scripts/manual/Guia de pruebas CG-POS.docx
@@ -1513,9 +1513,18 @@
         <w:rPr>
           <w:color w:val="555555"/>
           <w:sz w:val="19"/>
-          <w:lang w:val="es-DO"/>
-        </w:rPr>
-        <w:t>☐ Pasó          ☐ Falló          Observación: ______________________________________________</w:t>
+          <w:highlight w:val="yellow"/>
+          <w:lang w:val="es-DO"/>
+        </w:rPr>
+        <w:t>☐</w:t>
+      </w:r>
+      <w:r>
+        <w:rPr>
+          <w:color w:val="555555"/>
+          <w:sz w:val="19"/>
+          <w:lang w:val="es-DO"/>
+        </w:rPr>
+        <w:t xml:space="preserve"> Pasó          ☐ Falló          Observación: ______________________________________________</w:t>
       </w:r>
     </w:p>
     <w:p>
@@ -1602,9 +1611,18 @@
         <w:rPr>
           <w:color w:val="555555"/>
           <w:sz w:val="19"/>
-          <w:lang w:val="es-DO"/>
-        </w:rPr>
-        <w:t>☐ Pasó          ☐ Falló          Observación: ______________________________________________</w:t>
+          <w:highlight w:val="yellow"/>
+          <w:lang w:val="es-DO"/>
+        </w:rPr>
+        <w:t>☐</w:t>
+      </w:r>
+      <w:r>
+        <w:rPr>
+          <w:color w:val="555555"/>
+          <w:sz w:val="19"/>
+          <w:lang w:val="es-DO"/>
+        </w:rPr>
+        <w:t xml:space="preserve"> Pasó          ☐ Falló          Observación: ______________________________________________</w:t>
       </w:r>
     </w:p>
     <w:p>

</xml_diff>

<commit_message>
feat(caja): botón «Sincronizar» para no esperar el ciclo automático
Cuando en el Central cambian un precio o crean un artículo, en la tienda lo quieren ver ya, y
hasta ahora la única salida era esperar el intervalo o reiniciar el servicio.

- El botón corre el mismo trabajo del ciclo de fondo (bajar maestros y subir la bandeja) y
  comparte su candado: si el servicio ya está sincronizando, se espera en vez de duplicarlo.
- El modal muestra la etapa y el avance reales, y se puede cerrar con «Seguir trabajando»: la
  sincronización corre en el servicio, no en la pantalla, así que la caja no queda muerta con
  gente en fila.
- No se sincroniza con una venta empezada: bajar precios a mitad de factura dejaría dos
  precios del mismo artículo en el mismo ticket.

Co-Authored-By: Claude Opus 5 (1M context) <noreply@anthropic.com>
</commit_message>
<xml_diff>
--- a/scripts/manual/Guia de pruebas CG-POS.docx
+++ b/scripts/manual/Guia de pruebas CG-POS.docx
@@ -5766,6 +5766,87 @@
           <w:sz w:val="19"/>
         </w:rPr>
         <w:t>Caja: BandejaSalida · MarcasSincronizacion · Central: DocumentosRecibidos · VentasCentral · EstadosSincronizacionCaja</w:t>
+      </w:r>
+    </w:p>
+    <w:p>
+      <w:r>
+        <w:rPr>
+          <w:color w:val="555555"/>
+          <w:sz w:val="19"/>
+        </w:rPr>
+        <w:t>☐ Pasó          ☐ Falló          Observación: ______________________________________________</w:t>
+      </w:r>
+    </w:p>
+    <w:p>
+      <w:pPr>
+        <w:pStyle w:val="Heading3"/>
+      </w:pPr>
+      <w:r>
+        <w:t>R2b · Sincronizar ahora desde la caja</w:t>
+      </w:r>
+    </w:p>
+    <w:p>
+      <w:pPr>
+        <w:pStyle w:val="ListNumber"/>
+      </w:pPr>
+      <w:r>
+        <w:t>En el Central, cambie el precio de un artículo.</w:t>
+      </w:r>
+    </w:p>
+    <w:p>
+      <w:pPr>
+        <w:pStyle w:val="ListNumber"/>
+      </w:pPr>
+      <w:r>
+        <w:t>En la caja, con la venta vacía, abra el panel de funciones (☰) y presione «Sincronizar».</w:t>
+      </w:r>
+    </w:p>
+    <w:p>
+      <w:pPr>
+        <w:pStyle w:val="ListNumber"/>
+      </w:pPr>
+      <w:r>
+        <w:t>Mientras corre, presione «Seguir trabajando» y siga en la pantalla de venta.</w:t>
+      </w:r>
+    </w:p>
+    <w:p>
+      <w:pPr>
+        <w:pStyle w:val="ListNumber"/>
+      </w:pPr>
+      <w:r>
+        <w:t>Intente sincronizar otra vez con una venta que tenga artículos.</w:t>
+      </w:r>
+    </w:p>
+    <w:p>
+      <w:r>
+        <w:rPr>
+          <w:b/>
+          <w:color w:val="1B4D3E"/>
+        </w:rPr>
+        <w:t xml:space="preserve">Debe pasar: </w:t>
+      </w:r>
+      <w:r>
+        <w:rPr>
+          <w:color w:val="555555"/>
+        </w:rPr>
+        <w:t>El modal dice en qué anda y al terminar resume qué bajó y qué subió. Al cerrarlo, la caja sigue funcionando y el artículo ya tiene el precio nuevo. Con una venta empezada no deja sincronizar y explica por qué.</w:t>
+      </w:r>
+    </w:p>
+    <w:p>
+      <w:r>
+        <w:rPr>
+          <w:b/>
+          <w:color w:val="2E7D32"/>
+          <w:sz w:val="19"/>
+        </w:rPr>
+        <w:t xml:space="preserve">Tablas: </w:t>
+      </w:r>
+      <w:r>
+        <w:rPr>
+          <w:color w:val="555555"/>
+          <w:sz w:val="19"/>
+        </w:rPr>
+        <w:t>Caja: los maestros que hayan cambiado · BandejaSalida · MarcasSincronizacion</w:t>
       </w:r>
     </w:p>
     <w:p>

</xml_diff>

<commit_message>
feat(caja): suspender con motivo, cronómetro grande y reporte de tiempos de caja parada
El cajero elige por qué deja la caja (los motivos los configura el negocio en el
Central) y la pantalla se bloquea con el conteo en grande y el botón Regresar
debajo. El motivo «Otro» pide escribir en qué consistió.

Cada rato parado se cierra al regresar —o al cerrar el turno, si nadie volvió, y
queda marcado— y sube al Central, donde el módulo de cuadre lo muestra en la
pestaña «Caja parada»: por caja, por cajera y por motivo, con el tiempo previsto
separado del imprevisto.

Co-Authored-By: Claude Opus 5 (1M context) <noreply@anthropic.com>
</commit_message>
<xml_diff>
--- a/scripts/manual/Guia de pruebas CG-POS.docx
+++ b/scripts/manual/Guia de pruebas CG-POS.docx
@@ -2871,24 +2871,11 @@
       </w:r>
     </w:p>
     <w:p>
-      <w:r>
-        <w:br w:type="page"/>
-      </w:r>
-    </w:p>
-    <w:p>
-      <w:pPr>
-        <w:pStyle w:val="Heading1"/>
-      </w:pPr>
-      <w:r>
-        <w:t>Bloque I — Cobro y ticket</w:t>
-      </w:r>
-    </w:p>
-    <w:p>
       <w:pPr>
         <w:pStyle w:val="Heading3"/>
       </w:pPr>
       <w:r>
-        <w:t>I1 · Efectivo con devuelta</w:t>
+        <w:t>H5 · Suspender la caja con su motivo</w:t>
       </w:r>
     </w:p>
     <w:p>
@@ -2896,7 +2883,31 @@
         <w:pStyle w:val="ListNumber"/>
       </w:pPr>
       <w:r>
-        <w:t>Presione F8, elija Efectivo, digite un monto mayor al total y cobre.</w:t>
+        <w:t>Con una venta a medias en pantalla, abra el panel de funciones (☰) y presione «Suspender».</w:t>
+      </w:r>
+    </w:p>
+    <w:p>
+      <w:pPr>
+        <w:pStyle w:val="ListNumber"/>
+      </w:pPr>
+      <w:r>
+        <w:t>Elija el motivo «Almuerzo» y autorice con el supervisor.</w:t>
+      </w:r>
+    </w:p>
+    <w:p>
+      <w:pPr>
+        <w:pStyle w:val="ListNumber"/>
+      </w:pPr>
+      <w:r>
+        <w:t>Vuelva un rato después: digite la clave del mismo cajero y presione «Regresar», debajo del conteo.</w:t>
+      </w:r>
+    </w:p>
+    <w:p>
+      <w:pPr>
+        <w:pStyle w:val="ListNumber"/>
+      </w:pPr>
+      <w:r>
+        <w:t>Repita con el motivo «Otro» y déjelo sin escribir la explicación.</w:t>
       </w:r>
     </w:p>
     <w:p>
@@ -2911,7 +2922,7 @@
         <w:rPr>
           <w:color w:val="555555"/>
         </w:rPr>
-        <w:t>La devuelta se ve grande y clara antes y después de cobrar, la gaveta se abre y el ticket sale impreso.</w:t>
+        <w:t>La pantalla se bloquea con un cronómetro grande y la línea «cajero · motivo». Al regresar, la venta que estaba en pantalla sigue ahí completa. El motivo «Otro» no deja seguir hasta que se escriba en qué consistió.</w:t>
       </w:r>
     </w:p>
     <w:p>
@@ -2928,7 +2939,7 @@
           <w:color w:val="555555"/>
           <w:sz w:val="19"/>
         </w:rPr>
-        <w:t>Caja: Ventas · LineasVenta · PagosVenta · SecuenciasCaja · DocumentosElectronicos · BandejaSalida</w:t>
+        <w:t>Caja: MotivosSuspension (lee) · SuspensionesCaja · AutorizacionesOtorgadas · Auditoria · BandejaSalida</w:t>
       </w:r>
     </w:p>
     <w:p>
@@ -2945,7 +2956,7 @@
         <w:pStyle w:val="Heading3"/>
       </w:pPr>
       <w:r>
-        <w:t>I2 · Pago mixto</w:t>
+        <w:t>H6 · Nadie volvió a la caja</w:t>
       </w:r>
     </w:p>
     <w:p>
@@ -2953,7 +2964,7 @@
         <w:pStyle w:val="ListNumber"/>
       </w:pPr>
       <w:r>
-        <w:t>Cobre otra venta con parte en efectivo y el resto con tarjeta.</w:t>
+        <w:t>Suspenda la caja y, sin reanudar, cierre el turno desde el supervisor.</w:t>
       </w:r>
     </w:p>
     <w:p>
@@ -2968,7 +2979,7 @@
         <w:rPr>
           <w:color w:val="555555"/>
         </w:rPr>
-        <w:t>El saldo pendiente se va actualizando con cada pago y no deja cerrar hasta que llega a cero.</w:t>
+        <w:t>El cierre no se traba: la parada se cierra ahí y queda marcada como cerrada por el cierre del turno, para que no aparezca de catorce horas en el reporte.</w:t>
       </w:r>
     </w:p>
     <w:p>
@@ -2985,7 +2996,7 @@
           <w:color w:val="555555"/>
           <w:sz w:val="19"/>
         </w:rPr>
-        <w:t>Caja: PagosVenta</w:t>
+        <w:t>Caja: SuspensionesCaja · Turnos · BandejaSalida</w:t>
       </w:r>
     </w:p>
     <w:p>
@@ -2998,11 +3009,24 @@
       </w:r>
     </w:p>
     <w:p>
+      <w:r>
+        <w:br w:type="page"/>
+      </w:r>
+    </w:p>
+    <w:p>
+      <w:pPr>
+        <w:pStyle w:val="Heading1"/>
+      </w:pPr>
+      <w:r>
+        <w:t>Bloque I — Cobro y ticket</w:t>
+      </w:r>
+    </w:p>
+    <w:p>
       <w:pPr>
         <w:pStyle w:val="Heading3"/>
       </w:pPr>
       <w:r>
-        <w:t>I3 · Tarjeta con el terminal conectado, rechazo y contingencia</w:t>
+        <w:t>I1 · Efectivo con devuelta</w:t>
       </w:r>
     </w:p>
     <w:p>
@@ -3010,23 +3034,7 @@
         <w:pStyle w:val="ListNumber"/>
       </w:pPr>
       <w:r>
-        <w:t>Cobre una venta con tarjeta: la caja le manda el monto al terminal y el cliente paga ahí.</w:t>
-      </w:r>
-    </w:p>
-    <w:p>
-      <w:pPr>
-        <w:pStyle w:val="ListNumber"/>
-      </w:pPr>
-      <w:r>
-        <w:t>Haga que el terminal rechace un cobro (o simúlelo) y observe qué pasa.</w:t>
-      </w:r>
-    </w:p>
-    <w:p>
-      <w:pPr>
-        <w:pStyle w:val="ListNumber"/>
-      </w:pPr>
-      <w:r>
-        <w:t>Desconecte el terminal de la red y pruebe otra vez: use la aprobación manual con el permiso correspondiente.</w:t>
+        <w:t>Presione F8, elija Efectivo, digite un monto mayor al total y cobre.</w:t>
       </w:r>
     </w:p>
     <w:p>
@@ -3041,7 +3049,7 @@
         <w:rPr>
           <w:color w:val="555555"/>
         </w:rPr>
-        <w:t>Con el terminal conectado, la aprobación llega sola y nadie digita nada. El rechazo no cobra la venta ni la daña: se puede reintentar. Si el terminal no responde, la aprobación manual pide autorización de supervisor y queda marcada para conciliarla después contra el lote.</w:t>
+        <w:t>La devuelta se ve grande y clara antes y después de cobrar, la gaveta se abre y el ticket sale impreso.</w:t>
       </w:r>
     </w:p>
     <w:p>
@@ -3058,7 +3066,7 @@
           <w:color w:val="555555"/>
           <w:sz w:val="19"/>
         </w:rPr>
-        <w:t>Caja: OperacionesTerminal · PagosVenta · Auditoria</w:t>
+        <w:t>Caja: Ventas · LineasVenta · PagosVenta · SecuenciasCaja · DocumentosElectronicos · BandejaSalida</w:t>
       </w:r>
     </w:p>
     <w:p>
@@ -3075,7 +3083,7 @@
         <w:pStyle w:val="Heading3"/>
       </w:pPr>
       <w:r>
-        <w:t>I3b · Caja sin terminal conectado (se cobra en un equipo aparte)</w:t>
+        <w:t>I2 · Pago mixto</w:t>
       </w:r>
     </w:p>
     <w:p>
@@ -3083,23 +3091,7 @@
         <w:pStyle w:val="ListNumber"/>
       </w:pPr>
       <w:r>
-        <w:t>En la configuración de la caja, ponga el terminal en «Ninguno» y reinicie el servicio.</w:t>
-      </w:r>
-    </w:p>
-    <w:p>
-      <w:pPr>
-        <w:pStyle w:val="ListNumber"/>
-      </w:pPr>
-      <w:r>
-        <w:t>Cobre una venta con tarjeta: cobre en el verifone aparte y digite el número de aprobación de su volante y los últimos cuatro dígitos.</w:t>
-      </w:r>
-    </w:p>
-    <w:p>
-      <w:pPr>
-        <w:pStyle w:val="ListNumber"/>
-      </w:pPr>
-      <w:r>
-        <w:t>Intente también cobrar con tarjeta sin escribir el número de aprobación.</w:t>
+        <w:t>Cobre otra venta con parte en efectivo y el resto con tarjeta.</w:t>
       </w:r>
     </w:p>
     <w:p>
@@ -3114,7 +3106,7 @@
         <w:rPr>
           <w:color w:val="555555"/>
         </w:rPr>
-        <w:t>La pantalla no ofrece «Pasar tarjeta» sino el número de aprobación, y no pide autorización de supervisor: en esa caja es la forma normal de cobrar. Sin el número no deja cobrar, porque después no habría con qué cuadrar el turno contra los volantes.</w:t>
+        <w:t>El saldo pendiente se va actualizando con cada pago y no deja cerrar hasta que llega a cero.</w:t>
       </w:r>
     </w:p>
     <w:p>
@@ -3131,7 +3123,7 @@
           <w:color w:val="555555"/>
           <w:sz w:val="19"/>
         </w:rPr>
-        <w:t>Caja: Ventas · LineasVenta · PagosVenta (con la aprobación digitada) · Auditoria</w:t>
+        <w:t>Caja: PagosVenta</w:t>
       </w:r>
     </w:p>
     <w:p>
@@ -3144,20 +3136,11 @@
       </w:r>
     </w:p>
     <w:p>
-      <w:r>
-        <w:rPr>
-          <w:i/>
-          <w:color w:val="2E7D32"/>
-        </w:rPr>
-        <w:t>Deje el terminal como estaba antes de seguir. Este modo es para las tiendas que cobran con un equipo inalámbrico que no habla con la caja; en «Simulado» el sistema aprueba solo, y eso en una tienda registraría cobros que no ocurrieron.</w:t>
-      </w:r>
-    </w:p>
-    <w:p>
       <w:pPr>
         <w:pStyle w:val="Heading3"/>
       </w:pPr>
       <w:r>
-        <w:t>I3c · Un terminal mal configurado se nota</w:t>
+        <w:t>I3 · Tarjeta con el terminal conectado, rechazo y contingencia</w:t>
       </w:r>
     </w:p>
     <w:p>
@@ -3165,7 +3148,7 @@
         <w:pStyle w:val="ListNumber"/>
       </w:pPr>
       <w:r>
-        <w:t>Escriba un modelo de terminal que no exista (por ejemplo «Azul») y reinicie el servicio.</w:t>
+        <w:t>Cobre una venta con tarjeta: la caja le manda el monto al terminal y el cliente paga ahí.</w:t>
       </w:r>
     </w:p>
     <w:p>
@@ -3173,7 +3156,15 @@
         <w:pStyle w:val="ListNumber"/>
       </w:pPr>
       <w:r>
-        <w:t>Revise el registro del Agente y la dirección /salud.</w:t>
+        <w:t>Haga que el terminal rechace un cobro (o simúlelo) y observe qué pasa.</w:t>
+      </w:r>
+    </w:p>
+    <w:p>
+      <w:pPr>
+        <w:pStyle w:val="ListNumber"/>
+      </w:pPr>
+      <w:r>
+        <w:t>Desconecte el terminal de la red y pruebe otra vez: use la aprobación manual con el permiso correspondiente.</w:t>
       </w:r>
     </w:p>
     <w:p>
@@ -3188,7 +3179,7 @@
         <w:rPr>
           <w:color w:val="555555"/>
         </w:rPr>
-        <w:t>El log avisa que ese modelo no está implementado y dice cuáles hay. En /salud, la sección Periféricos muestra con qué quedó configurada la caja: impresora, balanza y terminal, y cuáles están simulados.</w:t>
+        <w:t>Con el terminal conectado, la aprobación llega sola y nadie digita nada. El rechazo no cobra la venta ni la daña: se puede reintentar. Si el terminal no responde, la aprobación manual pide autorización de supervisor y queda marcada para conciliarla después contra el lote.</w:t>
       </w:r>
     </w:p>
     <w:p>
@@ -3205,7 +3196,7 @@
           <w:color w:val="555555"/>
           <w:sz w:val="19"/>
         </w:rPr>
-        <w:t>Ninguna: es configuración del equipo, no datos</w:t>
+        <w:t>Caja: OperacionesTerminal · PagosVenta · Auditoria</w:t>
       </w:r>
     </w:p>
     <w:p>
@@ -3222,7 +3213,7 @@
         <w:pStyle w:val="Heading3"/>
       </w:pPr>
       <w:r>
-        <w:t>I4 · Revisar el ticket</w:t>
+        <w:t>I3b · Caja sin terminal conectado (se cobra en un equipo aparte)</w:t>
       </w:r>
     </w:p>
     <w:p>
@@ -3230,7 +3221,23 @@
         <w:pStyle w:val="ListNumber"/>
       </w:pPr>
       <w:r>
-        <w:t>Mire el ticket impreso con calma.</w:t>
+        <w:t>En la configuración de la caja, ponga el terminal en «Ninguno» y reinicie el servicio.</w:t>
+      </w:r>
+    </w:p>
+    <w:p>
+      <w:pPr>
+        <w:pStyle w:val="ListNumber"/>
+      </w:pPr>
+      <w:r>
+        <w:t>Cobre una venta con tarjeta: cobre en el verifone aparte y digite el número de aprobación de su volante y los últimos cuatro dígitos.</w:t>
+      </w:r>
+    </w:p>
+    <w:p>
+      <w:pPr>
+        <w:pStyle w:val="ListNumber"/>
+      </w:pPr>
+      <w:r>
+        <w:t>Intente también cobrar con tarjeta sin escribir el número de aprobación.</w:t>
       </w:r>
     </w:p>
     <w:p>
@@ -3245,7 +3252,7 @@
         <w:rPr>
           <w:color w:val="555555"/>
         </w:rPr>
-        <w:t>Trae los datos de la empresa, el detalle con sus descuentos, el ITBIS, el total, la forma de pago, la devuelta, el e-NCF con su código de seguridad y el código QR.</w:t>
+        <w:t>La pantalla no ofrece «Pasar tarjeta» sino el número de aprobación, y no pide autorización de supervisor: en esa caja es la forma normal de cobrar. Sin el número no deja cobrar, porque después no habría con qué cuadrar el turno contra los volantes.</w:t>
       </w:r>
     </w:p>
     <w:p>
@@ -3262,7 +3269,7 @@
           <w:color w:val="555555"/>
           <w:sz w:val="19"/>
         </w:rPr>
-        <w:t>Ninguna: el ticket se imprime con lo que ya se guardó al cobrar</w:t>
+        <w:t>Caja: Ventas · LineasVenta · PagosVenta (con la aprobación digitada) · Auditoria</w:t>
       </w:r>
     </w:p>
     <w:p>
@@ -3275,11 +3282,20 @@
       </w:r>
     </w:p>
     <w:p>
+      <w:r>
+        <w:rPr>
+          <w:i/>
+          <w:color w:val="2E7D32"/>
+        </w:rPr>
+        <w:t>Deje el terminal como estaba antes de seguir. Este modo es para las tiendas que cobran con un equipo inalámbrico que no habla con la caja; en «Simulado» el sistema aprueba solo, y eso en una tienda registraría cobros que no ocurrieron.</w:t>
+      </w:r>
+    </w:p>
+    <w:p>
       <w:pPr>
         <w:pStyle w:val="Heading3"/>
       </w:pPr>
       <w:r>
-        <w:t>I5 · Reimprimir y abrir gaveta</w:t>
+        <w:t>I3c · Un terminal mal configurado se nota</w:t>
       </w:r>
     </w:p>
     <w:p>
@@ -3287,7 +3303,15 @@
         <w:pStyle w:val="ListNumber"/>
       </w:pPr>
       <w:r>
-        <w:t>Reimprima la última factura y abra la gaveta desde el menú.</w:t>
+        <w:t>Escriba un modelo de terminal que no exista (por ejemplo «Azul») y reinicie el servicio.</w:t>
+      </w:r>
+    </w:p>
+    <w:p>
+      <w:pPr>
+        <w:pStyle w:val="ListNumber"/>
+      </w:pPr>
+      <w:r>
+        <w:t>Revise el registro del Agente y la dirección /salud.</w:t>
       </w:r>
     </w:p>
     <w:p>
@@ -3302,7 +3326,7 @@
         <w:rPr>
           <w:color w:val="555555"/>
         </w:rPr>
-        <w:t>Las dos cosas piden permiso y quedan en la auditoría. La copia sale marcada como copia.</w:t>
+        <w:t>El log avisa que ese modelo no está implementado y dice cuáles hay. En /salud, la sección Periféricos muestra con qué quedó configurada la caja: impresora, balanza y terminal, y cuáles están simulados.</w:t>
       </w:r>
     </w:p>
     <w:p>
@@ -3319,7 +3343,7 @@
           <w:color w:val="555555"/>
           <w:sz w:val="19"/>
         </w:rPr>
-        <w:t>Caja: Auditoria</w:t>
+        <w:t>Ninguna: es configuración del equipo, no datos</w:t>
       </w:r>
     </w:p>
     <w:p>
@@ -3332,24 +3356,11 @@
       </w:r>
     </w:p>
     <w:p>
-      <w:r>
-        <w:br w:type="page"/>
-      </w:r>
-    </w:p>
-    <w:p>
-      <w:pPr>
-        <w:pStyle w:val="Heading1"/>
-      </w:pPr>
-      <w:r>
-        <w:t>Bloque J — Factura electrónica</w:t>
-      </w:r>
-    </w:p>
-    <w:p>
       <w:pPr>
         <w:pStyle w:val="Heading3"/>
       </w:pPr>
       <w:r>
-        <w:t>J1 · Certificado</w:t>
+        <w:t>I4 · Revisar el ticket</w:t>
       </w:r>
     </w:p>
     <w:p>
@@ -3357,7 +3368,7 @@
         <w:pStyle w:val="ListNumber"/>
       </w:pPr>
       <w:r>
-        <w:t>Toque el indicador de e-CF en la barra de estado y cargue el PIN del certificado.</w:t>
+        <w:t>Mire el ticket impreso con calma.</w:t>
       </w:r>
     </w:p>
     <w:p>
@@ -3372,7 +3383,7 @@
         <w:rPr>
           <w:color w:val="555555"/>
         </w:rPr>
-        <w:t>Dice que el certificado está cargado y cuánto le falta para vencer. El PIN no se guarda en disco: al reiniciar el servicio lo vuelve a pedir.</w:t>
+        <w:t>Trae los datos de la empresa, el detalle con sus descuentos, el ITBIS, el total, la forma de pago, la devuelta, el e-NCF con su código de seguridad y el código QR.</w:t>
       </w:r>
     </w:p>
     <w:p>
@@ -3389,7 +3400,7 @@
           <w:color w:val="555555"/>
           <w:sz w:val="19"/>
         </w:rPr>
-        <w:t>Ninguna: el PIN del certificado vive solo en memoria</w:t>
+        <w:t>Ninguna: el ticket se imprime con lo que ya se guardó al cobrar</w:t>
       </w:r>
     </w:p>
     <w:p>
@@ -3406,7 +3417,7 @@
         <w:pStyle w:val="Heading3"/>
       </w:pPr>
       <w:r>
-        <w:t>J2 · La factura se firma</w:t>
+        <w:t>I5 · Reimprimir y abrir gaveta</w:t>
       </w:r>
     </w:p>
     <w:p>
@@ -3414,15 +3425,7 @@
         <w:pStyle w:val="ListNumber"/>
       </w:pPr>
       <w:r>
-        <w:t>Cobre una venta y revise el e-NCF del ticket.</w:t>
-      </w:r>
-    </w:p>
-    <w:p>
-      <w:pPr>
-        <w:pStyle w:val="ListNumber"/>
-      </w:pPr>
-      <w:r>
-        <w:t>En el Central, entre a Facturas y búsquela.</w:t>
+        <w:t>Reimprima la última factura y abra la gaveta desde el menú.</w:t>
       </w:r>
     </w:p>
     <w:p>
@@ -3437,7 +3440,7 @@
         <w:rPr>
           <w:color w:val="555555"/>
         </w:rPr>
-        <w:t>El e-NCF es correlativo, el ticket trae el código de seguridad y la fecha de firma, y en el Central la factura aparece con su XML.</w:t>
+        <w:t>Las dos cosas piden permiso y quedan en la auditoría. La copia sale marcada como copia.</w:t>
       </w:r>
     </w:p>
     <w:p>
@@ -3454,7 +3457,7 @@
           <w:color w:val="555555"/>
           <w:sz w:val="19"/>
         </w:rPr>
-        <w:t>Caja: DocumentosElectronicos · SecuenciasEcf · Central: ComprobantesRecibidos · VentasCentral</w:t>
+        <w:t>Caja: Auditoria</w:t>
       </w:r>
     </w:p>
     <w:p>
@@ -3467,11 +3470,24 @@
       </w:r>
     </w:p>
     <w:p>
+      <w:r>
+        <w:br w:type="page"/>
+      </w:r>
+    </w:p>
+    <w:p>
+      <w:pPr>
+        <w:pStyle w:val="Heading1"/>
+      </w:pPr>
+      <w:r>
+        <w:t>Bloque J — Factura electrónica</w:t>
+      </w:r>
+    </w:p>
+    <w:p>
       <w:pPr>
         <w:pStyle w:val="Heading3"/>
       </w:pPr>
       <w:r>
-        <w:t>J3 · Aviso de secuencia baja y encadenado de rangos</w:t>
+        <w:t>J1 · Certificado</w:t>
       </w:r>
     </w:p>
     <w:p>
@@ -3479,23 +3495,7 @@
         <w:pStyle w:val="ListNumber"/>
       </w:pPr>
       <w:r>
-        <w:t>Deje el rango de e-NCF casi agotado, o baje el parámetro Fiscal.ComprobantesAlertaSecuenciaEcf para que salte antes.</w:t>
-      </w:r>
-    </w:p>
-    <w:p>
-      <w:pPr>
-        <w:pStyle w:val="ListNumber"/>
-      </w:pPr>
-      <w:r>
-        <w:t>Cargue un segundo rango del mismo tipo para esa caja, con números siguientes, y facture hasta agotar el primero.</w:t>
-      </w:r>
-    </w:p>
-    <w:p>
-      <w:pPr>
-        <w:pStyle w:val="ListNumber"/>
-      </w:pPr>
-      <w:r>
-        <w:t>En el Central, abra el Monitor.</w:t>
+        <w:t>Toque el indicador de e-CF en la barra de estado y cargue el PIN del certificado.</w:t>
       </w:r>
     </w:p>
     <w:p>
@@ -3510,7 +3510,7 @@
         <w:rPr>
           <w:color w:val="555555"/>
         </w:rPr>
-        <w:t>La caja avisa cuántos comprobantes quedan al facturar y en su barra de estado. Al agotarse el primer rango, las facturas siguen con el segundo sin que nadie haga nada, y el rango agotado desaparece de la caja y de la lista de Fiscal (se ve marcando «Ver agotados»). El Monitor del Central avisa de la caja a la que le queda poco, para que soporte se entere sin depender de que llamen.</w:t>
+        <w:t>Dice que el certificado está cargado y cuánto le falta para vencer. El PIN no se guarda en disco: al reiniciar el servicio lo vuelve a pedir.</w:t>
       </w:r>
     </w:p>
     <w:p>
@@ -3527,7 +3527,7 @@
           <w:color w:val="555555"/>
           <w:sz w:val="19"/>
         </w:rPr>
-        <w:t>Caja: SecuenciasEcf (el agotado se borra) · BandejaSalida · Central: SecuenciasEcf</w:t>
+        <w:t>Ninguna: el PIN del certificado vive solo en memoria</w:t>
       </w:r>
     </w:p>
     <w:p>
@@ -3544,7 +3544,7 @@
         <w:pStyle w:val="Heading3"/>
       </w:pPr>
       <w:r>
-        <w:t>J4 · Estado en la DGII</w:t>
+        <w:t>J2 · La factura se firma</w:t>
       </w:r>
     </w:p>
     <w:p>
@@ -3552,7 +3552,15 @@
         <w:pStyle w:val="ListNumber"/>
       </w:pPr>
       <w:r>
-        <w:t>En el Central, entre a Monitor → Comprobantes.</w:t>
+        <w:t>Cobre una venta y revise el e-NCF del ticket.</w:t>
+      </w:r>
+    </w:p>
+    <w:p>
+      <w:pPr>
+        <w:pStyle w:val="ListNumber"/>
+      </w:pPr>
+      <w:r>
+        <w:t>En el Central, entre a Facturas y búsquela.</w:t>
       </w:r>
     </w:p>
     <w:p>
@@ -3567,7 +3575,7 @@
         <w:rPr>
           <w:color w:val="555555"/>
         </w:rPr>
-        <w:t>Cada comprobante muestra si fue aceptado, rechazado o está pendiente, con el mensaje de la DGII cuando lo hay.</w:t>
+        <w:t>El e-NCF es correlativo, el ticket trae el código de seguridad y la fecha de firma, y en el Central la factura aparece con su XML.</w:t>
       </w:r>
     </w:p>
     <w:p>
@@ -3584,7 +3592,7 @@
           <w:color w:val="555555"/>
           <w:sz w:val="19"/>
         </w:rPr>
-        <w:t>Central: ComprobantesRecibidos · Caja: HistorialEstadosEcf</w:t>
+        <w:t>Caja: DocumentosElectronicos · SecuenciasEcf · Central: ComprobantesRecibidos · VentasCentral</w:t>
       </w:r>
     </w:p>
     <w:p>
@@ -3597,33 +3605,11 @@
       </w:r>
     </w:p>
     <w:p>
-      <w:r>
-        <w:rPr>
-          <w:i/>
-          <w:color w:val="2E7D32"/>
-        </w:rPr>
-        <w:t>Un comprobante rechazado no se corrige desde el POS: eso lo resuelven tecnología y contabilidad. La caja solo lo reenvía.</w:t>
-      </w:r>
-    </w:p>
-    <w:p>
-      <w:r>
-        <w:br w:type="page"/>
-      </w:r>
-    </w:p>
-    <w:p>
-      <w:pPr>
-        <w:pStyle w:val="Heading1"/>
-      </w:pPr>
-      <w:r>
-        <w:t>Bloque K — Devoluciones y notas de crédito</w:t>
-      </w:r>
-    </w:p>
-    <w:p>
       <w:pPr>
         <w:pStyle w:val="Heading3"/>
       </w:pPr>
       <w:r>
-        <w:t>K1 · Devolver parte de una factura</w:t>
+        <w:t>J3 · Aviso de secuencia baja y encadenado de rangos</w:t>
       </w:r>
     </w:p>
     <w:p>
@@ -3631,7 +3617,7 @@
         <w:pStyle w:val="ListNumber"/>
       </w:pPr>
       <w:r>
-        <w:t>Presione F10 y busque la factura que cobró en el bloque I (por número o escaneando el código del ticket).</w:t>
+        <w:t>Deje el rango de e-NCF casi agotado, o baje el parámetro Fiscal.ComprobantesAlertaSecuenciaEcf para que salte antes.</w:t>
       </w:r>
     </w:p>
     <w:p>
@@ -3639,7 +3625,7 @@
         <w:pStyle w:val="ListNumber"/>
       </w:pPr>
       <w:r>
-        <w:t>Devuelva una sola de las líneas, con su motivo, e identifique al cliente con cédula o RNC.</w:t>
+        <w:t>Cargue un segundo rango del mismo tipo para esa caja, con números siguientes, y facture hasta agotar el primero.</w:t>
       </w:r>
     </w:p>
     <w:p>
@@ -3647,7 +3633,7 @@
         <w:pStyle w:val="ListNumber"/>
       </w:pPr>
       <w:r>
-        <w:t>Autorice con el supervisor.</w:t>
+        <w:t>En el Central, abra el Monitor.</w:t>
       </w:r>
     </w:p>
     <w:p>
@@ -3662,7 +3648,7 @@
         <w:rPr>
           <w:color w:val="555555"/>
         </w:rPr>
-        <w:t>Sale la nota de crédito E34 impresa, con referencia al e-NCF de la factura, y con las copias del cliente y de contabilidad.</w:t>
+        <w:t>La caja avisa cuántos comprobantes quedan al facturar y en su barra de estado. Al agotarse el primer rango, las facturas siguen con el segundo sin que nadie haga nada, y el rango agotado desaparece de la caja y de la lista de Fiscal (se ve marcando «Ver agotados»). El Monitor del Central avisa de la caja a la que le queda poco, para que soporte se entere sin depender de que llamen.</w:t>
       </w:r>
     </w:p>
     <w:p>
@@ -3679,7 +3665,7 @@
           <w:color w:val="555555"/>
           <w:sz w:val="19"/>
         </w:rPr>
-        <w:t>Caja: Devoluciones · LineasDevolucion · DocumentosElectronicos · SecuenciasEcf · BandejaSalida · Central: NotasCredito</w:t>
+        <w:t>Caja: SecuenciasEcf (el agotado se borra) · BandejaSalida · Central: SecuenciasEcf</w:t>
       </w:r>
     </w:p>
     <w:p>
@@ -3696,7 +3682,7 @@
         <w:pStyle w:val="Heading3"/>
       </w:pPr>
       <w:r>
-        <w:t>K2 · No se puede devolver más de lo vendido</w:t>
+        <w:t>J4 · Estado en la DGII</w:t>
       </w:r>
     </w:p>
     <w:p>
@@ -3704,7 +3690,7 @@
         <w:pStyle w:val="ListNumber"/>
       </w:pPr>
       <w:r>
-        <w:t>Busque la misma factura otra vez e intente devolver más cantidad de la que queda.</w:t>
+        <w:t>En el Central, entre a Monitor → Comprobantes.</w:t>
       </w:r>
     </w:p>
     <w:p>
@@ -3719,7 +3705,7 @@
         <w:rPr>
           <w:color w:val="555555"/>
         </w:rPr>
-        <w:t>Solo deja devolver lo que falta, descontando lo ya devuelto.</w:t>
+        <w:t>Cada comprobante muestra si fue aceptado, rechazado o está pendiente, con el mensaje de la DGII cuando lo hay.</w:t>
       </w:r>
     </w:p>
     <w:p>
@@ -3736,7 +3722,7 @@
           <w:color w:val="555555"/>
           <w:sz w:val="19"/>
         </w:rPr>
-        <w:t>Caja: Devoluciones · LineasDevolucion (lee)</w:t>
+        <w:t>Central: ComprobantesRecibidos · Caja: HistorialEstadosEcf</w:t>
       </w:r>
     </w:p>
     <w:p>
@@ -3749,11 +3735,33 @@
       </w:r>
     </w:p>
     <w:p>
+      <w:r>
+        <w:rPr>
+          <w:i/>
+          <w:color w:val="2E7D32"/>
+        </w:rPr>
+        <w:t>Un comprobante rechazado no se corrige desde el POS: eso lo resuelven tecnología y contabilidad. La caja solo lo reenvía.</w:t>
+      </w:r>
+    </w:p>
+    <w:p>
+      <w:r>
+        <w:br w:type="page"/>
+      </w:r>
+    </w:p>
+    <w:p>
+      <w:pPr>
+        <w:pStyle w:val="Heading1"/>
+      </w:pPr>
+      <w:r>
+        <w:t>Bloque K — Devoluciones y notas de crédito</w:t>
+      </w:r>
+    </w:p>
+    <w:p>
       <w:pPr>
         <w:pStyle w:val="Heading3"/>
       </w:pPr>
       <w:r>
-        <w:t>K3 · Retención del ITBIS fuera de plazo</w:t>
+        <w:t>K1 · Devolver parte de una factura</w:t>
       </w:r>
     </w:p>
     <w:p>
@@ -3761,7 +3769,23 @@
         <w:pStyle w:val="ListNumber"/>
       </w:pPr>
       <w:r>
-        <w:t>Devuelva una factura con más días de los configurados en A9.</w:t>
+        <w:t>Presione F10 y busque la factura que cobró en el bloque I (por número o escaneando el código del ticket).</w:t>
+      </w:r>
+    </w:p>
+    <w:p>
+      <w:pPr>
+        <w:pStyle w:val="ListNumber"/>
+      </w:pPr>
+      <w:r>
+        <w:t>Devuelva una sola de las líneas, con su motivo, e identifique al cliente con cédula o RNC.</w:t>
+      </w:r>
+    </w:p>
+    <w:p>
+      <w:pPr>
+        <w:pStyle w:val="ListNumber"/>
+      </w:pPr>
+      <w:r>
+        <w:t>Autorice con el supervisor.</w:t>
       </w:r>
     </w:p>
     <w:p>
@@ -3776,7 +3800,7 @@
         <w:rPr>
           <w:color w:val="555555"/>
         </w:rPr>
-        <w:t>La nota de crédito retiene el ITBIS y lo dice en pantalla y en el papel.</w:t>
+        <w:t>Sale la nota de crédito E34 impresa, con referencia al e-NCF de la factura, y con las copias del cliente y de contabilidad.</w:t>
       </w:r>
     </w:p>
     <w:p>
@@ -3793,7 +3817,7 @@
           <w:color w:val="555555"/>
           <w:sz w:val="19"/>
         </w:rPr>
-        <w:t>Caja: Devoluciones · Parametros (lee)</w:t>
+        <w:t>Caja: Devoluciones · LineasDevolucion · DocumentosElectronicos · SecuenciasEcf · BandejaSalida · Central: NotasCredito</w:t>
       </w:r>
     </w:p>
     <w:p>
@@ -3810,7 +3834,7 @@
         <w:pStyle w:val="Heading3"/>
       </w:pPr>
       <w:r>
-        <w:t>K4 · Usar la nota de crédito como pago</w:t>
+        <w:t>K2 · No se puede devolver más de lo vendido</w:t>
       </w:r>
     </w:p>
     <w:p>
@@ -3818,7 +3842,7 @@
         <w:pStyle w:val="ListNumber"/>
       </w:pPr>
       <w:r>
-        <w:t>Arme una venta nueva y cóbrela con la nota de crédito del K1.</w:t>
+        <w:t>Busque la misma factura otra vez e intente devolver más cantidad de la que queda.</w:t>
       </w:r>
     </w:p>
     <w:p>
@@ -3833,7 +3857,7 @@
         <w:rPr>
           <w:color w:val="555555"/>
         </w:rPr>
-        <w:t>Valida vigencia y saldo. Si sobra saldo, imprime el voucher con lo que queda; ese saldo se puede volver a consultar.</w:t>
+        <w:t>Solo deja devolver lo que falta, descontando lo ya devuelto.</w:t>
       </w:r>
     </w:p>
     <w:p>
@@ -3850,7 +3874,7 @@
           <w:color w:val="555555"/>
           <w:sz w:val="19"/>
         </w:rPr>
-        <w:t>Caja: ConsumosNotaCredito · PagosVenta · Central: NotasCredito · ConsumosNotaCredito</w:t>
+        <w:t>Caja: Devoluciones · LineasDevolucion (lee)</w:t>
       </w:r>
     </w:p>
     <w:p>
@@ -3867,7 +3891,7 @@
         <w:pStyle w:val="Heading3"/>
       </w:pPr>
       <w:r>
-        <w:t>K5 · Nota de crédito interna</w:t>
+        <w:t>K3 · Retención del ITBIS fuera de plazo</w:t>
       </w:r>
     </w:p>
     <w:p>
@@ -3875,7 +3899,7 @@
         <w:pStyle w:val="ListNumber"/>
       </w:pPr>
       <w:r>
-        <w:t>Haga otra devolución marcándola como interna (requiere su permiso).</w:t>
+        <w:t>Devuelva una factura con más días de los configurados en A9.</w:t>
       </w:r>
     </w:p>
     <w:p>
@@ -3890,7 +3914,7 @@
         <w:rPr>
           <w:color w:val="555555"/>
         </w:rPr>
-        <w:t>Sale sin comprobante fiscal y no se puede usar como forma de pago.</w:t>
+        <w:t>La nota de crédito retiene el ITBIS y lo dice en pantalla y en el papel.</w:t>
       </w:r>
     </w:p>
     <w:p>
@@ -3907,7 +3931,7 @@
           <w:color w:val="555555"/>
           <w:sz w:val="19"/>
         </w:rPr>
-        <w:t>Caja: Devoluciones · Auditoria</w:t>
+        <w:t>Caja: Devoluciones · Parametros (lee)</w:t>
       </w:r>
     </w:p>
     <w:p>
@@ -3924,7 +3948,7 @@
         <w:pStyle w:val="Heading3"/>
       </w:pPr>
       <w:r>
-        <w:t>K6 · Factura de otra caja</w:t>
+        <w:t>K4 · Usar la nota de crédito como pago</w:t>
       </w:r>
     </w:p>
     <w:p>
@@ -3932,7 +3956,7 @@
         <w:pStyle w:val="ListNumber"/>
       </w:pPr>
       <w:r>
-        <w:t>Cobre una factura en la caja 01 y búsquela desde otra caja (o desde la misma, después de que suba al Central).</w:t>
+        <w:t>Arme una venta nueva y cóbrela con la nota de crédito del K1.</w:t>
       </w:r>
     </w:p>
     <w:p>
@@ -3947,7 +3971,7 @@
         <w:rPr>
           <w:color w:val="555555"/>
         </w:rPr>
-        <w:t>La trae del Central con lo ya devuelto de toda la empresa, y la nota de crédito la emite la caja donde está el cliente, con su propio rango de e-NCF.</w:t>
+        <w:t>Valida vigencia y saldo. Si sobra saldo, imprime el voucher con lo que queda; ese saldo se puede volver a consultar.</w:t>
       </w:r>
     </w:p>
     <w:p>
@@ -3964,7 +3988,7 @@
           <w:color w:val="555555"/>
           <w:sz w:val="19"/>
         </w:rPr>
-        <w:t>Caja: FacturasConsultadas · LineasFacturaConsultada · Central: VentasCentral (lee) · ReservasFactura · LineasReservaFactura</w:t>
+        <w:t>Caja: ConsumosNotaCredito · PagosVenta · Central: NotasCredito · ConsumosNotaCredito</w:t>
       </w:r>
     </w:p>
     <w:p>
@@ -3981,7 +4005,7 @@
         <w:pStyle w:val="Heading3"/>
       </w:pPr>
       <w:r>
-        <w:t>K7 · Sin conexión</w:t>
+        <w:t>K5 · Nota de crédito interna</w:t>
       </w:r>
     </w:p>
     <w:p>
@@ -3989,7 +4013,7 @@
         <w:pStyle w:val="ListNumber"/>
       </w:pPr>
       <w:r>
-        <w:t>Desconecte la caja de la red e intente buscar una factura que no sea suya.</w:t>
+        <w:t>Haga otra devolución marcándola como interna (requiere su permiso).</w:t>
       </w:r>
     </w:p>
     <w:p>
@@ -4004,7 +4028,7 @@
         <w:rPr>
           <w:color w:val="555555"/>
         </w:rPr>
-        <w:t>Dice que solo se pueden devolver las facturas de esa caja mientras no haya conexión. No promete nada que no pueda cumplir.</w:t>
+        <w:t>Sale sin comprobante fiscal y no se puede usar como forma de pago.</w:t>
       </w:r>
     </w:p>
     <w:p>
@@ -4021,7 +4045,7 @@
           <w:color w:val="555555"/>
           <w:sz w:val="19"/>
         </w:rPr>
-        <w:t>Ninguna: sin conexión no se consulta nada, solo se avisa</w:t>
+        <w:t>Caja: Devoluciones · Auditoria</w:t>
       </w:r>
     </w:p>
     <w:p>
@@ -4034,24 +4058,11 @@
       </w:r>
     </w:p>
     <w:p>
-      <w:r>
-        <w:br w:type="page"/>
-      </w:r>
-    </w:p>
-    <w:p>
-      <w:pPr>
-        <w:pStyle w:val="Heading1"/>
-      </w:pPr>
-      <w:r>
-        <w:t>Bloque L — Lista de boda</w:t>
-      </w:r>
-    </w:p>
-    <w:p>
       <w:pPr>
         <w:pStyle w:val="Heading3"/>
       </w:pPr>
       <w:r>
-        <w:t>L1 · Crear la lista en el Central</w:t>
+        <w:t>K6 · Factura de otra caja</w:t>
       </w:r>
     </w:p>
     <w:p>
@@ -4059,7 +4070,7 @@
         <w:pStyle w:val="ListNumber"/>
       </w:pPr>
       <w:r>
-        <w:t>En Listas de boda → Nueva, cree una lista con los novios, la fecha y tres artículos con sus cantidades.</w:t>
+        <w:t>Cobre una factura en la caja 01 y búsquela desde otra caja (o desde la misma, después de que suba al Central).</w:t>
       </w:r>
     </w:p>
     <w:p>
@@ -4074,7 +4085,7 @@
         <w:rPr>
           <w:color w:val="555555"/>
         </w:rPr>
-        <w:t>La lista queda con su número y se puede imprimir o consultar.</w:t>
+        <w:t>La trae del Central con lo ya devuelto de toda la empresa, y la nota de crédito la emite la caja donde está el cliente, con su propio rango de e-NCF.</w:t>
       </w:r>
     </w:p>
     <w:p>
@@ -4091,7 +4102,7 @@
           <w:color w:val="555555"/>
           <w:sz w:val="19"/>
         </w:rPr>
-        <w:t>Central: ListasBoda · ArticulosListaBoda · SecuenciasCentral</w:t>
+        <w:t>Caja: FacturasConsultadas · LineasFacturaConsultada · Central: VentasCentral (lee) · ReservasFactura · LineasReservaFactura</w:t>
       </w:r>
     </w:p>
     <w:p>
@@ -4108,7 +4119,7 @@
         <w:pStyle w:val="Heading3"/>
       </w:pPr>
       <w:r>
-        <w:t>L2 · Comprar de la lista en la caja (F6)</w:t>
+        <w:t>K7 · Sin conexión</w:t>
       </w:r>
     </w:p>
     <w:p>
@@ -4116,15 +4127,7 @@
         <w:pStyle w:val="ListNumber"/>
       </w:pPr>
       <w:r>
-        <w:t>En la caja, presione F6 y asocie la lista por su número.</w:t>
-      </w:r>
-    </w:p>
-    <w:p>
-      <w:pPr>
-        <w:pStyle w:val="ListNumber"/>
-      </w:pPr>
-      <w:r>
-        <w:t>Venda uno de los artículos de la lista y cobre.</w:t>
+        <w:t>Desconecte la caja de la red e intente buscar una factura que no sea suya.</w:t>
       </w:r>
     </w:p>
     <w:p>
@@ -4139,7 +4142,7 @@
         <w:rPr>
           <w:color w:val="555555"/>
         </w:rPr>
-        <w:t>La venta queda asociada a la lista y el ticket lo dice.</w:t>
+        <w:t>Dice que solo se pueden devolver las facturas de esa caja mientras no haya conexión. No promete nada que no pueda cumplir.</w:t>
       </w:r>
     </w:p>
     <w:p>
@@ -4156,7 +4159,7 @@
           <w:color w:val="555555"/>
           <w:sz w:val="19"/>
         </w:rPr>
-        <w:t>Caja: Ventas (lleva el número de la lista) · BandejaSalida</w:t>
+        <w:t>Ninguna: sin conexión no se consulta nada, solo se avisa</w:t>
       </w:r>
     </w:p>
     <w:p>
@@ -4169,11 +4172,24 @@
       </w:r>
     </w:p>
     <w:p>
+      <w:r>
+        <w:br w:type="page"/>
+      </w:r>
+    </w:p>
+    <w:p>
+      <w:pPr>
+        <w:pStyle w:val="Heading1"/>
+      </w:pPr>
+      <w:r>
+        <w:t>Bloque L — Lista de boda</w:t>
+      </w:r>
+    </w:p>
+    <w:p>
       <w:pPr>
         <w:pStyle w:val="Heading3"/>
       </w:pPr>
       <w:r>
-        <w:t>L3 · La lista baja lo comprado</w:t>
+        <w:t>L1 · Crear la lista en el Central</w:t>
       </w:r>
     </w:p>
     <w:p>
@@ -4181,7 +4197,7 @@
         <w:pStyle w:val="ListNumber"/>
       </w:pPr>
       <w:r>
-        <w:t>Vuelva al Central y abra la lista.</w:t>
+        <w:t>En Listas de boda → Nueva, cree una lista con los novios, la fecha y tres artículos con sus cantidades.</w:t>
       </w:r>
     </w:p>
     <w:p>
@@ -4196,7 +4212,7 @@
         <w:rPr>
           <w:color w:val="555555"/>
         </w:rPr>
-        <w:t>El artículo comprado aparece descontado de lo pedido, con la factura que lo compró.</w:t>
+        <w:t>La lista queda con su número y se puede imprimir o consultar.</w:t>
       </w:r>
     </w:p>
     <w:p>
@@ -4213,7 +4229,7 @@
           <w:color w:val="555555"/>
           <w:sz w:val="19"/>
         </w:rPr>
-        <w:t>Central: ComprasListaBoda · ArticulosListaBoda</w:t>
+        <w:t>Central: ListasBoda · ArticulosListaBoda · SecuenciasCentral</w:t>
       </w:r>
     </w:p>
     <w:p>
@@ -4226,24 +4242,11 @@
       </w:r>
     </w:p>
     <w:p>
-      <w:r>
-        <w:br w:type="page"/>
-      </w:r>
-    </w:p>
-    <w:p>
-      <w:pPr>
-        <w:pStyle w:val="Heading1"/>
-      </w:pPr>
-      <w:r>
-        <w:t>Bloque M — Fidelidad</w:t>
-      </w:r>
-    </w:p>
-    <w:p>
       <w:pPr>
         <w:pStyle w:val="Heading3"/>
       </w:pPr>
       <w:r>
-        <w:t>M1 · Inscribir un cliente</w:t>
+        <w:t>L2 · Comprar de la lista en la caja (F6)</w:t>
       </w:r>
     </w:p>
     <w:p>
@@ -4251,7 +4254,15 @@
         <w:pStyle w:val="ListNumber"/>
       </w:pPr>
       <w:r>
-        <w:t>En la caja, inscriba un cliente al programa con su cédula.</w:t>
+        <w:t>En la caja, presione F6 y asocie la lista por su número.</w:t>
+      </w:r>
+    </w:p>
+    <w:p>
+      <w:pPr>
+        <w:pStyle w:val="ListNumber"/>
+      </w:pPr>
+      <w:r>
+        <w:t>Venda uno de los artículos de la lista y cobre.</w:t>
       </w:r>
     </w:p>
     <w:p>
@@ -4266,7 +4277,7 @@
         <w:rPr>
           <w:color w:val="555555"/>
         </w:rPr>
-        <w:t>Queda inscrito y el Central lo ve en Fidelidad → Miembros.</w:t>
+        <w:t>La venta queda asociada a la lista y el ticket lo dice.</w:t>
       </w:r>
     </w:p>
     <w:p>
@@ -4283,7 +4294,7 @@
           <w:color w:val="555555"/>
           <w:sz w:val="19"/>
         </w:rPr>
-        <w:t>Caja: MiembrosFidelidad · BandejaSalida · Central: MiembrosFidelidad</w:t>
+        <w:t>Caja: Ventas (lleva el número de la lista) · BandejaSalida</w:t>
       </w:r>
     </w:p>
     <w:p>
@@ -4300,7 +4311,7 @@
         <w:pStyle w:val="Heading3"/>
       </w:pPr>
       <w:r>
-        <w:t>M2 · Acumular puntos</w:t>
+        <w:t>L3 · La lista baja lo comprado</w:t>
       </w:r>
     </w:p>
     <w:p>
@@ -4308,7 +4319,7 @@
         <w:pStyle w:val="ListNumber"/>
       </w:pPr>
       <w:r>
-        <w:t>Cóbrele una factura a ese cliente.</w:t>
+        <w:t>Vuelva al Central y abra la lista.</w:t>
       </w:r>
     </w:p>
     <w:p>
@@ -4323,7 +4334,7 @@
         <w:rPr>
           <w:color w:val="555555"/>
         </w:rPr>
-        <w:t>Los puntos se acumulan según la regla configurada y el ticket dice cuántos ganó y cuántos tiene.</w:t>
+        <w:t>El artículo comprado aparece descontado de lo pedido, con la factura que lo compró.</w:t>
       </w:r>
     </w:p>
     <w:p>
@@ -4340,7 +4351,7 @@
           <w:color w:val="555555"/>
           <w:sz w:val="19"/>
         </w:rPr>
-        <w:t>Caja: MovimientosPuntos · Central: MovimientosPuntos · SaldosPuntos</w:t>
+        <w:t>Central: ComprasListaBoda · ArticulosListaBoda</w:t>
       </w:r>
     </w:p>
     <w:p>
@@ -4353,11 +4364,24 @@
       </w:r>
     </w:p>
     <w:p>
+      <w:r>
+        <w:br w:type="page"/>
+      </w:r>
+    </w:p>
+    <w:p>
+      <w:pPr>
+        <w:pStyle w:val="Heading1"/>
+      </w:pPr>
+      <w:r>
+        <w:t>Bloque M — Fidelidad</w:t>
+      </w:r>
+    </w:p>
+    <w:p>
       <w:pPr>
         <w:pStyle w:val="Heading3"/>
       </w:pPr>
       <w:r>
-        <w:t>M3 · Canjear puntos</w:t>
+        <w:t>M1 · Inscribir un cliente</w:t>
       </w:r>
     </w:p>
     <w:p>
@@ -4365,7 +4389,7 @@
         <w:pStyle w:val="ListNumber"/>
       </w:pPr>
       <w:r>
-        <w:t>En otra venta, canjee puntos como parte del pago (requiere permiso).</w:t>
+        <w:t>En la caja, inscriba un cliente al programa con su cédula.</w:t>
       </w:r>
     </w:p>
     <w:p>
@@ -4380,7 +4404,7 @@
         <w:rPr>
           <w:color w:val="555555"/>
         </w:rPr>
-        <w:t>Descuenta los puntos usados, respeta el tope de canje sin conexión y el saldo queda correcto en el Central.</w:t>
+        <w:t>Queda inscrito y el Central lo ve en Fidelidad → Miembros.</w:t>
       </w:r>
     </w:p>
     <w:p>
@@ -4397,7 +4421,7 @@
           <w:color w:val="555555"/>
           <w:sz w:val="19"/>
         </w:rPr>
-        <w:t>Caja: MovimientosPuntos · PagosVenta · Central: MovimientosPuntos · SaldosPuntos</w:t>
+        <w:t>Caja: MiembrosFidelidad · BandejaSalida · Central: MiembrosFidelidad</w:t>
       </w:r>
     </w:p>
     <w:p>
@@ -4410,24 +4434,11 @@
       </w:r>
     </w:p>
     <w:p>
-      <w:r>
-        <w:br w:type="page"/>
-      </w:r>
-    </w:p>
-    <w:p>
-      <w:pPr>
-        <w:pStyle w:val="Heading1"/>
-      </w:pPr>
-      <w:r>
-        <w:t>Bloque N — Mercancía que no se lleva el cliente</w:t>
-      </w:r>
-    </w:p>
-    <w:p>
       <w:pPr>
         <w:pStyle w:val="Heading3"/>
       </w:pPr>
       <w:r>
-        <w:t>N1 · Marcar una línea para entrega</w:t>
+        <w:t>M2 · Acumular puntos</w:t>
       </w:r>
     </w:p>
     <w:p>
@@ -4435,15 +4446,7 @@
         <w:pStyle w:val="ListNumber"/>
       </w:pPr>
       <w:r>
-        <w:t>En una venta, marque una línea como pendiente de entrega o envío, con la dirección y el teléfono del cliente.</w:t>
-      </w:r>
-    </w:p>
-    <w:p>
-      <w:pPr>
-        <w:pStyle w:val="ListNumber"/>
-      </w:pPr>
-      <w:r>
-        <w:t>Cobre la venta.</w:t>
+        <w:t>Cóbrele una factura a ese cliente.</w:t>
       </w:r>
     </w:p>
     <w:p>
@@ -4458,7 +4461,7 @@
         <w:rPr>
           <w:color w:val="555555"/>
         </w:rPr>
-        <w:t>Sale el voucher del pendiente con sus datos, y la mercancía queda registrada como no entregada.</w:t>
+        <w:t>Los puntos se acumulan según la regla configurada y el ticket dice cuántos ganó y cuántos tiene.</w:t>
       </w:r>
     </w:p>
     <w:p>
@@ -4475,7 +4478,7 @@
           <w:color w:val="555555"/>
           <w:sz w:val="19"/>
         </w:rPr>
-        <w:t>Caja: DestinosEntregaVenta · LineasDestinoEntrega · PendientesEntrega · LineasPendienteEntrega · Central: PendientesEntrega · LineasPendienteEntrega</w:t>
+        <w:t>Caja: MovimientosPuntos · Central: MovimientosPuntos · SaldosPuntos</w:t>
       </w:r>
     </w:p>
     <w:p>
@@ -4492,7 +4495,7 @@
         <w:pStyle w:val="Heading3"/>
       </w:pPr>
       <w:r>
-        <w:t>N2 · Despachar desde el Central</w:t>
+        <w:t>M3 · Canjear puntos</w:t>
       </w:r>
     </w:p>
     <w:p>
@@ -4500,7 +4503,7 @@
         <w:pStyle w:val="ListNumber"/>
       </w:pPr>
       <w:r>
-        <w:t>En Despacho → Pendientes, abra ese pendiente, cámbielo a preparado y después entréguelo, anotando quién lo recibe con su cédula.</w:t>
+        <w:t>En otra venta, canjee puntos como parte del pago (requiere permiso).</w:t>
       </w:r>
     </w:p>
     <w:p>
@@ -4515,7 +4518,7 @@
         <w:rPr>
           <w:color w:val="555555"/>
         </w:rPr>
-        <w:t>La constancia de entrega se imprime en hoja carta y el pendiente queda cerrado.</w:t>
+        <w:t>Descuenta los puntos usados, respeta el tope de canje sin conexión y el saldo queda correcto en el Central.</w:t>
       </w:r>
     </w:p>
     <w:p>
@@ -4532,7 +4535,7 @@
           <w:color w:val="555555"/>
           <w:sz w:val="19"/>
         </w:rPr>
-        <w:t>Central: EntregasPendiente · LineasEntregaPendiente · PendientesEntrega</w:t>
+        <w:t>Caja: MovimientosPuntos · PagosVenta · Central: MovimientosPuntos · SaldosPuntos</w:t>
       </w:r>
     </w:p>
     <w:p>
@@ -4545,11 +4548,24 @@
       </w:r>
     </w:p>
     <w:p>
+      <w:r>
+        <w:br w:type="page"/>
+      </w:r>
+    </w:p>
+    <w:p>
+      <w:pPr>
+        <w:pStyle w:val="Heading1"/>
+      </w:pPr>
+      <w:r>
+        <w:t>Bloque N — Mercancía que no se lleva el cliente</w:t>
+      </w:r>
+    </w:p>
+    <w:p>
       <w:pPr>
         <w:pStyle w:val="Heading3"/>
       </w:pPr>
       <w:r>
-        <w:t>N3 · No se devuelve lo que no se ha entregado</w:t>
+        <w:t>N1 · Marcar una línea para entrega</w:t>
       </w:r>
     </w:p>
     <w:p>
@@ -4557,7 +4573,15 @@
         <w:pStyle w:val="ListNumber"/>
       </w:pPr>
       <w:r>
-        <w:t>Intente devolver, desde la caja, un artículo pendiente que todavía no se haya entregado.</w:t>
+        <w:t>En una venta, marque una línea como pendiente de entrega o envío, con la dirección y el teléfono del cliente.</w:t>
+      </w:r>
+    </w:p>
+    <w:p>
+      <w:pPr>
+        <w:pStyle w:val="ListNumber"/>
+      </w:pPr>
+      <w:r>
+        <w:t>Cobre la venta.</w:t>
       </w:r>
     </w:p>
     <w:p>
@@ -4572,7 +4596,7 @@
         <w:rPr>
           <w:color w:val="555555"/>
         </w:rPr>
-        <w:t>No lo deja, y explica que la mercancía aún no se ha entregado.</w:t>
+        <w:t>Sale el voucher del pendiente con sus datos, y la mercancía queda registrada como no entregada.</w:t>
       </w:r>
     </w:p>
     <w:p>
@@ -4589,7 +4613,7 @@
           <w:color w:val="555555"/>
           <w:sz w:val="19"/>
         </w:rPr>
-        <w:t>Caja: PendientesEntrega (lee)</w:t>
+        <w:t>Caja: DestinosEntregaVenta · LineasDestinoEntrega · PendientesEntrega · LineasPendienteEntrega · Central: PendientesEntrega · LineasPendienteEntrega</w:t>
       </w:r>
     </w:p>
     <w:p>
@@ -4602,24 +4626,11 @@
       </w:r>
     </w:p>
     <w:p>
-      <w:r>
-        <w:br w:type="page"/>
-      </w:r>
-    </w:p>
-    <w:p>
-      <w:pPr>
-        <w:pStyle w:val="Heading1"/>
-      </w:pPr>
-      <w:r>
-        <w:t>Bloque O — Movimientos del turno y cierre</w:t>
-      </w:r>
-    </w:p>
-    <w:p>
       <w:pPr>
         <w:pStyle w:val="Heading3"/>
       </w:pPr>
       <w:r>
-        <w:t>O1 · Retiro de efectivo</w:t>
+        <w:t>N2 · Despachar desde el Central</w:t>
       </w:r>
     </w:p>
     <w:p>
@@ -4627,15 +4638,7 @@
         <w:pStyle w:val="ListNumber"/>
       </w:pPr>
       <w:r>
-        <w:t>Haga un retiro con su motivo y la autorización del supervisor.</w:t>
-      </w:r>
-    </w:p>
-    <w:p>
-      <w:pPr>
-        <w:pStyle w:val="ListNumber"/>
-      </w:pPr>
-      <w:r>
-        <w:t>Intente retirar más efectivo del que hay en la gaveta.</w:t>
+        <w:t>En Despacho → Pendientes, abra ese pendiente, cámbielo a preparado y después entréguelo, anotando quién lo recibe con su cédula.</w:t>
       </w:r>
     </w:p>
     <w:p>
@@ -4650,7 +4653,7 @@
         <w:rPr>
           <w:color w:val="555555"/>
         </w:rPr>
-        <w:t>El primero imprime su comprobante con las firmas. El segundo se rechaza diciendo cuánto hay.</w:t>
+        <w:t>La constancia de entrega se imprime en hoja carta y el pendiente queda cerrado.</w:t>
       </w:r>
     </w:p>
     <w:p>
@@ -4667,7 +4670,7 @@
           <w:color w:val="555555"/>
           <w:sz w:val="19"/>
         </w:rPr>
-        <w:t>Caja: MovimientosCaja · AutorizacionesOtorgadas · BandejaSalida · Auditoria</w:t>
+        <w:t>Central: EntregasPendiente · LineasEntregaPendiente · PendientesEntrega</w:t>
       </w:r>
     </w:p>
     <w:p>
@@ -4684,7 +4687,7 @@
         <w:pStyle w:val="Heading3"/>
       </w:pPr>
       <w:r>
-        <w:t>O2 · Relevo de cajero</w:t>
+        <w:t>N3 · No se devuelve lo que no se ha entregado</w:t>
       </w:r>
     </w:p>
     <w:p>
@@ -4692,7 +4695,7 @@
         <w:pStyle w:val="ListNumber"/>
       </w:pPr>
       <w:r>
-        <w:t>Con una venta a medias, haga un relevo: entra otro cajero con autorización.</w:t>
+        <w:t>Intente devolver, desde la caja, un artículo pendiente que todavía no se haya entregado.</w:t>
       </w:r>
     </w:p>
     <w:p>
@@ -4707,7 +4710,7 @@
         <w:rPr>
           <w:color w:val="555555"/>
         </w:rPr>
-        <w:t>El turno no se cierra, cambia de operador, y el cajero que entra ve la venta en curso y las facturas en espera tal como estaban.</w:t>
+        <w:t>No lo deja, y explica que la mercancía aún no se ha entregado.</w:t>
       </w:r>
     </w:p>
     <w:p>
@@ -4724,7 +4727,7 @@
           <w:color w:val="555555"/>
           <w:sz w:val="19"/>
         </w:rPr>
-        <w:t>Caja: Turnos · MovimientosCaja · Auditoria</w:t>
+        <w:t>Caja: PendientesEntrega (lee)</w:t>
       </w:r>
     </w:p>
     <w:p>
@@ -4737,11 +4740,24 @@
       </w:r>
     </w:p>
     <w:p>
+      <w:r>
+        <w:br w:type="page"/>
+      </w:r>
+    </w:p>
+    <w:p>
+      <w:pPr>
+        <w:pStyle w:val="Heading1"/>
+      </w:pPr>
+      <w:r>
+        <w:t>Bloque O — Movimientos del turno y cierre</w:t>
+      </w:r>
+    </w:p>
+    <w:p>
       <w:pPr>
         <w:pStyle w:val="Heading3"/>
       </w:pPr>
       <w:r>
-        <w:t>O3 · Pre-cierre</w:t>
+        <w:t>O1 · Retiro de efectivo</w:t>
       </w:r>
     </w:p>
     <w:p>
@@ -4749,7 +4765,15 @@
         <w:pStyle w:val="ListNumber"/>
       </w:pPr>
       <w:r>
-        <w:t>Pida el pre-cierre con la clave del supervisor.</w:t>
+        <w:t>Haga un retiro con su motivo y la autorización del supervisor.</w:t>
+      </w:r>
+    </w:p>
+    <w:p>
+      <w:pPr>
+        <w:pStyle w:val="ListNumber"/>
+      </w:pPr>
+      <w:r>
+        <w:t>Intente retirar más efectivo del que hay en la gaveta.</w:t>
       </w:r>
     </w:p>
     <w:p>
@@ -4764,7 +4788,7 @@
         <w:rPr>
           <w:color w:val="555555"/>
         </w:rPr>
-        <w:t>Imprime lo esperado por forma de pago. El cajero por sí solo no lo puede sacar.</w:t>
+        <w:t>El primero imprime su comprobante con las firmas. El segundo se rechaza diciendo cuánto hay.</w:t>
       </w:r>
     </w:p>
     <w:p>
@@ -4781,7 +4805,7 @@
           <w:color w:val="555555"/>
           <w:sz w:val="19"/>
         </w:rPr>
-        <w:t>Caja: Auditoria</w:t>
+        <w:t>Caja: MovimientosCaja · AutorizacionesOtorgadas · BandejaSalida · Auditoria</w:t>
       </w:r>
     </w:p>
     <w:p>
@@ -4798,7 +4822,7 @@
         <w:pStyle w:val="Heading3"/>
       </w:pPr>
       <w:r>
-        <w:t>O4 · Cerrar el lote de tarjetas</w:t>
+        <w:t>O2 · Relevo de cajero</w:t>
       </w:r>
     </w:p>
     <w:p>
@@ -4806,7 +4830,7 @@
         <w:pStyle w:val="ListNumber"/>
       </w:pPr>
       <w:r>
-        <w:t>Presione «Cerrar lote».</w:t>
+        <w:t>Con una venta a medias, haga un relevo: entra otro cajero con autorización.</w:t>
       </w:r>
     </w:p>
     <w:p>
@@ -4821,7 +4845,7 @@
         <w:rPr>
           <w:color w:val="555555"/>
         </w:rPr>
-        <w:t>Compara lo aprobado en la caja contra lo que reporta el terminal y lo muestra. Si el terminal no detalla su lote, lo dice y muestra lo de la caja para comparar contra el comprobante impreso.</w:t>
+        <w:t>El turno no se cierra, cambia de operador, y el cajero que entra ve la venta en curso y las facturas en espera tal como estaban.</w:t>
       </w:r>
     </w:p>
     <w:p>
@@ -4838,7 +4862,7 @@
           <w:color w:val="555555"/>
           <w:sz w:val="19"/>
         </w:rPr>
-        <w:t>Caja: LotesTarjetas · LotesTarjetasAprobaciones · OperacionesTerminal (lee) · Auditoria</w:t>
+        <w:t>Caja: Turnos · MovimientosCaja · Auditoria</w:t>
       </w:r>
     </w:p>
     <w:p>
@@ -4855,7 +4879,7 @@
         <w:pStyle w:val="Heading3"/>
       </w:pPr>
       <w:r>
-        <w:t>O5 · Lo que impide cerrar el turno</w:t>
+        <w:t>O3 · Pre-cierre</w:t>
       </w:r>
     </w:p>
     <w:p>
@@ -4863,7 +4887,7 @@
         <w:pStyle w:val="ListNumber"/>
       </w:pPr>
       <w:r>
-        <w:t>Deje una factura en espera y una venta a medias con artículos, e intente cerrar el turno.</w:t>
+        <w:t>Pida el pre-cierre con la clave del supervisor.</w:t>
       </w:r>
     </w:p>
     <w:p>
@@ -4878,7 +4902,7 @@
         <w:rPr>
           <w:color w:val="555555"/>
         </w:rPr>
-        <w:t>No cierra y lista exactamente qué falta: cuáles facturas en espera (por su referencia) y cuáles transacciones en curso.</w:t>
+        <w:t>Imprime lo esperado por forma de pago. El cajero por sí solo no lo puede sacar.</w:t>
       </w:r>
     </w:p>
     <w:p>
@@ -4895,7 +4919,7 @@
           <w:color w:val="555555"/>
           <w:sz w:val="19"/>
         </w:rPr>
-        <w:t>Caja: VentasGuardadas · VentasEnProceso · DocumentosElectronicos (lee)</w:t>
+        <w:t>Caja: Auditoria</w:t>
       </w:r>
     </w:p>
     <w:p>
@@ -4912,7 +4936,7 @@
         <w:pStyle w:val="Heading3"/>
       </w:pPr>
       <w:r>
-        <w:t>O6 · Cerrar el turno</w:t>
+        <w:t>O4 · Cerrar el lote de tarjetas</w:t>
       </w:r>
     </w:p>
     <w:p>
@@ -4920,7 +4944,7 @@
         <w:pStyle w:val="ListNumber"/>
       </w:pPr>
       <w:r>
-        <w:t>Limpie lo que faltaba y cierre el turno con la autorización del supervisor.</w:t>
+        <w:t>Presione «Cerrar lote».</w:t>
       </w:r>
     </w:p>
     <w:p>
@@ -4935,7 +4959,7 @@
         <w:rPr>
           <w:color w:val="555555"/>
         </w:rPr>
-        <w:t>El turno cierra, la caja imprime el cuadre con lo esperado por forma de pago y NO le pide a la cajera declarar nada. El mensaje le dice que entregue el efectivo y el comprobante del lote al supervisor.</w:t>
+        <w:t>Compara lo aprobado en la caja contra lo que reporta el terminal y lo muestra. Si el terminal no detalla su lote, lo dice y muestra lo de la caja para comparar contra el comprobante impreso.</w:t>
       </w:r>
     </w:p>
     <w:p>
@@ -4952,7 +4976,7 @@
           <w:color w:val="555555"/>
           <w:sz w:val="19"/>
         </w:rPr>
-        <w:t>Caja: CierresTurno · CierresTurnoFormasPago · Turnos · BandejaSalida · Central: CierresTurno · CierresFormaPago · CierresTurnoMovimientos · CierresTurnoLote · CierresTurnoLoteAprobaciones</w:t>
+        <w:t>Caja: LotesTarjetas · LotesTarjetasAprobaciones · OperacionesTerminal (lee) · Auditoria</w:t>
       </w:r>
     </w:p>
     <w:p>
@@ -4965,20 +4989,11 @@
       </w:r>
     </w:p>
     <w:p>
-      <w:r>
-        <w:rPr>
-          <w:i/>
-          <w:color w:val="2E7D32"/>
-        </w:rPr>
-        <w:t>Aquí la cajera cuenta su dinero a ciegas, lo mete en su sobre con el comprobante del lote y el cuadre impreso, y se lo entrega al supervisor. Ella no ve los montos esperados: esa es la idea.</w:t>
-      </w:r>
-    </w:p>
-    <w:p>
       <w:pPr>
         <w:pStyle w:val="Heading3"/>
       </w:pPr>
       <w:r>
-        <w:t>O7 · Turno de un día anterior</w:t>
+        <w:t>O5 · Lo que impide cerrar el turno</w:t>
       </w:r>
     </w:p>
     <w:p>
@@ -4986,7 +5001,7 @@
         <w:pStyle w:val="ListNumber"/>
       </w:pPr>
       <w:r>
-        <w:t>Deje un turno abierto de un día para otro (o cambie la fecha del equipo) e intente vender.</w:t>
+        <w:t>Deje una factura en espera y una venta a medias con artículos, e intente cerrar el turno.</w:t>
       </w:r>
     </w:p>
     <w:p>
@@ -5001,7 +5016,7 @@
         <w:rPr>
           <w:color w:val="555555"/>
         </w:rPr>
-        <w:t>No deja vender ni cobrar. Avisa que hay que limpiar las facturas en espera y cerrar el turno, y no hay autorización que lo salte.</w:t>
+        <w:t>No cierra y lista exactamente qué falta: cuáles facturas en espera (por su referencia) y cuáles transacciones en curso.</w:t>
       </w:r>
     </w:p>
     <w:p>
@@ -5018,7 +5033,7 @@
           <w:color w:val="555555"/>
           <w:sz w:val="19"/>
         </w:rPr>
-        <w:t>Caja: Turnos · Parametros (lee)</w:t>
+        <w:t>Caja: VentasGuardadas · VentasEnProceso · DocumentosElectronicos (lee)</w:t>
       </w:r>
     </w:p>
     <w:p>
@@ -5031,24 +5046,11 @@
       </w:r>
     </w:p>
     <w:p>
-      <w:r>
-        <w:br w:type="page"/>
-      </w:r>
-    </w:p>
-    <w:p>
-      <w:pPr>
-        <w:pStyle w:val="Heading1"/>
-      </w:pPr>
-      <w:r>
-        <w:t>Bloque P — El supervisor cuadra</w:t>
-      </w:r>
-    </w:p>
-    <w:p>
       <w:pPr>
         <w:pStyle w:val="Heading3"/>
       </w:pPr>
       <w:r>
-        <w:t>P1 · Entrar al módulo de cuadre</w:t>
+        <w:t>O6 · Cerrar el turno</w:t>
       </w:r>
     </w:p>
     <w:p>
@@ -5056,15 +5058,7 @@
         <w:pStyle w:val="ListNumber"/>
       </w:pPr>
       <w:r>
-        <w:t>En una computadora de la tienda, abra /cuadre y entre con el usuario y la clave de CAJA del supervisor.</w:t>
-      </w:r>
-    </w:p>
-    <w:p>
-      <w:pPr>
-        <w:pStyle w:val="ListNumber"/>
-      </w:pPr>
-      <w:r>
-        <w:t>Pruebe también con el usuario del cajero, que no tiene el permiso.</w:t>
+        <w:t>Limpie lo que faltaba y cierre el turno con la autorización del supervisor.</w:t>
       </w:r>
     </w:p>
     <w:p>
@@ -5079,7 +5073,7 @@
         <w:rPr>
           <w:color w:val="555555"/>
         </w:rPr>
-        <w:t>El supervisor entra y ve solo su sucursal. El cajero recibe que su usuario no tiene acceso al módulo.</w:t>
+        <w:t>El turno cierra, la caja imprime el cuadre con lo esperado por forma de pago y NO le pide a la cajera declarar nada. El mensaje le dice que entregue el efectivo y el comprobante del lote al supervisor.</w:t>
       </w:r>
     </w:p>
     <w:p>
@@ -5096,7 +5090,7 @@
           <w:color w:val="555555"/>
           <w:sz w:val="19"/>
         </w:rPr>
-        <w:t>Central: UsuariosCaja · RolesCajaPermisos (lee) · Auditoria</w:t>
+        <w:t>Caja: CierresTurno · CierresTurnoFormasPago · Turnos · BandejaSalida · Central: CierresTurno · CierresFormaPago · CierresTurnoMovimientos · CierresTurnoLote · CierresTurnoLoteAprobaciones</w:t>
       </w:r>
     </w:p>
     <w:p>
@@ -5109,11 +5103,20 @@
       </w:r>
     </w:p>
     <w:p>
+      <w:r>
+        <w:rPr>
+          <w:i/>
+          <w:color w:val="2E7D32"/>
+        </w:rPr>
+        <w:t>Aquí la cajera cuenta su dinero a ciegas, lo mete en su sobre con el comprobante del lote y el cuadre impreso, y se lo entrega al supervisor. Ella no ve los montos esperados: esa es la idea.</w:t>
+      </w:r>
+    </w:p>
+    <w:p>
       <w:pPr>
         <w:pStyle w:val="Heading3"/>
       </w:pPr>
       <w:r>
-        <w:t>P2 · Cuadrar el turno</w:t>
+        <w:t>O7 · Turno de un día anterior</w:t>
       </w:r>
     </w:p>
     <w:p>
@@ -5121,23 +5124,7 @@
         <w:pStyle w:val="ListNumber"/>
       </w:pPr>
       <w:r>
-        <w:t>En «Por cuadrar» abra el cierre del bloque O.</w:t>
-      </w:r>
-    </w:p>
-    <w:p>
-      <w:pPr>
-        <w:pStyle w:val="ListNumber"/>
-      </w:pPr>
-      <w:r>
-        <w:t>Cuente el efectivo y digite las cantidades por denominación; escriba el total de las demás formas de pago.</w:t>
-      </w:r>
-    </w:p>
-    <w:p>
-      <w:pPr>
-        <w:pStyle w:val="ListNumber"/>
-      </w:pPr>
-      <w:r>
-        <w:t>Antes de guardar, ponga a propósito un efectivo declarado distinto del conteo.</w:t>
+        <w:t>Deje un turno abierto de un día para otro (o cambie la fecha del equipo) e intente vender.</w:t>
       </w:r>
     </w:p>
     <w:p>
@@ -5152,7 +5139,7 @@
         <w:rPr>
           <w:color w:val="555555"/>
         </w:rPr>
-        <w:t>No deja guardar mientras el efectivo declarado no cuadre con el conteo. Al corregirlo, guarda y el cierre sale de pendientes con su diferencia y el nombre de quien cuadró.</w:t>
+        <w:t>No deja vender ni cobrar. Avisa que hay que limpiar las facturas en espera y cerrar el turno, y no hay autorización que lo salte.</w:t>
       </w:r>
     </w:p>
     <w:p>
@@ -5169,7 +5156,7 @@
           <w:color w:val="555555"/>
           <w:sz w:val="19"/>
         </w:rPr>
-        <w:t>Central: CierresTurno · CierresFormaPago · CierresTurnoDenominaciones · Auditoria</w:t>
+        <w:t>Caja: Turnos · Parametros (lee)</w:t>
       </w:r>
     </w:p>
     <w:p>
@@ -5182,11 +5169,24 @@
       </w:r>
     </w:p>
     <w:p>
+      <w:r>
+        <w:br w:type="page"/>
+      </w:r>
+    </w:p>
+    <w:p>
+      <w:pPr>
+        <w:pStyle w:val="Heading1"/>
+      </w:pPr>
+      <w:r>
+        <w:t>Bloque P — El supervisor cuadra</w:t>
+      </w:r>
+    </w:p>
+    <w:p>
       <w:pPr>
         <w:pStyle w:val="Heading3"/>
       </w:pPr>
       <w:r>
-        <w:t>P3 · La diferencia es de la cajera</w:t>
+        <w:t>P1 · Entrar al módulo de cuadre</w:t>
       </w:r>
     </w:p>
     <w:p>
@@ -5194,7 +5194,15 @@
         <w:pStyle w:val="ListNumber"/>
       </w:pPr>
       <w:r>
-        <w:t>Vaya a la pestaña «Diferencias por cajera».</w:t>
+        <w:t>En una computadora de la tienda, abra /cuadre y entre con el usuario y la clave de CAJA del supervisor.</w:t>
+      </w:r>
+    </w:p>
+    <w:p>
+      <w:pPr>
+        <w:pStyle w:val="ListNumber"/>
+      </w:pPr>
+      <w:r>
+        <w:t>Pruebe también con el usuario del cajero, que no tiene el permiso.</w:t>
       </w:r>
     </w:p>
     <w:p>
@@ -5209,7 +5217,7 @@
         <w:rPr>
           <w:color w:val="555555"/>
         </w:rPr>
-        <w:t>El faltante o el sobrante aparece a nombre de la cajera del turno, no del supervisor que lo declaró.</w:t>
+        <w:t>El supervisor entra y ve solo su sucursal. El cajero recibe que su usuario no tiene acceso al módulo.</w:t>
       </w:r>
     </w:p>
     <w:p>
@@ -5226,7 +5234,7 @@
           <w:color w:val="555555"/>
           <w:sz w:val="19"/>
         </w:rPr>
-        <w:t>Central: CierresTurno (lee)</w:t>
+        <w:t>Central: UsuariosCaja · RolesCajaPermisos (lee) · Auditoria</w:t>
       </w:r>
     </w:p>
     <w:p>
@@ -5243,7 +5251,7 @@
         <w:pStyle w:val="Heading3"/>
       </w:pPr>
       <w:r>
-        <w:t>P4 · Corregir un cuadre</w:t>
+        <w:t>P2 · Cuadrar el turno</w:t>
       </w:r>
     </w:p>
     <w:p>
@@ -5251,7 +5259,23 @@
         <w:pStyle w:val="ListNumber"/>
       </w:pPr>
       <w:r>
-        <w:t>En la pestaña «Cierres», corrija el cuadre de ese turno con un motivo.</w:t>
+        <w:t>En «Por cuadrar» abra el cierre del bloque O.</w:t>
+      </w:r>
+    </w:p>
+    <w:p>
+      <w:pPr>
+        <w:pStyle w:val="ListNumber"/>
+      </w:pPr>
+      <w:r>
+        <w:t>Cuente el efectivo y digite las cantidades por denominación; escriba el total de las demás formas de pago.</w:t>
+      </w:r>
+    </w:p>
+    <w:p>
+      <w:pPr>
+        <w:pStyle w:val="ListNumber"/>
+      </w:pPr>
+      <w:r>
+        <w:t>Antes de guardar, ponga a propósito un efectivo declarado distinto del conteo.</w:t>
       </w:r>
     </w:p>
     <w:p>
@@ -5266,7 +5290,7 @@
         <w:rPr>
           <w:color w:val="555555"/>
         </w:rPr>
-        <w:t>Pide el motivo, no borra lo anterior y el cierre queda marcado como corregido, con quién lo hizo. Solo puede hacerlo un rol con el permiso de corregir.</w:t>
+        <w:t>No deja guardar mientras el efectivo declarado no cuadre con el conteo. Al corregirlo, guarda y el cierre sale de pendientes con su diferencia y el nombre de quien cuadró.</w:t>
       </w:r>
     </w:p>
     <w:p>
@@ -5283,7 +5307,7 @@
           <w:color w:val="555555"/>
           <w:sz w:val="19"/>
         </w:rPr>
-        <w:t>Central: AjustesCierreTurno · CierresFormaPago · CierresTurno · Auditoria</w:t>
+        <w:t>Central: CierresTurno · CierresFormaPago · CierresTurnoDenominaciones · Auditoria</w:t>
       </w:r>
     </w:p>
     <w:p>
@@ -5300,7 +5324,7 @@
         <w:pStyle w:val="Heading3"/>
       </w:pPr>
       <w:r>
-        <w:t>P5 · Resumen del día y retiros</w:t>
+        <w:t>P3 · La diferencia es de la cajera</w:t>
       </w:r>
     </w:p>
     <w:p>
@@ -5308,7 +5332,7 @@
         <w:pStyle w:val="ListNumber"/>
       </w:pPr>
       <w:r>
-        <w:t>Revise las pestañas «Resumen del día» y «Retiros y relevos».</w:t>
+        <w:t>Vaya a la pestaña «Diferencias por cajera».</w:t>
       </w:r>
     </w:p>
     <w:p>
@@ -5323,7 +5347,7 @@
         <w:rPr>
           <w:color w:val="555555"/>
         </w:rPr>
-        <w:t>El resumen suma el día por forma de pago y avisa cuántas cajas faltan por cuadrar. En retiros aparece el del O1, con su motivo y quién lo autorizó.</w:t>
+        <w:t>El faltante o el sobrante aparece a nombre de la cajera del turno, no del supervisor que lo declaró.</w:t>
       </w:r>
     </w:p>
     <w:p>
@@ -5340,7 +5364,7 @@
           <w:color w:val="555555"/>
           <w:sz w:val="19"/>
         </w:rPr>
-        <w:t>Central: CierresTurno · CierresFormaPago · CierresTurnoMovimientos (lee)</w:t>
+        <w:t>Central: CierresTurno (lee)</w:t>
       </w:r>
     </w:p>
     <w:p>
@@ -5357,7 +5381,178 @@
         <w:pStyle w:val="Heading3"/>
       </w:pPr>
       <w:r>
-        <w:t>P6 · Reimprimir el cuadre y ver las tarjetas</w:t>
+        <w:t>P4 · Corregir un cuadre</w:t>
+      </w:r>
+    </w:p>
+    <w:p>
+      <w:pPr>
+        <w:pStyle w:val="ListNumber"/>
+      </w:pPr>
+      <w:r>
+        <w:t>En la pestaña «Cierres», corrija el cuadre de ese turno con un motivo.</w:t>
+      </w:r>
+    </w:p>
+    <w:p>
+      <w:r>
+        <w:rPr>
+          <w:b/>
+          <w:color w:val="1B4D3E"/>
+        </w:rPr>
+        <w:t xml:space="preserve">Debe pasar: </w:t>
+      </w:r>
+      <w:r>
+        <w:rPr>
+          <w:color w:val="555555"/>
+        </w:rPr>
+        <w:t>Pide el motivo, no borra lo anterior y el cierre queda marcado como corregido, con quién lo hizo. Solo puede hacerlo un rol con el permiso de corregir.</w:t>
+      </w:r>
+    </w:p>
+    <w:p>
+      <w:r>
+        <w:rPr>
+          <w:b/>
+          <w:color w:val="2E7D32"/>
+          <w:sz w:val="19"/>
+        </w:rPr>
+        <w:t xml:space="preserve">Tablas: </w:t>
+      </w:r>
+      <w:r>
+        <w:rPr>
+          <w:color w:val="555555"/>
+          <w:sz w:val="19"/>
+        </w:rPr>
+        <w:t>Central: AjustesCierreTurno · CierresFormaPago · CierresTurno · Auditoria</w:t>
+      </w:r>
+    </w:p>
+    <w:p>
+      <w:r>
+        <w:rPr>
+          <w:color w:val="555555"/>
+          <w:sz w:val="19"/>
+        </w:rPr>
+        <w:t>☐ Pasó          ☐ Falló          Observación: ______________________________________________</w:t>
+      </w:r>
+    </w:p>
+    <w:p>
+      <w:pPr>
+        <w:pStyle w:val="Heading3"/>
+      </w:pPr>
+      <w:r>
+        <w:t>P5 · Resumen del día y retiros</w:t>
+      </w:r>
+    </w:p>
+    <w:p>
+      <w:pPr>
+        <w:pStyle w:val="ListNumber"/>
+      </w:pPr>
+      <w:r>
+        <w:t>Revise las pestañas «Resumen del día» y «Retiros y relevos».</w:t>
+      </w:r>
+    </w:p>
+    <w:p>
+      <w:r>
+        <w:rPr>
+          <w:b/>
+          <w:color w:val="1B4D3E"/>
+        </w:rPr>
+        <w:t xml:space="preserve">Debe pasar: </w:t>
+      </w:r>
+      <w:r>
+        <w:rPr>
+          <w:color w:val="555555"/>
+        </w:rPr>
+        <w:t>El resumen suma el día por forma de pago y avisa cuántas cajas faltan por cuadrar. En retiros aparece el del O1, con su motivo y quién lo autorizó.</w:t>
+      </w:r>
+    </w:p>
+    <w:p>
+      <w:r>
+        <w:rPr>
+          <w:b/>
+          <w:color w:val="2E7D32"/>
+          <w:sz w:val="19"/>
+        </w:rPr>
+        <w:t xml:space="preserve">Tablas: </w:t>
+      </w:r>
+      <w:r>
+        <w:rPr>
+          <w:color w:val="555555"/>
+          <w:sz w:val="19"/>
+        </w:rPr>
+        <w:t>Central: CierresTurno · CierresFormaPago · CierresTurnoMovimientos (lee)</w:t>
+      </w:r>
+    </w:p>
+    <w:p>
+      <w:r>
+        <w:rPr>
+          <w:color w:val="555555"/>
+          <w:sz w:val="19"/>
+        </w:rPr>
+        <w:t>☐ Pasó          ☐ Falló          Observación: ______________________________________________</w:t>
+      </w:r>
+    </w:p>
+    <w:p>
+      <w:pPr>
+        <w:pStyle w:val="Heading3"/>
+      </w:pPr>
+      <w:r>
+        <w:t>P6 · Tiempos de caja parada</w:t>
+      </w:r>
+    </w:p>
+    <w:p>
+      <w:pPr>
+        <w:pStyle w:val="ListNumber"/>
+      </w:pPr>
+      <w:r>
+        <w:t>Vaya a la pestaña «Caja parada» con las fechas del recorrido.</w:t>
+      </w:r>
+    </w:p>
+    <w:p>
+      <w:r>
+        <w:rPr>
+          <w:b/>
+          <w:color w:val="1B4D3E"/>
+        </w:rPr>
+        <w:t xml:space="preserve">Debe pasar: </w:t>
+      </w:r>
+      <w:r>
+        <w:rPr>
+          <w:color w:val="555555"/>
+        </w:rPr>
+        <w:t>Aparecen las paradas del H5 y del H6: el total del período, el mismo tiempo visto por caja, por cajera y por motivo, y el detalle de cada una. El almuerzo cuenta como tiempo previsto y el resto como imprevisto; la que cerró el turno sale marcada.</w:t>
+      </w:r>
+    </w:p>
+    <w:p>
+      <w:r>
+        <w:rPr>
+          <w:b/>
+          <w:color w:val="2E7D32"/>
+          <w:sz w:val="19"/>
+        </w:rPr>
+        <w:t xml:space="preserve">Tablas: </w:t>
+      </w:r>
+      <w:r>
+        <w:rPr>
+          <w:color w:val="555555"/>
+          <w:sz w:val="19"/>
+        </w:rPr>
+        <w:t>Central: SuspensionesCaja (lee)</w:t>
+      </w:r>
+    </w:p>
+    <w:p>
+      <w:r>
+        <w:rPr>
+          <w:color w:val="555555"/>
+          <w:sz w:val="19"/>
+        </w:rPr>
+        <w:t>☐ Pasó          ☐ Falló          Observación: ______________________________________________</w:t>
+      </w:r>
+    </w:p>
+    <w:p>
+      <w:pPr>
+        <w:pStyle w:val="Heading3"/>
+      </w:pPr>
+      <w:r>
+        <w:t>P7 · Reimprimir el cuadre y ver las tarjetas</w:t>
       </w:r>
     </w:p>
     <w:p>

</xml_diff>

<commit_message>
fix(central): «Buscar por» en Precios arranca en Código, como en Artículos
Las dos pantallas buscan lo mismo y arrancaban distinto: a un precio se llega por
el artículo exacto, no tanteando su descripción.

Co-Authored-By: Claude Opus 5 (1M context) <noreply@anthropic.com>
</commit_message>
<xml_diff>
--- a/scripts/manual/Guia de pruebas CG-POS.docx
+++ b/scripts/manual/Guia de pruebas CG-POS.docx
@@ -3079,8 +3079,16 @@
         <w:rPr>
           <w:color w:val="555555"/>
           <w:sz w:val="19"/>
-        </w:rPr>
-        <w:t>☐ Pasó          ☐ Falló          Observación: ______________________________________________</w:t>
+          <w:highlight w:val="yellow"/>
+        </w:rPr>
+        <w:t>☐</w:t>
+      </w:r>
+      <w:r>
+        <w:rPr>
+          <w:color w:val="555555"/>
+          <w:sz w:val="19"/>
+        </w:rPr>
+        <w:t xml:space="preserve"> Pasó          ☐ Falló          Observación: ______________________________________________</w:t>
       </w:r>
     </w:p>
     <w:p>
@@ -3165,8 +3173,16 @@
         <w:rPr>
           <w:color w:val="555555"/>
           <w:sz w:val="19"/>
-        </w:rPr>
-        <w:t>☐ Pasó          ☐ Falló          Observación: ______________________________________________</w:t>
+          <w:highlight w:val="yellow"/>
+        </w:rPr>
+        <w:t>☐</w:t>
+      </w:r>
+      <w:r>
+        <w:rPr>
+          <w:color w:val="555555"/>
+          <w:sz w:val="19"/>
+        </w:rPr>
+        <w:t xml:space="preserve"> Pasó          ☐ Falló          Observación: ______________________________________________</w:t>
       </w:r>
     </w:p>
     <w:p>

</xml_diff>

<commit_message>
feat(caja): volver a escanear el mismo artículo suma a su línea
El precio por mayor mira la cantidad de la línea, así que un cliente que se
llevaba doce unidades pasadas de una en una nunca llegaba al mínimo: quedaban
doce líneas de uno, cada una a precio de detalle.

Ahora la pasada se suma a la línea que ya está y el precio se recalcula con el
total, que es lo que de verdad se lleva. De paso la factura queda corta.

Se quedan en su propia línea las cosas que se venden de una en una o que llevan
algo propio que juntarlas destruiría: lo serializado, lo pesado, y lo que ya
tenga un descuento o un precio puesto a mano.

Co-Authored-By: Claude Opus 5 (1M context) <noreply@anthropic.com>
</commit_message>
<xml_diff>
--- a/scripts/manual/Guia de pruebas CG-POS.docx
+++ b/scripts/manual/Guia de pruebas CG-POS.docx
@@ -3275,8 +3275,16 @@
         <w:rPr>
           <w:color w:val="555555"/>
           <w:sz w:val="19"/>
-        </w:rPr>
-        <w:t>☐ Pasó          ☐ Falló          Observación: ______________________________________________</w:t>
+          <w:highlight w:val="yellow"/>
+        </w:rPr>
+        <w:t>☐</w:t>
+      </w:r>
+      <w:r>
+        <w:rPr>
+          <w:color w:val="555555"/>
+          <w:sz w:val="19"/>
+        </w:rPr>
+        <w:t xml:space="preserve"> Pasó          ☐ Falló          Observación: ______________________________________________</w:t>
       </w:r>
     </w:p>
     <w:p>

</xml_diff>

<commit_message>
fix(caja): el aviso del descuento se ve sin desplazar el cuadro
Salía al final, debajo del teclado: había que bajar con la rueda para enterarse
de por qué no se aplicó, y en una caja táctil eso no lo hace nadie. Va arriba del
todo, y el cuadro ya no se desplaza: si la pantalla es baja, lo que cede son las
teclas, como en los demás cuadros con teclado.

Co-Authored-By: Claude Opus 5 (1M context) <noreply@anthropic.com>
</commit_message>
<xml_diff>
--- a/scripts/manual/Guia de pruebas CG-POS.docx
+++ b/scripts/manual/Guia de pruebas CG-POS.docx
@@ -2691,8 +2691,16 @@
         <w:rPr>
           <w:color w:val="555555"/>
           <w:sz w:val="19"/>
-        </w:rPr>
-        <w:t>☐ Pasó          ☐ Falló          Observación: ______________________________________________</w:t>
+          <w:highlight w:val="yellow"/>
+        </w:rPr>
+        <w:t>☐</w:t>
+      </w:r>
+      <w:r>
+        <w:rPr>
+          <w:color w:val="555555"/>
+          <w:sz w:val="19"/>
+        </w:rPr>
+        <w:t xml:space="preserve"> Pasó          ☐ Falló          Observación: ______________________________________________</w:t>
       </w:r>
     </w:p>
     <w:p>
@@ -2748,8 +2756,16 @@
         <w:rPr>
           <w:color w:val="555555"/>
           <w:sz w:val="19"/>
-        </w:rPr>
-        <w:t>☐ Pasó          ☐ Falló          Observación: ______________________________________________</w:t>
+          <w:highlight w:val="yellow"/>
+        </w:rPr>
+        <w:t>☐</w:t>
+      </w:r>
+      <w:r>
+        <w:rPr>
+          <w:color w:val="555555"/>
+          <w:sz w:val="19"/>
+        </w:rPr>
+        <w:t xml:space="preserve"> Pasó          ☐ Falló          Observación: ______________________________________________</w:t>
       </w:r>
     </w:p>
     <w:p>

</xml_diff>

<commit_message>
feat(central): elegir el cliente de una cotización de una lista, no solo por documento
Solo se podía traer del maestro escribiendo la cédula o el RNC exactos, y casi
nadie se los sabe de memoria; el nombre sí. La lupa del campo del nombre abre el
maestro de clientes —se busca por nombre o por documento y se elige la fila—,
igual que ya se hacía con los artículos, y llena nombre, documento, teléfono y
correo.

Co-Authored-By: Claude Opus 5 (1M context) <noreply@anthropic.com>
</commit_message>
<xml_diff>
--- a/scripts/manual/Guia de pruebas CG-POS.docx
+++ b/scripts/manual/Guia de pruebas CG-POS.docx
@@ -2836,8 +2836,16 @@
         <w:rPr>
           <w:color w:val="555555"/>
           <w:sz w:val="19"/>
-        </w:rPr>
-        <w:t>☐ Pasó          ☐ Falló          Observación: ______________________________________________</w:t>
+          <w:highlight w:val="yellow"/>
+        </w:rPr>
+        <w:t>☐</w:t>
+      </w:r>
+      <w:r>
+        <w:rPr>
+          <w:color w:val="555555"/>
+          <w:sz w:val="19"/>
+        </w:rPr>
+        <w:t xml:space="preserve"> Pasó          ☐ Falló          Observación: ______________________________________________</w:t>
       </w:r>
     </w:p>
     <w:p>
@@ -2893,8 +2901,16 @@
         <w:rPr>
           <w:color w:val="555555"/>
           <w:sz w:val="19"/>
-        </w:rPr>
-        <w:t>☐ Pasó          ☐ Falló          Observación: ______________________________________________</w:t>
+          <w:highlight w:val="yellow"/>
+        </w:rPr>
+        <w:t>☐</w:t>
+      </w:r>
+      <w:r>
+        <w:rPr>
+          <w:color w:val="555555"/>
+          <w:sz w:val="19"/>
+        </w:rPr>
+        <w:t xml:space="preserve"> Pasó          ☐ Falló          Observación: ______________________________________________</w:t>
       </w:r>
     </w:p>
     <w:p>
@@ -2950,8 +2966,16 @@
         <w:rPr>
           <w:color w:val="555555"/>
           <w:sz w:val="19"/>
-        </w:rPr>
-        <w:t>☐ Pasó          ☐ Falló          Observación: ______________________________________________</w:t>
+          <w:highlight w:val="yellow"/>
+        </w:rPr>
+        <w:t>☐</w:t>
+      </w:r>
+      <w:r>
+        <w:rPr>
+          <w:color w:val="555555"/>
+          <w:sz w:val="19"/>
+        </w:rPr>
+        <w:t xml:space="preserve"> Pasó          ☐ Falló          Observación: ______________________________________________</w:t>
       </w:r>
     </w:p>
     <w:p>
@@ -3037,8 +3061,16 @@
         <w:rPr>
           <w:color w:val="555555"/>
           <w:sz w:val="19"/>
-        </w:rPr>
-        <w:t>☐ Pasó          ☐ Falló          Observación: ______________________________________________</w:t>
+          <w:highlight w:val="yellow"/>
+        </w:rPr>
+        <w:t>☐</w:t>
+      </w:r>
+      <w:r>
+        <w:rPr>
+          <w:color w:val="555555"/>
+          <w:sz w:val="19"/>
+        </w:rPr>
+        <w:t xml:space="preserve"> Pasó          ☐ Falló          Observación: ______________________________________________</w:t>
       </w:r>
     </w:p>
     <w:p>

</xml_diff>

<commit_message>
refactor(caja): se elimina el maestro de tipos de tarjeta; la marca la informa el terminal
Después de separar las formas de pago por terminal, el catálogo Visa/
Mastercard/Amex se quedó sin nadie que lo usara: con CardNet y Azul la marca
viene en la respuesta del equipo, y «Tarjeta» solo registra el número de
aprobación. Que el cajero la eligiera a mano no aportaba nada y podía
contradecir al terminal.

Lo que sí se conserva es la marca en el pago: va al ticket y sirve para
cuadrar contra el lote de cada banco. Cambia de nombre a MarcaTarjeta, que es
lo que de verdad es, y la llena el terminal.

Se agrega «Amex» a la carga inicial, que como «Tarjeta» se cobra en un equipo
aparte y pide su número de aprobación.

Co-Authored-By: Claude Opus 5 (1M context) <noreply@anthropic.com>
</commit_message>
<xml_diff>
--- a/scripts/manual/Guia de pruebas CG-POS.docx
+++ b/scripts/manual/Guia de pruebas CG-POS.docx
@@ -565,7 +565,7 @@
         <w:pStyle w:val="ListNumber"/>
       </w:pPr>
       <w:r>
-        <w:t>En Maestros → Catálogos revise (o cree) al menos: la moneda local, un impuesto del 18 %, una unidad de medida «Unidad», un departamento, las formas de pago, un banco, un tipo de tarjeta, los motivos de descuento y de devolución, y las denominaciones de billetes y monedas.</w:t>
+        <w:t>En Maestros → Catálogos revise (o cree) al menos: la moneda local, un impuesto del 18 %, una unidad de medida «Unidad», un departamento, las formas de pago, un banco, los motivos de descuento y de devolución, y las denominaciones de billetes y monedas.</w:t>
       </w:r>
     </w:p>
     <w:p>
@@ -573,7 +573,22 @@
         <w:pStyle w:val="ListNumber"/>
       </w:pPr>
       <w:r>
-        <w:t>En Formas de pago mire la columna «Terminal». Vienen tres de tarjeta: «Tarjeta» sin terminal, que se cobra en un equipo aparte y solo registra el número de aprobación; «CardNet» y «Azul», que cobran en el panel de firma de su equipo. Deje la de su procesador y desactive la del otro si no la va a usar.</w:t>
+        <w:t>En Formas de pago mire la columna «Terminal». Vienen cuatro de tarjeta: «Tarjeta» y «Amex», sin terminal, que se cobran en un equipo aparte y solo registran el número de aprobación; «CardNet» y «Azul», que cobran en el panel de firma de su equipo. Deje la de su procesador y desactive la del otro si no la va a usar.</w:t>
+      </w:r>
+    </w:p>
+    <w:p>
+      <w:r>
+        <w:rPr>
+          <w:b/>
+          <w:color w:val="1B4D3E"/>
+        </w:rPr>
+        <w:t xml:space="preserve">Debe pasar: </w:t>
+      </w:r>
+      <w:r>
+        <w:rPr>
+          <w:color w:val="555555"/>
+        </w:rPr>
+        <w:t>La marca de la tarjeta (Visa, Mastercard…) no se configura en ninguna parte: la informa el terminal al aprobar, y sale en el ticket y en el cuadre. Cobrando por «Tarjeta» o «Amex» no hay marca, porque nadie leyó la tarjeta.</w:t>
       </w:r>
     </w:p>
     <w:p>
@@ -605,7 +620,7 @@
           <w:color w:val="555555"/>
           <w:sz w:val="19"/>
         </w:rPr>
-        <w:t>Central: Monedas · Impuestos · UnidadesMedida · Departamentos · Categorias · Marcas · FormasPago · Bancos · TiposTarjeta · Denominaciones · MotivosDescuento · MotivosDevolucion</w:t>
+        <w:t>Central: Monedas · Impuestos · UnidadesMedida · Departamentos · Categorias · Marcas · FormasPago · Bancos · Denominaciones · MotivosDescuento · MotivosDevolucion</w:t>
       </w:r>
     </w:p>
     <w:p>

</xml_diff>